<commit_message>
Publish DSP501 docs slides and flow notebook
</commit_message>
<xml_diff>
--- a/docs/project_deliverables/final_report_dsp501.docx
+++ b/docs/project_deliverables/final_report_dsp501.docx
@@ -669,6 +669,23 @@
           <w:sz w:val="22"/>
           <w:szCs w:val="22"/>
         </w:rPr>
+        <w:t xml:space="preserve">4.3. CNN baseline và ablation — 7</w:t>
+      </w:r>
+    </w:p>
+    <w:p>
+      <w:pPr>
+        <w:spacing w:after="140" w:line="276"/>
+      </w:pPr>
+      <w:r>
+        <w:rPr>
+          <w:rFonts w:ascii="Aptos" w:cs="Aptos" w:eastAsia="Aptos" w:hAnsi="Aptos"/>
+          <w:b w:val="false"/>
+          <w:bCs w:val="false"/>
+          <w:i w:val="false"/>
+          <w:iCs w:val="false"/>
+          <w:sz w:val="22"/>
+          <w:szCs w:val="22"/>
+        </w:rPr>
         <w:t xml:space="preserve">5. Robustness theo sampling, quantization và noise — 5</w:t>
       </w:r>
     </w:p>
@@ -1019,7 +1036,7 @@
       <w:pPr>
         <w:spacing w:after="120"/>
       </w:pPr>
-      <w:hyperlink w:history="1" r:id="rIdkfsaxy7weq1vtkl3rdl-8">
+      <w:hyperlink w:history="1" r:id="rIdzsjsms7cae64you4mesvd">
         <w:r>
           <w:rPr>
             <w:rFonts w:ascii="Aptos" w:cs="Aptos" w:eastAsia="Aptos" w:hAnsi="Aptos"/>
@@ -5687,6 +5704,812 @@
     </w:p>
     <w:p>
       <w:pPr>
+        <w:pStyle w:val="Heading2"/>
+        <w:keepNext/>
+        <w:spacing w:after="120" w:before="260"/>
+      </w:pPr>
+      <w:r>
+        <w:t xml:space="preserve">4.3. CNN baseline và ablation</w:t>
+      </w:r>
+    </w:p>
+    <w:p>
+      <w:pPr>
+        <w:spacing w:after="140" w:line="276"/>
+      </w:pPr>
+      <w:r>
+        <w:rPr>
+          <w:rFonts w:ascii="Aptos" w:cs="Aptos" w:eastAsia="Aptos" w:hAnsi="Aptos"/>
+          <w:b w:val="false"/>
+          <w:bCs w:val="false"/>
+          <w:i w:val="false"/>
+          <w:iCs w:val="false"/>
+          <w:sz w:val="22"/>
+          <w:szCs w:val="22"/>
+        </w:rPr>
+        <w:t xml:space="preserve">Để đối chiếu với hướng spectrogram CNN, một MobileNetV3-Small pretrained được thêm như baseline deep-learning nhẹ. CNN dùng input 1 kHz, 16-bit, không filter; mỗi recording chia tối đa hai cửa sổ 3 giây, chuyển thành log-STFT 128×128 và đưa qua backbone frozen; xác suất các cửa sổ được gộp về patient-level. Đây là full labeled cohort nhưng không phải full fine-tuning và không dùng mọi cửa sổ, nhằm giữ thời gian CPU thực tế.</w:t>
+      </w:r>
+    </w:p>
+    <w:tbl>
+      <w:tblPr>
+        <w:tblW w:type="dxa" w:w="9300"/>
+        <w:tblBorders>
+          <w:top w:val="single" w:color="CBD5E1" w:sz="4"/>
+          <w:left w:val="single" w:color="auto" w:sz="4"/>
+          <w:bottom w:val="single" w:color="CBD5E1" w:sz="4"/>
+          <w:right w:val="single" w:color="auto" w:sz="4"/>
+          <w:insideH w:val="single" w:color="CBD5E1" w:sz="2"/>
+          <w:insideV w:val="single" w:color="CBD5E1" w:sz="2"/>
+        </w:tblBorders>
+      </w:tblPr>
+      <w:tblGrid>
+        <w:gridCol w:w="4400"/>
+        <w:gridCol w:w="1500"/>
+        <w:gridCol w:w="1800"/>
+        <w:gridCol w:w="1600"/>
+      </w:tblGrid>
+      <w:tr>
+        <w:tc>
+          <w:tcPr>
+            <w:tcW w:type="dxa" w:w="4400"/>
+            <w:shd w:fill="17324D" w:val="clear"/>
+            <w:tcMar>
+              <w:top w:type="dxa" w:w="90"/>
+              <w:left w:type="dxa" w:w="100"/>
+              <w:bottom w:type="dxa" w:w="90"/>
+              <w:right w:type="dxa" w:w="100"/>
+            </w:tcMar>
+          </w:tcPr>
+          <w:p>
+            <w:pPr>
+              <w:spacing w:after="0" w:line="240"/>
+              <w:jc w:val="center"/>
+            </w:pPr>
+            <w:r>
+              <w:rPr>
+                <w:rFonts w:ascii="Aptos" w:cs="Aptos" w:eastAsia="Aptos" w:hAnsi="Aptos"/>
+                <w:b/>
+                <w:bCs/>
+                <w:i w:val="false"/>
+                <w:iCs w:val="false"/>
+                <w:color w:val="FFFFFF"/>
+                <w:sz w:val="19"/>
+                <w:szCs w:val="19"/>
+              </w:rPr>
+              <w:t xml:space="preserve">CNN setting</w:t>
+            </w:r>
+          </w:p>
+        </w:tc>
+        <w:tc>
+          <w:tcPr>
+            <w:tcW w:type="dxa" w:w="1500"/>
+            <w:shd w:fill="17324D" w:val="clear"/>
+            <w:tcMar>
+              <w:top w:type="dxa" w:w="90"/>
+              <w:left w:type="dxa" w:w="100"/>
+              <w:bottom w:type="dxa" w:w="90"/>
+              <w:right w:type="dxa" w:w="100"/>
+            </w:tcMar>
+          </w:tcPr>
+          <w:p>
+            <w:pPr>
+              <w:spacing w:after="0" w:line="240"/>
+              <w:jc w:val="center"/>
+            </w:pPr>
+            <w:r>
+              <w:rPr>
+                <w:rFonts w:ascii="Aptos" w:cs="Aptos" w:eastAsia="Aptos" w:hAnsi="Aptos"/>
+                <w:b/>
+                <w:bCs/>
+                <w:i w:val="false"/>
+                <w:iCs w:val="false"/>
+                <w:color w:val="FFFFFF"/>
+                <w:sz w:val="19"/>
+                <w:szCs w:val="19"/>
+              </w:rPr>
+              <w:t xml:space="preserve">Accuracy</w:t>
+            </w:r>
+          </w:p>
+        </w:tc>
+        <w:tc>
+          <w:tcPr>
+            <w:tcW w:type="dxa" w:w="1800"/>
+            <w:shd w:fill="17324D" w:val="clear"/>
+            <w:tcMar>
+              <w:top w:type="dxa" w:w="90"/>
+              <w:left w:type="dxa" w:w="100"/>
+              <w:bottom w:type="dxa" w:w="90"/>
+              <w:right w:type="dxa" w:w="100"/>
+            </w:tcMar>
+          </w:tcPr>
+          <w:p>
+            <w:pPr>
+              <w:spacing w:after="0" w:line="240"/>
+              <w:jc w:val="center"/>
+            </w:pPr>
+            <w:r>
+              <w:rPr>
+                <w:rFonts w:ascii="Aptos" w:cs="Aptos" w:eastAsia="Aptos" w:hAnsi="Aptos"/>
+                <w:b/>
+                <w:bCs/>
+                <w:i w:val="false"/>
+                <w:iCs w:val="false"/>
+                <w:color w:val="FFFFFF"/>
+                <w:sz w:val="19"/>
+                <w:szCs w:val="19"/>
+              </w:rPr>
+              <w:t xml:space="preserve">Balanced acc.</w:t>
+            </w:r>
+          </w:p>
+        </w:tc>
+        <w:tc>
+          <w:tcPr>
+            <w:tcW w:type="dxa" w:w="1600"/>
+            <w:shd w:fill="17324D" w:val="clear"/>
+            <w:tcMar>
+              <w:top w:type="dxa" w:w="90"/>
+              <w:left w:type="dxa" w:w="100"/>
+              <w:bottom w:type="dxa" w:w="90"/>
+              <w:right w:type="dxa" w:w="100"/>
+            </w:tcMar>
+          </w:tcPr>
+          <w:p>
+            <w:pPr>
+              <w:spacing w:after="0" w:line="240"/>
+              <w:jc w:val="center"/>
+            </w:pPr>
+            <w:r>
+              <w:rPr>
+                <w:rFonts w:ascii="Aptos" w:cs="Aptos" w:eastAsia="Aptos" w:hAnsi="Aptos"/>
+                <w:b/>
+                <w:bCs/>
+                <w:i w:val="false"/>
+                <w:iCs w:val="false"/>
+                <w:color w:val="FFFFFF"/>
+                <w:sz w:val="19"/>
+                <w:szCs w:val="19"/>
+              </w:rPr>
+              <w:t xml:space="preserve">Macro-F1</w:t>
+            </w:r>
+          </w:p>
+        </w:tc>
+      </w:tr>
+      <w:tr>
+        <w:tc>
+          <w:tcPr>
+            <w:tcW w:type="dxa" w:w="4400"/>
+            <w:tcMar>
+              <w:top w:type="dxa" w:w="90"/>
+              <w:left w:type="dxa" w:w="100"/>
+              <w:bottom w:type="dxa" w:w="90"/>
+              <w:right w:type="dxa" w:w="100"/>
+            </w:tcMar>
+          </w:tcPr>
+          <w:p>
+            <w:pPr>
+              <w:spacing w:after="0" w:line="240"/>
+              <w:jc w:val="left"/>
+            </w:pPr>
+            <w:r>
+              <w:rPr>
+                <w:rFonts w:ascii="Aptos" w:cs="Aptos" w:eastAsia="Aptos" w:hAnsi="Aptos"/>
+                <w:b w:val="false"/>
+                <w:bCs w:val="false"/>
+                <w:i w:val="false"/>
+                <w:iCs w:val="false"/>
+                <w:sz w:val="19"/>
+                <w:szCs w:val="19"/>
+              </w:rPr>
+              <w:t xml:space="preserve">Mean + tuned threshold</w:t>
+            </w:r>
+          </w:p>
+        </w:tc>
+        <w:tc>
+          <w:tcPr>
+            <w:tcW w:type="dxa" w:w="1500"/>
+            <w:tcMar>
+              <w:top w:type="dxa" w:w="90"/>
+              <w:left w:type="dxa" w:w="100"/>
+              <w:bottom w:type="dxa" w:w="90"/>
+              <w:right w:type="dxa" w:w="100"/>
+            </w:tcMar>
+          </w:tcPr>
+          <w:p>
+            <w:pPr>
+              <w:spacing w:after="0" w:line="240"/>
+              <w:jc w:val="center"/>
+            </w:pPr>
+            <w:r>
+              <w:rPr>
+                <w:rFonts w:ascii="Aptos" w:cs="Aptos" w:eastAsia="Aptos" w:hAnsi="Aptos"/>
+                <w:b w:val="false"/>
+                <w:bCs w:val="false"/>
+                <w:i w:val="false"/>
+                <w:iCs w:val="false"/>
+                <w:sz w:val="19"/>
+                <w:szCs w:val="19"/>
+              </w:rPr>
+              <w:t xml:space="preserve">0,841</w:t>
+            </w:r>
+          </w:p>
+        </w:tc>
+        <w:tc>
+          <w:tcPr>
+            <w:tcW w:type="dxa" w:w="1800"/>
+            <w:tcMar>
+              <w:top w:type="dxa" w:w="90"/>
+              <w:left w:type="dxa" w:w="100"/>
+              <w:bottom w:type="dxa" w:w="90"/>
+              <w:right w:type="dxa" w:w="100"/>
+            </w:tcMar>
+          </w:tcPr>
+          <w:p>
+            <w:pPr>
+              <w:spacing w:after="0" w:line="240"/>
+              <w:jc w:val="center"/>
+            </w:pPr>
+            <w:r>
+              <w:rPr>
+                <w:rFonts w:ascii="Aptos" w:cs="Aptos" w:eastAsia="Aptos" w:hAnsi="Aptos"/>
+                <w:b w:val="false"/>
+                <w:bCs w:val="false"/>
+                <w:i w:val="false"/>
+                <w:iCs w:val="false"/>
+                <w:sz w:val="19"/>
+                <w:szCs w:val="19"/>
+              </w:rPr>
+              <w:t xml:space="preserve">0,666</w:t>
+            </w:r>
+          </w:p>
+        </w:tc>
+        <w:tc>
+          <w:tcPr>
+            <w:tcW w:type="dxa" w:w="1600"/>
+            <w:tcMar>
+              <w:top w:type="dxa" w:w="90"/>
+              <w:left w:type="dxa" w:w="100"/>
+              <w:bottom w:type="dxa" w:w="90"/>
+              <w:right w:type="dxa" w:w="100"/>
+            </w:tcMar>
+          </w:tcPr>
+          <w:p>
+            <w:pPr>
+              <w:spacing w:after="0" w:line="240"/>
+              <w:jc w:val="center"/>
+            </w:pPr>
+            <w:r>
+              <w:rPr>
+                <w:rFonts w:ascii="Aptos" w:cs="Aptos" w:eastAsia="Aptos" w:hAnsi="Aptos"/>
+                <w:b w:val="false"/>
+                <w:bCs w:val="false"/>
+                <w:i w:val="false"/>
+                <w:iCs w:val="false"/>
+                <w:sz w:val="19"/>
+                <w:szCs w:val="19"/>
+              </w:rPr>
+              <w:t xml:space="preserve">0,697</w:t>
+            </w:r>
+          </w:p>
+        </w:tc>
+      </w:tr>
+      <w:tr>
+        <w:tc>
+          <w:tcPr>
+            <w:tcW w:type="dxa" w:w="4400"/>
+            <w:shd w:fill="F8FAFC" w:val="clear"/>
+            <w:tcMar>
+              <w:top w:type="dxa" w:w="90"/>
+              <w:left w:type="dxa" w:w="100"/>
+              <w:bottom w:type="dxa" w:w="90"/>
+              <w:right w:type="dxa" w:w="100"/>
+            </w:tcMar>
+          </w:tcPr>
+          <w:p>
+            <w:pPr>
+              <w:spacing w:after="0" w:line="240"/>
+              <w:jc w:val="left"/>
+            </w:pPr>
+            <w:r>
+              <w:rPr>
+                <w:rFonts w:ascii="Aptos" w:cs="Aptos" w:eastAsia="Aptos" w:hAnsi="Aptos"/>
+                <w:b w:val="false"/>
+                <w:bCs w:val="false"/>
+                <w:i w:val="false"/>
+                <w:iCs w:val="false"/>
+                <w:sz w:val="19"/>
+                <w:szCs w:val="19"/>
+              </w:rPr>
+              <w:t xml:space="preserve">Median + tuned threshold</w:t>
+            </w:r>
+          </w:p>
+        </w:tc>
+        <w:tc>
+          <w:tcPr>
+            <w:tcW w:type="dxa" w:w="1500"/>
+            <w:shd w:fill="F8FAFC" w:val="clear"/>
+            <w:tcMar>
+              <w:top w:type="dxa" w:w="90"/>
+              <w:left w:type="dxa" w:w="100"/>
+              <w:bottom w:type="dxa" w:w="90"/>
+              <w:right w:type="dxa" w:w="100"/>
+            </w:tcMar>
+          </w:tcPr>
+          <w:p>
+            <w:pPr>
+              <w:spacing w:after="0" w:line="240"/>
+              <w:jc w:val="center"/>
+            </w:pPr>
+            <w:r>
+              <w:rPr>
+                <w:rFonts w:ascii="Aptos" w:cs="Aptos" w:eastAsia="Aptos" w:hAnsi="Aptos"/>
+                <w:b w:val="false"/>
+                <w:bCs w:val="false"/>
+                <w:i w:val="false"/>
+                <w:iCs w:val="false"/>
+                <w:sz w:val="19"/>
+                <w:szCs w:val="19"/>
+              </w:rPr>
+              <w:t xml:space="preserve">0,833</w:t>
+            </w:r>
+          </w:p>
+        </w:tc>
+        <w:tc>
+          <w:tcPr>
+            <w:tcW w:type="dxa" w:w="1800"/>
+            <w:shd w:fill="F8FAFC" w:val="clear"/>
+            <w:tcMar>
+              <w:top w:type="dxa" w:w="90"/>
+              <w:left w:type="dxa" w:w="100"/>
+              <w:bottom w:type="dxa" w:w="90"/>
+              <w:right w:type="dxa" w:w="100"/>
+            </w:tcMar>
+          </w:tcPr>
+          <w:p>
+            <w:pPr>
+              <w:spacing w:after="0" w:line="240"/>
+              <w:jc w:val="center"/>
+            </w:pPr>
+            <w:r>
+              <w:rPr>
+                <w:rFonts w:ascii="Aptos" w:cs="Aptos" w:eastAsia="Aptos" w:hAnsi="Aptos"/>
+                <w:b w:val="false"/>
+                <w:bCs w:val="false"/>
+                <w:i w:val="false"/>
+                <w:iCs w:val="false"/>
+                <w:sz w:val="19"/>
+                <w:szCs w:val="19"/>
+              </w:rPr>
+              <w:t xml:space="preserve">0,689</w:t>
+            </w:r>
+          </w:p>
+        </w:tc>
+        <w:tc>
+          <w:tcPr>
+            <w:tcW w:type="dxa" w:w="1600"/>
+            <w:shd w:fill="F8FAFC" w:val="clear"/>
+            <w:tcMar>
+              <w:top w:type="dxa" w:w="90"/>
+              <w:left w:type="dxa" w:w="100"/>
+              <w:bottom w:type="dxa" w:w="90"/>
+              <w:right w:type="dxa" w:w="100"/>
+            </w:tcMar>
+          </w:tcPr>
+          <w:p>
+            <w:pPr>
+              <w:spacing w:after="0" w:line="240"/>
+              <w:jc w:val="center"/>
+            </w:pPr>
+            <w:r>
+              <w:rPr>
+                <w:rFonts w:ascii="Aptos" w:cs="Aptos" w:eastAsia="Aptos" w:hAnsi="Aptos"/>
+                <w:b w:val="false"/>
+                <w:bCs w:val="false"/>
+                <w:i w:val="false"/>
+                <w:iCs w:val="false"/>
+                <w:sz w:val="19"/>
+                <w:szCs w:val="19"/>
+              </w:rPr>
+              <w:t xml:space="preserve">0,710</w:t>
+            </w:r>
+          </w:p>
+        </w:tc>
+      </w:tr>
+      <w:tr>
+        <w:tc>
+          <w:tcPr>
+            <w:tcW w:type="dxa" w:w="4400"/>
+            <w:tcMar>
+              <w:top w:type="dxa" w:w="90"/>
+              <w:left w:type="dxa" w:w="100"/>
+              <w:bottom w:type="dxa" w:w="90"/>
+              <w:right w:type="dxa" w:w="100"/>
+            </w:tcMar>
+          </w:tcPr>
+          <w:p>
+            <w:pPr>
+              <w:spacing w:after="0" w:line="240"/>
+              <w:jc w:val="left"/>
+            </w:pPr>
+            <w:r>
+              <w:rPr>
+                <w:rFonts w:ascii="Aptos" w:cs="Aptos" w:eastAsia="Aptos" w:hAnsi="Aptos"/>
+                <w:b w:val="false"/>
+                <w:bCs w:val="false"/>
+                <w:i w:val="false"/>
+                <w:iCs w:val="false"/>
+                <w:sz w:val="19"/>
+                <w:szCs w:val="19"/>
+              </w:rPr>
+              <w:t xml:space="preserve">Top-25% windows</w:t>
+            </w:r>
+          </w:p>
+        </w:tc>
+        <w:tc>
+          <w:tcPr>
+            <w:tcW w:type="dxa" w:w="1500"/>
+            <w:tcMar>
+              <w:top w:type="dxa" w:w="90"/>
+              <w:left w:type="dxa" w:w="100"/>
+              <w:bottom w:type="dxa" w:w="90"/>
+              <w:right w:type="dxa" w:w="100"/>
+            </w:tcMar>
+          </w:tcPr>
+          <w:p>
+            <w:pPr>
+              <w:spacing w:after="0" w:line="240"/>
+              <w:jc w:val="center"/>
+            </w:pPr>
+            <w:r>
+              <w:rPr>
+                <w:rFonts w:ascii="Aptos" w:cs="Aptos" w:eastAsia="Aptos" w:hAnsi="Aptos"/>
+                <w:b w:val="false"/>
+                <w:bCs w:val="false"/>
+                <w:i w:val="false"/>
+                <w:iCs w:val="false"/>
+                <w:sz w:val="19"/>
+                <w:szCs w:val="19"/>
+              </w:rPr>
+              <w:t xml:space="preserve">0,765</w:t>
+            </w:r>
+          </w:p>
+        </w:tc>
+        <w:tc>
+          <w:tcPr>
+            <w:tcW w:type="dxa" w:w="1800"/>
+            <w:tcMar>
+              <w:top w:type="dxa" w:w="90"/>
+              <w:left w:type="dxa" w:w="100"/>
+              <w:bottom w:type="dxa" w:w="90"/>
+              <w:right w:type="dxa" w:w="100"/>
+            </w:tcMar>
+          </w:tcPr>
+          <w:p>
+            <w:pPr>
+              <w:spacing w:after="0" w:line="240"/>
+              <w:jc w:val="center"/>
+            </w:pPr>
+            <w:r>
+              <w:rPr>
+                <w:rFonts w:ascii="Aptos" w:cs="Aptos" w:eastAsia="Aptos" w:hAnsi="Aptos"/>
+                <w:b w:val="false"/>
+                <w:bCs w:val="false"/>
+                <w:i w:val="false"/>
+                <w:iCs w:val="false"/>
+                <w:sz w:val="19"/>
+                <w:szCs w:val="19"/>
+              </w:rPr>
+              <w:t xml:space="preserve">0,660</w:t>
+            </w:r>
+          </w:p>
+        </w:tc>
+        <w:tc>
+          <w:tcPr>
+            <w:tcW w:type="dxa" w:w="1600"/>
+            <w:tcMar>
+              <w:top w:type="dxa" w:w="90"/>
+              <w:left w:type="dxa" w:w="100"/>
+              <w:bottom w:type="dxa" w:w="90"/>
+              <w:right w:type="dxa" w:w="100"/>
+            </w:tcMar>
+          </w:tcPr>
+          <w:p>
+            <w:pPr>
+              <w:spacing w:after="0" w:line="240"/>
+              <w:jc w:val="center"/>
+            </w:pPr>
+            <w:r>
+              <w:rPr>
+                <w:rFonts w:ascii="Aptos" w:cs="Aptos" w:eastAsia="Aptos" w:hAnsi="Aptos"/>
+                <w:b w:val="false"/>
+                <w:bCs w:val="false"/>
+                <w:i w:val="false"/>
+                <w:iCs w:val="false"/>
+                <w:sz w:val="19"/>
+                <w:szCs w:val="19"/>
+              </w:rPr>
+              <w:t xml:space="preserve">0,653</w:t>
+            </w:r>
+          </w:p>
+        </w:tc>
+      </w:tr>
+      <w:tr>
+        <w:tc>
+          <w:tcPr>
+            <w:tcW w:type="dxa" w:w="4400"/>
+            <w:shd w:fill="F8FAFC" w:val="clear"/>
+            <w:tcMar>
+              <w:top w:type="dxa" w:w="90"/>
+              <w:left w:type="dxa" w:w="100"/>
+              <w:bottom w:type="dxa" w:w="90"/>
+              <w:right w:type="dxa" w:w="100"/>
+            </w:tcMar>
+          </w:tcPr>
+          <w:p>
+            <w:pPr>
+              <w:spacing w:after="0" w:line="240"/>
+              <w:jc w:val="left"/>
+            </w:pPr>
+            <w:r>
+              <w:rPr>
+                <w:rFonts w:ascii="Aptos" w:cs="Aptos" w:eastAsia="Aptos" w:hAnsi="Aptos"/>
+                <w:b w:val="false"/>
+                <w:bCs w:val="false"/>
+                <w:i w:val="false"/>
+                <w:iCs w:val="false"/>
+                <w:sz w:val="19"/>
+                <w:szCs w:val="19"/>
+              </w:rPr>
+              <w:t xml:space="preserve">Max window</w:t>
+            </w:r>
+          </w:p>
+        </w:tc>
+        <w:tc>
+          <w:tcPr>
+            <w:tcW w:type="dxa" w:w="1500"/>
+            <w:shd w:fill="F8FAFC" w:val="clear"/>
+            <w:tcMar>
+              <w:top w:type="dxa" w:w="90"/>
+              <w:left w:type="dxa" w:w="100"/>
+              <w:bottom w:type="dxa" w:w="90"/>
+              <w:right w:type="dxa" w:w="100"/>
+            </w:tcMar>
+          </w:tcPr>
+          <w:p>
+            <w:pPr>
+              <w:spacing w:after="0" w:line="240"/>
+              <w:jc w:val="center"/>
+            </w:pPr>
+            <w:r>
+              <w:rPr>
+                <w:rFonts w:ascii="Aptos" w:cs="Aptos" w:eastAsia="Aptos" w:hAnsi="Aptos"/>
+                <w:b w:val="false"/>
+                <w:bCs w:val="false"/>
+                <w:i w:val="false"/>
+                <w:iCs w:val="false"/>
+                <w:sz w:val="19"/>
+                <w:szCs w:val="19"/>
+              </w:rPr>
+              <w:t xml:space="preserve">0,667</w:t>
+            </w:r>
+          </w:p>
+        </w:tc>
+        <w:tc>
+          <w:tcPr>
+            <w:tcW w:type="dxa" w:w="1800"/>
+            <w:shd w:fill="F8FAFC" w:val="clear"/>
+            <w:tcMar>
+              <w:top w:type="dxa" w:w="90"/>
+              <w:left w:type="dxa" w:w="100"/>
+              <w:bottom w:type="dxa" w:w="90"/>
+              <w:right w:type="dxa" w:w="100"/>
+            </w:tcMar>
+          </w:tcPr>
+          <w:p>
+            <w:pPr>
+              <w:spacing w:after="0" w:line="240"/>
+              <w:jc w:val="center"/>
+            </w:pPr>
+            <w:r>
+              <w:rPr>
+                <w:rFonts w:ascii="Aptos" w:cs="Aptos" w:eastAsia="Aptos" w:hAnsi="Aptos"/>
+                <w:b w:val="false"/>
+                <w:bCs w:val="false"/>
+                <w:i w:val="false"/>
+                <w:iCs w:val="false"/>
+                <w:sz w:val="19"/>
+                <w:szCs w:val="19"/>
+              </w:rPr>
+              <w:t xml:space="preserve">0,543</w:t>
+            </w:r>
+          </w:p>
+        </w:tc>
+        <w:tc>
+          <w:tcPr>
+            <w:tcW w:type="dxa" w:w="1600"/>
+            <w:shd w:fill="F8FAFC" w:val="clear"/>
+            <w:tcMar>
+              <w:top w:type="dxa" w:w="90"/>
+              <w:left w:type="dxa" w:w="100"/>
+              <w:bottom w:type="dxa" w:w="90"/>
+              <w:right w:type="dxa" w:w="100"/>
+            </w:tcMar>
+          </w:tcPr>
+          <w:p>
+            <w:pPr>
+              <w:spacing w:after="0" w:line="240"/>
+              <w:jc w:val="center"/>
+            </w:pPr>
+            <w:r>
+              <w:rPr>
+                <w:rFonts w:ascii="Aptos" w:cs="Aptos" w:eastAsia="Aptos" w:hAnsi="Aptos"/>
+                <w:b w:val="false"/>
+                <w:bCs w:val="false"/>
+                <w:i w:val="false"/>
+                <w:iCs w:val="false"/>
+                <w:sz w:val="19"/>
+                <w:szCs w:val="19"/>
+              </w:rPr>
+              <w:t xml:space="preserve">0,536</w:t>
+            </w:r>
+          </w:p>
+        </w:tc>
+      </w:tr>
+      <w:tr>
+        <w:tc>
+          <w:tcPr>
+            <w:tcW w:type="dxa" w:w="4400"/>
+            <w:tcMar>
+              <w:top w:type="dxa" w:w="90"/>
+              <w:left w:type="dxa" w:w="100"/>
+              <w:bottom w:type="dxa" w:w="90"/>
+              <w:right w:type="dxa" w:w="100"/>
+            </w:tcMar>
+          </w:tcPr>
+          <w:p>
+            <w:pPr>
+              <w:spacing w:after="0" w:line="240"/>
+              <w:jc w:val="left"/>
+            </w:pPr>
+            <w:r>
+              <w:rPr>
+                <w:rFonts w:ascii="Aptos" w:cs="Aptos" w:eastAsia="Aptos" w:hAnsi="Aptos"/>
+                <w:b w:val="false"/>
+                <w:bCs w:val="false"/>
+                <w:i w:val="false"/>
+                <w:iCs w:val="false"/>
+                <w:sz w:val="19"/>
+                <w:szCs w:val="19"/>
+              </w:rPr>
+              <w:t xml:space="preserve">Median + last block fine-tuned</w:t>
+            </w:r>
+          </w:p>
+        </w:tc>
+        <w:tc>
+          <w:tcPr>
+            <w:tcW w:type="dxa" w:w="1500"/>
+            <w:tcMar>
+              <w:top w:type="dxa" w:w="90"/>
+              <w:left w:type="dxa" w:w="100"/>
+              <w:bottom w:type="dxa" w:w="90"/>
+              <w:right w:type="dxa" w:w="100"/>
+            </w:tcMar>
+          </w:tcPr>
+          <w:p>
+            <w:pPr>
+              <w:spacing w:after="0" w:line="240"/>
+              <w:jc w:val="center"/>
+            </w:pPr>
+            <w:r>
+              <w:rPr>
+                <w:rFonts w:ascii="Aptos" w:cs="Aptos" w:eastAsia="Aptos" w:hAnsi="Aptos"/>
+                <w:b w:val="false"/>
+                <w:bCs w:val="false"/>
+                <w:i w:val="false"/>
+                <w:iCs w:val="false"/>
+                <w:sz w:val="19"/>
+                <w:szCs w:val="19"/>
+              </w:rPr>
+              <w:t xml:space="preserve">0,841</w:t>
+            </w:r>
+          </w:p>
+        </w:tc>
+        <w:tc>
+          <w:tcPr>
+            <w:tcW w:type="dxa" w:w="1800"/>
+            <w:tcMar>
+              <w:top w:type="dxa" w:w="90"/>
+              <w:left w:type="dxa" w:w="100"/>
+              <w:bottom w:type="dxa" w:w="90"/>
+              <w:right w:type="dxa" w:w="100"/>
+            </w:tcMar>
+          </w:tcPr>
+          <w:p>
+            <w:pPr>
+              <w:spacing w:after="0" w:line="240"/>
+              <w:jc w:val="center"/>
+            </w:pPr>
+            <w:r>
+              <w:rPr>
+                <w:rFonts w:ascii="Aptos" w:cs="Aptos" w:eastAsia="Aptos" w:hAnsi="Aptos"/>
+                <w:b w:val="false"/>
+                <w:bCs w:val="false"/>
+                <w:i w:val="false"/>
+                <w:iCs w:val="false"/>
+                <w:sz w:val="19"/>
+                <w:szCs w:val="19"/>
+              </w:rPr>
+              <w:t xml:space="preserve">0,680</w:t>
+            </w:r>
+          </w:p>
+        </w:tc>
+        <w:tc>
+          <w:tcPr>
+            <w:tcW w:type="dxa" w:w="1600"/>
+            <w:tcMar>
+              <w:top w:type="dxa" w:w="90"/>
+              <w:left w:type="dxa" w:w="100"/>
+              <w:bottom w:type="dxa" w:w="90"/>
+              <w:right w:type="dxa" w:w="100"/>
+            </w:tcMar>
+          </w:tcPr>
+          <w:p>
+            <w:pPr>
+              <w:spacing w:after="0" w:line="240"/>
+              <w:jc w:val="center"/>
+            </w:pPr>
+            <w:r>
+              <w:rPr>
+                <w:rFonts w:ascii="Aptos" w:cs="Aptos" w:eastAsia="Aptos" w:hAnsi="Aptos"/>
+                <w:b w:val="false"/>
+                <w:bCs w:val="false"/>
+                <w:i w:val="false"/>
+                <w:iCs w:val="false"/>
+                <w:sz w:val="19"/>
+                <w:szCs w:val="19"/>
+              </w:rPr>
+              <w:t xml:space="preserve">0,708</w:t>
+            </w:r>
+          </w:p>
+        </w:tc>
+      </w:tr>
+    </w:tbl>
+    <w:p>
+      <w:pPr>
+        <w:spacing w:after="180" w:before="40"/>
+        <w:jc w:val="center"/>
+      </w:pPr>
+      <w:r>
+        <w:rPr>
+          <w:rFonts w:ascii="Aptos" w:cs="Aptos" w:eastAsia="Aptos" w:hAnsi="Aptos"/>
+          <w:b w:val="false"/>
+          <w:bCs w:val="false"/>
+          <w:i/>
+          <w:iCs/>
+          <w:color w:val="475569"/>
+          <w:sz w:val="19"/>
+          <w:szCs w:val="19"/>
+        </w:rPr>
+        <w:t xml:space="preserve">Bảng 6. CNN aggregation, threshold và fine-tuning ablation; test = 132 bệnh nhân.</w:t>
+      </w:r>
+    </w:p>
+    <w:p>
+      <w:pPr>
+        <w:spacing w:after="140" w:line="276"/>
+      </w:pPr>
+      <w:r>
+        <w:rPr>
+          <w:rFonts w:ascii="Aptos" w:cs="Aptos" w:eastAsia="Aptos" w:hAnsi="Aptos"/>
+          <w:b w:val="false"/>
+          <w:bCs w:val="false"/>
+          <w:i w:val="false"/>
+          <w:iCs w:val="false"/>
+          <w:sz w:val="22"/>
+          <w:szCs w:val="22"/>
+        </w:rPr>
+        <w:t xml:space="preserve">Median aggregation là lựa chọn CNN tốt nhất trong seed 42. Max và top-25% dễ bị chi phối bởi một window có xác suất cao bất thường. Fine-tune block cuối không cải thiện Macro-F1 so với frozen backbone. Khi cố định patient split seed 42 và đổi model seed 42/7/123, Macro-F1 trung bình là 0,688 ± 0,025; vì test chỉ có 27 Present patients nên cần báo cáo độ dao động thay vì chỉ một con số.</w:t>
+      </w:r>
+    </w:p>
+    <w:p>
+      <w:pPr>
         <w:pStyle w:val="Heading1"/>
         <w:keepNext/>
         <w:spacing w:after="120" w:before="260"/>
@@ -6240,7 +7063,7 @@
           <w:sz w:val="19"/>
           <w:szCs w:val="19"/>
         </w:rPr>
-        <w:t xml:space="preserve">Bảng 4. Robustness matrix.</w:t>
+        <w:t xml:space="preserve">Bảng 7. Robustness matrix trên pilot subset.</w:t>
       </w:r>
     </w:p>
     <w:p>
@@ -6386,7 +7209,7 @@
           <w:sz w:val="22"/>
           <w:szCs w:val="22"/>
         </w:rPr>
-        <w:t xml:space="preserve">FE nằm trong app.py và gọi cùng service inference với CLI. Người dùng upload WAV, chọn sampling rate, quantization, filter và noise preview; sau đó xem audio player, waveform, FFT, PSD, STFT, class probabilities và cấu hình DSP được dùng. Model mặc định là svm_butterworth_hybrid/model.joblib.</w:t>
+        <w:t xml:space="preserve">FE nằm trong app.py và gọi cùng service inference với CLI. Người dùng upload WAV, chọn sampling rate, quantization, filter và noise preview; sau đó xem audio player, waveform, FFT, PSD, STFT, class probabilities và cấu hình DSP được dùng. Model mặc định là svm_butterworth_hybrid/model.joblib; CNN hiện chỉ là benchmark bổ sung và chưa được tích hợp vào FE.</w:t>
       </w:r>
     </w:p>
     <w:p>
@@ -6470,7 +7293,7 @@
           <w:sz w:val="22"/>
           <w:szCs w:val="22"/>
         </w:rPr>
-        <w:t xml:space="preserve">Benchmark full-cohort có test set 132 bệnh nhân nhưng mới dùng một patient-wise split seed 42; khoảng tin cậy và độ ổn định theo nhiều seed chưa được tính.</w:t>
+        <w:t xml:space="preserve">Benchmark full-cohort có test set 132 bệnh nhân; CNN ablation đã kiểm tra thêm nhiều model seed trên cùng split, nhưng matrix SVM/MLP chính vẫn dùng seed 42.</w:t>
       </w:r>
     </w:p>
     <w:p>
@@ -6558,7 +7381,7 @@
           <w:sz w:val="22"/>
           <w:szCs w:val="22"/>
         </w:rPr>
-        <w:t xml:space="preserve">MLP và SVM là baseline CPU; nghiên cứu chưa đánh giá CNN hoặc calibration trên cohort lớn.</w:t>
+        <w:t xml:space="preserve">CNN là baseline transfer-learning nhẹ với backbone frozen; chưa có kết quả full fine-tuning toàn backbone hoặc calibration xác suất.</w:t>
       </w:r>
     </w:p>
     <w:p>
@@ -6602,7 +7425,7 @@
           <w:sz w:val="22"/>
           <w:szCs w:val="22"/>
         </w:rPr>
-        <w:t xml:space="preserve">Các bước phát triển tiếp theo gồm: lặp lại đánh giá với nhiều patient-wise seeds, sử dụng segmentation để tạo cycle-level feature, bổ sung confidence interval/calibration, và chỉ khi cần mới so sánh với spectrogram CNN hoặc mở rộng sang toàn bộ subjects ngoài public training release.</w:t>
+        <w:t xml:space="preserve">Các bước phát triển tiếp theo gồm: dùng segmentation để tạo cycle-level feature, bổ sung confidence interval/calibration, thử full fine-tuning trên GPU nếu cần, và mở rộng đánh giá sang các subjects ngoài public training release. Trong phạm vi DSP501, kết quả hiện tại đã đủ để minh họa rõ tác động của sampling, quantization, filter, FFT/PSD/STFT/MFCC, noise và mô hình học máy.</w:t>
       </w:r>
     </w:p>
     <w:p>
@@ -6636,7 +7459,7 @@
       <w:pPr>
         <w:spacing w:after="120"/>
       </w:pPr>
-      <w:hyperlink w:history="1" r:id="rIdgbugjbe-ieijtgwpjbkk0">
+      <w:hyperlink w:history="1" r:id="rIdeutwktxq-jjxrc_z7tpmg">
         <w:r>
           <w:rPr>
             <w:rFonts w:ascii="Aptos" w:cs="Aptos" w:eastAsia="Aptos" w:hAnsi="Aptos"/>

</xml_diff>

<commit_message>
Update report and slides with challenge-aligned benchmark
</commit_message>
<xml_diff>
--- a/docs/project_deliverables/final_report_dsp501.docx
+++ b/docs/project_deliverables/final_report_dsp501.docx
@@ -523,7 +523,7 @@
           <w:sz w:val="22"/>
           <w:szCs w:val="22"/>
         </w:rPr>
-        <w:t xml:space="preserve">Bản chính sử dụng toàn bộ public training release: 942 bệnh nhân và 3.163 WAV, trong đó 874 bệnh nhân có nhãn Absent/Present được dùng cho supervised learning. Patient-wise split gồm 611 train, 131 validation và 132 test. Full matrix 24 cấu hình cho thấy MLP + không filter + MFCC đạt macro-F1 cao nhất 0,693, còn SVM + không filter + hybrid có balanced accuracy cao nhất 0,664 trong cùng split. Benchmark preprocess cố định SVM + Butterworth + hybrid cho thấy 1 kHz + 16-bit là baseline nhanh nhất (85,8 s; macro-F1 0,615), còn 4 kHz + không quantization thêm đạt macro-F1 0,637 nhưng tốn 126,9 s. Matrix và robustness trên subset 100 patient được giữ như pilot để minh họa xu hướng khác biệt với kết quả full cohort.</w:t>
+        <w:t xml:space="preserve">Bản đánh giá chính được căn chỉnh theo protocol challenge: dùng toàn bộ public training release gồm 942 bệnh nhân và 3.163 WAV, giữ ba lớp Absent/Present/Unknown, chia patient-wise 65/10/25 thành 612 train, 94 validation và 236 test. Metric chính là Weighted Accuracy (WAcc) với trọng số lớp 1/5/3; UAR, macro OVR-AUROC, macro OVR-AUPRC và Macro-F1 được báo cáo kèm. MobileNetV3-Small pretrained + Butterworth đạt WAcc 0,667, UAR 0,641, AUROC 0,796, AUPRC 0,629 và Macro-F1 0,604; baseline DSP tốt nhất là SVM + không filter + hybrid với WAcc 0,644. Matrix nhị phân 874 bệnh nhân và benchmark robustness được giữ như ablation phụ để giải thích ảnh hưởng của DSP, không dùng làm leaderboard chính.</w:t>
       </w:r>
     </w:p>
     <w:p>
@@ -652,7 +652,7 @@
           <w:sz w:val="22"/>
           <w:szCs w:val="22"/>
         </w:rPr>
-        <w:t xml:space="preserve">4.2. Full-data matrix model/filter/feature — 6</w:t>
+        <w:t xml:space="preserve">4.2. Challenge-aligned full-data matrix — 6</w:t>
       </w:r>
     </w:p>
     <w:p>
@@ -669,7 +669,24 @@
           <w:sz w:val="22"/>
           <w:szCs w:val="22"/>
         </w:rPr>
-        <w:t xml:space="preserve">4.3. CNN baseline và ablation — 7</w:t>
+        <w:t xml:space="preserve">4.3. MobileNet baseline và filter ablation — 7</w:t>
+      </w:r>
+    </w:p>
+    <w:p>
+      <w:pPr>
+        <w:spacing w:after="140" w:line="276"/>
+      </w:pPr>
+      <w:r>
+        <w:rPr>
+          <w:rFonts w:ascii="Aptos" w:cs="Aptos" w:eastAsia="Aptos" w:hAnsi="Aptos"/>
+          <w:b w:val="false"/>
+          <w:bCs w:val="false"/>
+          <w:i w:val="false"/>
+          <w:iCs w:val="false"/>
+          <w:sz w:val="22"/>
+          <w:szCs w:val="22"/>
+        </w:rPr>
+        <w:t xml:space="preserve">4.4. Binary DSP ablation (secondary) — 7</w:t>
       </w:r>
     </w:p>
     <w:p>
@@ -948,7 +965,7 @@
           <w:sz w:val="22"/>
           <w:szCs w:val="22"/>
         </w:rPr>
-        <w:t xml:space="preserve">So sánh định lượng filter, feature representation và classifier bằng macro-F1, balanced accuracy và confusion matrix.</w:t>
+        <w:t xml:space="preserve">So sánh định lượng filter, feature representation và classifier bằng Weighted Accuracy (metric chính), UAR, AUROC, AUPRC, Macro-F1 và confusion matrix.</w:t>
       </w:r>
     </w:p>
     <w:p>
@@ -1036,7 +1053,7 @@
       <w:pPr>
         <w:spacing w:after="120"/>
       </w:pPr>
-      <w:hyperlink w:history="1" r:id="rIdzsjsms7cae64you4mesvd">
+      <w:hyperlink w:history="1" r:id="rIds3voaxlbuc3-mqnpg2d7n">
         <w:r>
           <w:rPr>
             <w:rFonts w:ascii="Aptos" w:cs="Aptos" w:eastAsia="Aptos" w:hAnsi="Aptos"/>
@@ -1341,7 +1358,7 @@
                 <w:sz w:val="19"/>
                 <w:szCs w:val="19"/>
               </w:rPr>
-              <w:t xml:space="preserve">Bệnh nhân dùng supervised</w:t>
+              <w:t xml:space="preserve">Primary 3-class supervised</w:t>
             </w:r>
           </w:p>
         </w:tc>
@@ -1371,7 +1388,7 @@
                 <w:sz w:val="19"/>
                 <w:szCs w:val="19"/>
               </w:rPr>
-              <w:t xml:space="preserve">874 (loại 68 Unknown)</w:t>
+              <w:t xml:space="preserve">942 (giữ Unknown)</w:t>
             </w:r>
           </w:p>
         </w:tc>
@@ -1402,7 +1419,7 @@
                 <w:sz w:val="19"/>
                 <w:szCs w:val="19"/>
               </w:rPr>
-              <w:t xml:space="preserve">Sample rate nguồn</w:t>
+              <w:t xml:space="preserve">Primary split patient-wise</w:t>
             </w:r>
           </w:p>
         </w:tc>
@@ -1431,7 +1448,7 @@
                 <w:sz w:val="19"/>
                 <w:szCs w:val="19"/>
               </w:rPr>
-              <w:t xml:space="preserve">4 kHz (3.163/3.163)</w:t>
+              <w:t xml:space="preserve">612 / 94 / 236 (65/10/25)</w:t>
             </w:r>
           </w:p>
         </w:tc>
@@ -1463,7 +1480,7 @@
                 <w:sz w:val="19"/>
                 <w:szCs w:val="19"/>
               </w:rPr>
-              <w:t xml:space="preserve">Split patient-wise</w:t>
+              <w:t xml:space="preserve">Secondary binary supervised</w:t>
             </w:r>
           </w:p>
         </w:tc>
@@ -1493,7 +1510,129 @@
                 <w:sz w:val="19"/>
                 <w:szCs w:val="19"/>
               </w:rPr>
-              <w:t xml:space="preserve">611 / 131 / 132</w:t>
+              <w:t xml:space="preserve">874 (loại 68 Unknown)</w:t>
+            </w:r>
+          </w:p>
+        </w:tc>
+      </w:tr>
+      <w:tr>
+        <w:tc>
+          <w:tcPr>
+            <w:tcW w:type="dxa" w:w="4300"/>
+            <w:tcMar>
+              <w:top w:type="dxa" w:w="90"/>
+              <w:left w:type="dxa" w:w="100"/>
+              <w:bottom w:type="dxa" w:w="90"/>
+              <w:right w:type="dxa" w:w="100"/>
+            </w:tcMar>
+          </w:tcPr>
+          <w:p>
+            <w:pPr>
+              <w:spacing w:after="0" w:line="240"/>
+              <w:jc w:val="left"/>
+            </w:pPr>
+            <w:r>
+              <w:rPr>
+                <w:rFonts w:ascii="Aptos" w:cs="Aptos" w:eastAsia="Aptos" w:hAnsi="Aptos"/>
+                <w:b w:val="false"/>
+                <w:bCs w:val="false"/>
+                <w:i w:val="false"/>
+                <w:iCs w:val="false"/>
+                <w:sz w:val="19"/>
+                <w:szCs w:val="19"/>
+              </w:rPr>
+              <w:t xml:space="preserve">Secondary split</w:t>
+            </w:r>
+          </w:p>
+        </w:tc>
+        <w:tc>
+          <w:tcPr>
+            <w:tcW w:type="dxa" w:w="5000"/>
+            <w:tcMar>
+              <w:top w:type="dxa" w:w="90"/>
+              <w:left w:type="dxa" w:w="100"/>
+              <w:bottom w:type="dxa" w:w="90"/>
+              <w:right w:type="dxa" w:w="100"/>
+            </w:tcMar>
+          </w:tcPr>
+          <w:p>
+            <w:pPr>
+              <w:spacing w:after="0" w:line="240"/>
+              <w:jc w:val="center"/>
+            </w:pPr>
+            <w:r>
+              <w:rPr>
+                <w:rFonts w:ascii="Aptos" w:cs="Aptos" w:eastAsia="Aptos" w:hAnsi="Aptos"/>
+                <w:b w:val="false"/>
+                <w:bCs w:val="false"/>
+                <w:i w:val="false"/>
+                <w:iCs w:val="false"/>
+                <w:sz w:val="19"/>
+                <w:szCs w:val="19"/>
+              </w:rPr>
+              <w:t xml:space="preserve">611 / 131 / 132 (70/15/15)</w:t>
+            </w:r>
+          </w:p>
+        </w:tc>
+      </w:tr>
+      <w:tr>
+        <w:tc>
+          <w:tcPr>
+            <w:tcW w:type="dxa" w:w="4300"/>
+            <w:shd w:fill="F8FAFC" w:val="clear"/>
+            <w:tcMar>
+              <w:top w:type="dxa" w:w="90"/>
+              <w:left w:type="dxa" w:w="100"/>
+              <w:bottom w:type="dxa" w:w="90"/>
+              <w:right w:type="dxa" w:w="100"/>
+            </w:tcMar>
+          </w:tcPr>
+          <w:p>
+            <w:pPr>
+              <w:spacing w:after="0" w:line="240"/>
+              <w:jc w:val="left"/>
+            </w:pPr>
+            <w:r>
+              <w:rPr>
+                <w:rFonts w:ascii="Aptos" w:cs="Aptos" w:eastAsia="Aptos" w:hAnsi="Aptos"/>
+                <w:b w:val="false"/>
+                <w:bCs w:val="false"/>
+                <w:i w:val="false"/>
+                <w:iCs w:val="false"/>
+                <w:sz w:val="19"/>
+                <w:szCs w:val="19"/>
+              </w:rPr>
+              <w:t xml:space="preserve">Sample rate nguồn</w:t>
+            </w:r>
+          </w:p>
+        </w:tc>
+        <w:tc>
+          <w:tcPr>
+            <w:tcW w:type="dxa" w:w="5000"/>
+            <w:shd w:fill="F8FAFC" w:val="clear"/>
+            <w:tcMar>
+              <w:top w:type="dxa" w:w="90"/>
+              <w:left w:type="dxa" w:w="100"/>
+              <w:bottom w:type="dxa" w:w="90"/>
+              <w:right w:type="dxa" w:w="100"/>
+            </w:tcMar>
+          </w:tcPr>
+          <w:p>
+            <w:pPr>
+              <w:spacing w:after="0" w:line="240"/>
+              <w:jc w:val="center"/>
+            </w:pPr>
+            <w:r>
+              <w:rPr>
+                <w:rFonts w:ascii="Aptos" w:cs="Aptos" w:eastAsia="Aptos" w:hAnsi="Aptos"/>
+                <w:b w:val="false"/>
+                <w:bCs w:val="false"/>
+                <w:i w:val="false"/>
+                <w:iCs w:val="false"/>
+                <w:sz w:val="19"/>
+                <w:szCs w:val="19"/>
+              </w:rPr>
+              <w:t xml:space="preserve">4 kHz (3.163/3.163)</w:t>
             </w:r>
           </w:p>
         </w:tc>
@@ -1592,7 +1731,7 @@
           <w:sz w:val="22"/>
           <w:szCs w:val="22"/>
         </w:rPr>
-        <w:t xml:space="preserve">Đây là toàn bộ public training release tải được, không phải toàn bộ 1.568 subjects của mô tả dataset ban đầu. Nhãn Unknown được giữ trong audit nhưng loại khỏi supervised learning; các đường ghi âm còn lại đều có sample rate 4 kHz và đọc được thành công.</w:t>
+        <w:t xml:space="preserve">Đây là toàn bộ public training release tải được, không phải toàn bộ 1.568 subjects của mô tả dataset ban đầu. Track chính giữ Unknown như một lớp hợp lệ để bám protocol challenge; track nhị phân loại 68 Unknown chỉ dùng cho ablation so sánh DSP với các thí nghiệm trước. Các đường ghi âm đều có sample rate 4 kHz và đọc được thành công.</w:t>
       </w:r>
     </w:p>
     <w:p>
@@ -1619,7 +1758,7 @@
           <w:sz w:val="22"/>
           <w:szCs w:val="22"/>
         </w:rPr>
-        <w:t xml:space="preserve">Sau khi loại Unknown khỏi supervised learning, 874 bệnh nhân có nhãn được chia stratified theo patient_id với seed 42: 611 train, 131 validation và 132 test. Các location AV/MV/PV/TV của cùng bệnh nhân không bao giờ bị tách sang partition khác.</w:t>
+        <w:t xml:space="preserve">Primary track chia stratified theo patient_id với seed 42 và giữ cả ba lớp: 612 train, 94 validation và 236 test. Secondary binary track loại Unknown và dùng 611/131/132. Các location AV/MV/PV/TV của cùng bệnh nhân không bao giờ bị tách sang partition khác.</w:t>
       </w:r>
     </w:p>
     <w:p>
@@ -2186,7 +2325,7 @@
           <w:sz w:val="22"/>
           <w:szCs w:val="22"/>
         </w:rPr>
-        <w:t xml:space="preserve">Matrix chính gồm 24 cấu hình: filter ∈ {none, Butterworth, FIR}, feature ∈ {PSD, MFCC, STFT, hybrid}, model ∈ {SVM, MLP}. Metric chính là macro-F1 vì hai lớp không cân bằng hoàn toàn; balanced accuracy, precision, recall và confusion matrix được lưu kèm.</w:t>
+        <w:t xml:space="preserve">Matrix primary gồm 24 cấu hình: filter ∈ {none, Butterworth, FIR}, feature ∈ {PSD, MFCC, STFT, hybrid}, model ∈ {SVM, MLP}. Protocol là 3-class challenge-aligned với target fs = 1 kHz, quantization = 16-bit, seed 42 và split 612/94/236. WAcc là metric chính; UAR, AUROC, AUPRC, Macro-F1 và confusion matrix được lưu kèm. Binary Macro-F1/Balanced Accuracy chỉ là track phụ.</w:t>
       </w:r>
     </w:p>
     <w:p>
@@ -2251,7 +2390,7 @@
           <w:sz w:val="19"/>
           <w:szCs w:val="19"/>
         </w:rPr>
-        <w:t xml:space="preserve">Hình 1. So sánh macro-F1 giữa các front-end DSP và classifier.</w:t>
+        <w:t xml:space="preserve">Hình 1. Pilot subset 100 patient; biểu đồ này chỉ minh họa DSP, không phải leaderboard primary.</w:t>
       </w:r>
     </w:p>
     <w:tbl>
@@ -3013,7 +3152,7 @@
           <w:sz w:val="19"/>
           <w:szCs w:val="19"/>
         </w:rPr>
-        <w:t xml:space="preserve">Bảng 3. Các cấu hình có macro-F1 cao nhất trong 24-run matrix.</w:t>
+        <w:t xml:space="preserve">Bảng 3. Pilot subset cũ; giữ để giải thích xu hướng, không dùng so sánh với public challenge track.</w:t>
       </w:r>
     </w:p>
     <w:p>
@@ -3030,7 +3169,7 @@
           <w:sz w:val="22"/>
           <w:szCs w:val="22"/>
         </w:rPr>
-        <w:t xml:space="preserve">Hybrid không luôn vượt PSD ở mọi classifier, nhưng SVM hybrid sau Butterworth/FIR đạt balanced accuracy và macro-F1 cao nhất. MLP có thể đạt kết quả khá với hybrid không lọc nhưng dao động lớn hơn giữa các front-end, phù hợp với nhận định rằng subset patient-level còn nhỏ.</w:t>
+        <w:t xml:space="preserve">Pilot subset 100 patient được tách khỏi primary track để tránh trộn protocol. Mọi kết luận leaderboard trong báo cáo đều lấy từ matrix 3-class full public cohort ở mục 4.2.</w:t>
       </w:r>
     </w:p>
     <w:p>
@@ -4187,7 +4326,7 @@
         <w:spacing w:after="120" w:before="260"/>
       </w:pPr>
       <w:r>
-        <w:t xml:space="preserve">4.2. Full-data matrix: model, filter và feature</w:t>
+        <w:t xml:space="preserve">4.2. Challenge-aligned full-data matrix: model, filter và feature</w:t>
       </w:r>
     </w:p>
     <w:p>
@@ -4204,12 +4343,12 @@
           <w:sz w:val="22"/>
           <w:szCs w:val="22"/>
         </w:rPr>
-        <w:t xml:space="preserve">Matrix đầy đủ giữ target fs = 1 kHz, quantization = 16-bit, seed 42 và patient-wise split; chỉ thay 3 loại filter × 4 nhóm feature × 2 classifier. Kết quả dưới đây là các cấu hình đứng đầu theo Macro-F1; toàn bộ 24 dòng được lưu trong artifacts/full_matrix_24/full_matrix.csv.</w:t>
+        <w:t xml:space="preserve">Primary matrix chạy đủ 24 cấu hình trên 942 patient, giữ target fs = 1 kHz, quantization = 16-bit, seed 42 và split 612/94/236. Bảng xếp theo Weighted Accuracy, metric chính của challenge; tất cả các dòng được lưu trong artifacts/challenge_matrix_3class/full_matrix_3class.csv.</w:t>
       </w:r>
     </w:p>
     <w:tbl>
       <w:tblPr>
-        <w:tblW w:type="dxa" w:w="9400"/>
+        <w:tblW w:type="dxa" w:w="8000"/>
         <w:tblBorders>
           <w:top w:val="single" w:color="CBD5E1" w:sz="4"/>
           <w:left w:val="single" w:color="auto" w:sz="4"/>
@@ -4220,17 +4359,19 @@
         </w:tblBorders>
       </w:tblPr>
       <w:tblGrid>
-        <w:gridCol w:w="1500"/>
-        <w:gridCol w:w="1700"/>
-        <w:gridCol w:w="1900"/>
-        <w:gridCol w:w="1300"/>
-        <w:gridCol w:w="1700"/>
-        <w:gridCol w:w="1300"/>
+        <w:gridCol w:w="1000"/>
+        <w:gridCol w:w="1400"/>
+        <w:gridCol w:w="1000"/>
+        <w:gridCol w:w="800"/>
+        <w:gridCol w:w="800"/>
+        <w:gridCol w:w="1000"/>
+        <w:gridCol w:w="1000"/>
+        <w:gridCol w:w="1000"/>
       </w:tblGrid>
       <w:tr>
         <w:tc>
           <w:tcPr>
-            <w:tcW w:type="dxa" w:w="1500"/>
+            <w:tcW w:type="dxa" w:w="1000"/>
             <w:shd w:fill="17324D" w:val="clear"/>
             <w:tcMar>
               <w:top w:type="dxa" w:w="90"/>
@@ -4261,7 +4402,7 @@
         </w:tc>
         <w:tc>
           <w:tcPr>
-            <w:tcW w:type="dxa" w:w="1700"/>
+            <w:tcW w:type="dxa" w:w="1400"/>
             <w:shd w:fill="17324D" w:val="clear"/>
             <w:tcMar>
               <w:top w:type="dxa" w:w="90"/>
@@ -4292,7 +4433,7 @@
         </w:tc>
         <w:tc>
           <w:tcPr>
-            <w:tcW w:type="dxa" w:w="1900"/>
+            <w:tcW w:type="dxa" w:w="1000"/>
             <w:shd w:fill="17324D" w:val="clear"/>
             <w:tcMar>
               <w:top w:type="dxa" w:w="90"/>
@@ -4317,13 +4458,13 @@
                 <w:sz w:val="19"/>
                 <w:szCs w:val="19"/>
               </w:rPr>
-              <w:t xml:space="preserve">Feature</w:t>
-            </w:r>
-          </w:p>
-        </w:tc>
-        <w:tc>
-          <w:tcPr>
-            <w:tcW w:type="dxa" w:w="1300"/>
+              <w:t xml:space="preserve">Feat.</w:t>
+            </w:r>
+          </w:p>
+        </w:tc>
+        <w:tc>
+          <w:tcPr>
+            <w:tcW w:type="dxa" w:w="800"/>
             <w:shd w:fill="17324D" w:val="clear"/>
             <w:tcMar>
               <w:top w:type="dxa" w:w="90"/>
@@ -4348,13 +4489,13 @@
                 <w:sz w:val="19"/>
                 <w:szCs w:val="19"/>
               </w:rPr>
-              <w:t xml:space="preserve">Accuracy</w:t>
-            </w:r>
-          </w:p>
-        </w:tc>
-        <w:tc>
-          <w:tcPr>
-            <w:tcW w:type="dxa" w:w="1700"/>
+              <w:t xml:space="preserve">WAcc</w:t>
+            </w:r>
+          </w:p>
+        </w:tc>
+        <w:tc>
+          <w:tcPr>
+            <w:tcW w:type="dxa" w:w="800"/>
             <w:shd w:fill="17324D" w:val="clear"/>
             <w:tcMar>
               <w:top w:type="dxa" w:w="90"/>
@@ -4379,13 +4520,13 @@
                 <w:sz w:val="19"/>
                 <w:szCs w:val="19"/>
               </w:rPr>
-              <w:t xml:space="preserve">Balanced acc.</w:t>
-            </w:r>
-          </w:p>
-        </w:tc>
-        <w:tc>
-          <w:tcPr>
-            <w:tcW w:type="dxa" w:w="1300"/>
+              <w:t xml:space="preserve">UAR</w:t>
+            </w:r>
+          </w:p>
+        </w:tc>
+        <w:tc>
+          <w:tcPr>
+            <w:tcW w:type="dxa" w:w="1000"/>
             <w:shd w:fill="17324D" w:val="clear"/>
             <w:tcMar>
               <w:top w:type="dxa" w:w="90"/>
@@ -4410,7 +4551,69 @@
                 <w:sz w:val="19"/>
                 <w:szCs w:val="19"/>
               </w:rPr>
-              <w:t xml:space="preserve">Macro-F1</w:t>
+              <w:t xml:space="preserve">AUROC</w:t>
+            </w:r>
+          </w:p>
+        </w:tc>
+        <w:tc>
+          <w:tcPr>
+            <w:tcW w:type="dxa" w:w="1000"/>
+            <w:shd w:fill="17324D" w:val="clear"/>
+            <w:tcMar>
+              <w:top w:type="dxa" w:w="90"/>
+              <w:left w:type="dxa" w:w="100"/>
+              <w:bottom w:type="dxa" w:w="90"/>
+              <w:right w:type="dxa" w:w="100"/>
+            </w:tcMar>
+          </w:tcPr>
+          <w:p>
+            <w:pPr>
+              <w:spacing w:after="0" w:line="240"/>
+              <w:jc w:val="center"/>
+            </w:pPr>
+            <w:r>
+              <w:rPr>
+                <w:rFonts w:ascii="Aptos" w:cs="Aptos" w:eastAsia="Aptos" w:hAnsi="Aptos"/>
+                <w:b/>
+                <w:bCs/>
+                <w:i w:val="false"/>
+                <w:iCs w:val="false"/>
+                <w:color w:val="FFFFFF"/>
+                <w:sz w:val="19"/>
+                <w:szCs w:val="19"/>
+              </w:rPr>
+              <w:t xml:space="preserve">AUPRC</w:t>
+            </w:r>
+          </w:p>
+        </w:tc>
+        <w:tc>
+          <w:tcPr>
+            <w:tcW w:type="dxa" w:w="1000"/>
+            <w:shd w:fill="17324D" w:val="clear"/>
+            <w:tcMar>
+              <w:top w:type="dxa" w:w="90"/>
+              <w:left w:type="dxa" w:w="100"/>
+              <w:bottom w:type="dxa" w:w="90"/>
+              <w:right w:type="dxa" w:w="100"/>
+            </w:tcMar>
+          </w:tcPr>
+          <w:p>
+            <w:pPr>
+              <w:spacing w:after="0" w:line="240"/>
+              <w:jc w:val="center"/>
+            </w:pPr>
+            <w:r>
+              <w:rPr>
+                <w:rFonts w:ascii="Aptos" w:cs="Aptos" w:eastAsia="Aptos" w:hAnsi="Aptos"/>
+                <w:b/>
+                <w:bCs/>
+                <w:i w:val="false"/>
+                <w:iCs w:val="false"/>
+                <w:color w:val="FFFFFF"/>
+                <w:sz w:val="19"/>
+                <w:szCs w:val="19"/>
+              </w:rPr>
+              <w:t xml:space="preserve">F1</w:t>
             </w:r>
           </w:p>
         </w:tc>
@@ -4418,7 +4621,7 @@
       <w:tr>
         <w:tc>
           <w:tcPr>
-            <w:tcW w:type="dxa" w:w="1500"/>
+            <w:tcW w:type="dxa" w:w="1000"/>
             <w:tcMar>
               <w:top w:type="dxa" w:w="90"/>
               <w:left w:type="dxa" w:w="100"/>
@@ -4441,13 +4644,13 @@
                 <w:sz w:val="19"/>
                 <w:szCs w:val="19"/>
               </w:rPr>
-              <w:t xml:space="preserve">MLP</w:t>
-            </w:r>
-          </w:p>
-        </w:tc>
-        <w:tc>
-          <w:tcPr>
-            <w:tcW w:type="dxa" w:w="1700"/>
+              <w:t xml:space="preserve">SVM</w:t>
+            </w:r>
+          </w:p>
+        </w:tc>
+        <w:tc>
+          <w:tcPr>
+            <w:tcW w:type="dxa" w:w="1400"/>
             <w:tcMar>
               <w:top w:type="dxa" w:w="90"/>
               <w:left w:type="dxa" w:w="100"/>
@@ -4476,117 +4679,175 @@
         </w:tc>
         <w:tc>
           <w:tcPr>
-            <w:tcW w:type="dxa" w:w="1900"/>
-            <w:tcMar>
-              <w:top w:type="dxa" w:w="90"/>
-              <w:left w:type="dxa" w:w="100"/>
-              <w:bottom w:type="dxa" w:w="90"/>
-              <w:right w:type="dxa" w:w="100"/>
-            </w:tcMar>
-          </w:tcPr>
-          <w:p>
-            <w:pPr>
-              <w:spacing w:after="0" w:line="240"/>
-              <w:jc w:val="center"/>
-            </w:pPr>
-            <w:r>
-              <w:rPr>
-                <w:rFonts w:ascii="Aptos" w:cs="Aptos" w:eastAsia="Aptos" w:hAnsi="Aptos"/>
-                <w:b w:val="false"/>
-                <w:bCs w:val="false"/>
-                <w:i w:val="false"/>
-                <w:iCs w:val="false"/>
-                <w:sz w:val="19"/>
-                <w:szCs w:val="19"/>
-              </w:rPr>
-              <w:t xml:space="preserve">MFCC</w:t>
-            </w:r>
-          </w:p>
-        </w:tc>
-        <w:tc>
-          <w:tcPr>
-            <w:tcW w:type="dxa" w:w="1300"/>
-            <w:tcMar>
-              <w:top w:type="dxa" w:w="90"/>
-              <w:left w:type="dxa" w:w="100"/>
-              <w:bottom w:type="dxa" w:w="90"/>
-              <w:right w:type="dxa" w:w="100"/>
-            </w:tcMar>
-          </w:tcPr>
-          <w:p>
-            <w:pPr>
-              <w:spacing w:after="0" w:line="240"/>
-              <w:jc w:val="center"/>
-            </w:pPr>
-            <w:r>
-              <w:rPr>
-                <w:rFonts w:ascii="Aptos" w:cs="Aptos" w:eastAsia="Aptos" w:hAnsi="Aptos"/>
-                <w:b w:val="false"/>
-                <w:bCs w:val="false"/>
-                <w:i w:val="false"/>
-                <w:iCs w:val="false"/>
-                <w:sz w:val="19"/>
-                <w:szCs w:val="19"/>
-              </w:rPr>
-              <w:t xml:space="preserve">0,848</w:t>
-            </w:r>
-          </w:p>
-        </w:tc>
-        <w:tc>
-          <w:tcPr>
-            <w:tcW w:type="dxa" w:w="1700"/>
-            <w:tcMar>
-              <w:top w:type="dxa" w:w="90"/>
-              <w:left w:type="dxa" w:w="100"/>
-              <w:bottom w:type="dxa" w:w="90"/>
-              <w:right w:type="dxa" w:w="100"/>
-            </w:tcMar>
-          </w:tcPr>
-          <w:p>
-            <w:pPr>
-              <w:spacing w:after="0" w:line="240"/>
-              <w:jc w:val="center"/>
-            </w:pPr>
-            <w:r>
-              <w:rPr>
-                <w:rFonts w:ascii="Aptos" w:cs="Aptos" w:eastAsia="Aptos" w:hAnsi="Aptos"/>
-                <w:b w:val="false"/>
-                <w:bCs w:val="false"/>
-                <w:i w:val="false"/>
-                <w:iCs w:val="false"/>
-                <w:sz w:val="19"/>
-                <w:szCs w:val="19"/>
-              </w:rPr>
-              <w:t xml:space="preserve">0,657</w:t>
-            </w:r>
-          </w:p>
-        </w:tc>
-        <w:tc>
-          <w:tcPr>
-            <w:tcW w:type="dxa" w:w="1300"/>
-            <w:tcMar>
-              <w:top w:type="dxa" w:w="90"/>
-              <w:left w:type="dxa" w:w="100"/>
-              <w:bottom w:type="dxa" w:w="90"/>
-              <w:right w:type="dxa" w:w="100"/>
-            </w:tcMar>
-          </w:tcPr>
-          <w:p>
-            <w:pPr>
-              <w:spacing w:after="0" w:line="240"/>
-              <w:jc w:val="center"/>
-            </w:pPr>
-            <w:r>
-              <w:rPr>
-                <w:rFonts w:ascii="Aptos" w:cs="Aptos" w:eastAsia="Aptos" w:hAnsi="Aptos"/>
-                <w:b w:val="false"/>
-                <w:bCs w:val="false"/>
-                <w:i w:val="false"/>
-                <w:iCs w:val="false"/>
-                <w:sz w:val="19"/>
-                <w:szCs w:val="19"/>
-              </w:rPr>
-              <w:t xml:space="preserve">0,693</w:t>
+            <w:tcW w:type="dxa" w:w="1000"/>
+            <w:tcMar>
+              <w:top w:type="dxa" w:w="90"/>
+              <w:left w:type="dxa" w:w="100"/>
+              <w:bottom w:type="dxa" w:w="90"/>
+              <w:right w:type="dxa" w:w="100"/>
+            </w:tcMar>
+          </w:tcPr>
+          <w:p>
+            <w:pPr>
+              <w:spacing w:after="0" w:line="240"/>
+              <w:jc w:val="center"/>
+            </w:pPr>
+            <w:r>
+              <w:rPr>
+                <w:rFonts w:ascii="Aptos" w:cs="Aptos" w:eastAsia="Aptos" w:hAnsi="Aptos"/>
+                <w:b w:val="false"/>
+                <w:bCs w:val="false"/>
+                <w:i w:val="false"/>
+                <w:iCs w:val="false"/>
+                <w:sz w:val="19"/>
+                <w:szCs w:val="19"/>
+              </w:rPr>
+              <w:t xml:space="preserve">Hybrid</w:t>
+            </w:r>
+          </w:p>
+        </w:tc>
+        <w:tc>
+          <w:tcPr>
+            <w:tcW w:type="dxa" w:w="800"/>
+            <w:tcMar>
+              <w:top w:type="dxa" w:w="90"/>
+              <w:left w:type="dxa" w:w="100"/>
+              <w:bottom w:type="dxa" w:w="90"/>
+              <w:right w:type="dxa" w:w="100"/>
+            </w:tcMar>
+          </w:tcPr>
+          <w:p>
+            <w:pPr>
+              <w:spacing w:after="0" w:line="240"/>
+              <w:jc w:val="center"/>
+            </w:pPr>
+            <w:r>
+              <w:rPr>
+                <w:rFonts w:ascii="Aptos" w:cs="Aptos" w:eastAsia="Aptos" w:hAnsi="Aptos"/>
+                <w:b w:val="false"/>
+                <w:bCs w:val="false"/>
+                <w:i w:val="false"/>
+                <w:iCs w:val="false"/>
+                <w:sz w:val="19"/>
+                <w:szCs w:val="19"/>
+              </w:rPr>
+              <w:t xml:space="preserve">0,644</w:t>
+            </w:r>
+          </w:p>
+        </w:tc>
+        <w:tc>
+          <w:tcPr>
+            <w:tcW w:type="dxa" w:w="800"/>
+            <w:tcMar>
+              <w:top w:type="dxa" w:w="90"/>
+              <w:left w:type="dxa" w:w="100"/>
+              <w:bottom w:type="dxa" w:w="90"/>
+              <w:right w:type="dxa" w:w="100"/>
+            </w:tcMar>
+          </w:tcPr>
+          <w:p>
+            <w:pPr>
+              <w:spacing w:after="0" w:line="240"/>
+              <w:jc w:val="center"/>
+            </w:pPr>
+            <w:r>
+              <w:rPr>
+                <w:rFonts w:ascii="Aptos" w:cs="Aptos" w:eastAsia="Aptos" w:hAnsi="Aptos"/>
+                <w:b w:val="false"/>
+                <w:bCs w:val="false"/>
+                <w:i w:val="false"/>
+                <w:iCs w:val="false"/>
+                <w:sz w:val="19"/>
+                <w:szCs w:val="19"/>
+              </w:rPr>
+              <w:t xml:space="preserve">0,596</w:t>
+            </w:r>
+          </w:p>
+        </w:tc>
+        <w:tc>
+          <w:tcPr>
+            <w:tcW w:type="dxa" w:w="1000"/>
+            <w:tcMar>
+              <w:top w:type="dxa" w:w="90"/>
+              <w:left w:type="dxa" w:w="100"/>
+              <w:bottom w:type="dxa" w:w="90"/>
+              <w:right w:type="dxa" w:w="100"/>
+            </w:tcMar>
+          </w:tcPr>
+          <w:p>
+            <w:pPr>
+              <w:spacing w:after="0" w:line="240"/>
+              <w:jc w:val="center"/>
+            </w:pPr>
+            <w:r>
+              <w:rPr>
+                <w:rFonts w:ascii="Aptos" w:cs="Aptos" w:eastAsia="Aptos" w:hAnsi="Aptos"/>
+                <w:b w:val="false"/>
+                <w:bCs w:val="false"/>
+                <w:i w:val="false"/>
+                <w:iCs w:val="false"/>
+                <w:sz w:val="19"/>
+                <w:szCs w:val="19"/>
+              </w:rPr>
+              <w:t xml:space="preserve">0,775</w:t>
+            </w:r>
+          </w:p>
+        </w:tc>
+        <w:tc>
+          <w:tcPr>
+            <w:tcW w:type="dxa" w:w="1000"/>
+            <w:tcMar>
+              <w:top w:type="dxa" w:w="90"/>
+              <w:left w:type="dxa" w:w="100"/>
+              <w:bottom w:type="dxa" w:w="90"/>
+              <w:right w:type="dxa" w:w="100"/>
+            </w:tcMar>
+          </w:tcPr>
+          <w:p>
+            <w:pPr>
+              <w:spacing w:after="0" w:line="240"/>
+              <w:jc w:val="center"/>
+            </w:pPr>
+            <w:r>
+              <w:rPr>
+                <w:rFonts w:ascii="Aptos" w:cs="Aptos" w:eastAsia="Aptos" w:hAnsi="Aptos"/>
+                <w:b w:val="false"/>
+                <w:bCs w:val="false"/>
+                <w:i w:val="false"/>
+                <w:iCs w:val="false"/>
+                <w:sz w:val="19"/>
+                <w:szCs w:val="19"/>
+              </w:rPr>
+              <w:t xml:space="preserve">0,587</w:t>
+            </w:r>
+          </w:p>
+        </w:tc>
+        <w:tc>
+          <w:tcPr>
+            <w:tcW w:type="dxa" w:w="1000"/>
+            <w:tcMar>
+              <w:top w:type="dxa" w:w="90"/>
+              <w:left w:type="dxa" w:w="100"/>
+              <w:bottom w:type="dxa" w:w="90"/>
+              <w:right w:type="dxa" w:w="100"/>
+            </w:tcMar>
+          </w:tcPr>
+          <w:p>
+            <w:pPr>
+              <w:spacing w:after="0" w:line="240"/>
+              <w:jc w:val="center"/>
+            </w:pPr>
+            <w:r>
+              <w:rPr>
+                <w:rFonts w:ascii="Aptos" w:cs="Aptos" w:eastAsia="Aptos" w:hAnsi="Aptos"/>
+                <w:b w:val="false"/>
+                <w:bCs w:val="false"/>
+                <w:i w:val="false"/>
+                <w:iCs w:val="false"/>
+                <w:sz w:val="19"/>
+                <w:szCs w:val="19"/>
+              </w:rPr>
+              <w:t xml:space="preserve">0,597</w:t>
             </w:r>
           </w:p>
         </w:tc>
@@ -4594,7 +4855,7 @@
       <w:tr>
         <w:tc>
           <w:tcPr>
-            <w:tcW w:type="dxa" w:w="1500"/>
+            <w:tcW w:type="dxa" w:w="1000"/>
             <w:shd w:fill="F8FAFC" w:val="clear"/>
             <w:tcMar>
               <w:top w:type="dxa" w:w="90"/>
@@ -4618,13 +4879,13 @@
                 <w:sz w:val="19"/>
                 <w:szCs w:val="19"/>
               </w:rPr>
-              <w:t xml:space="preserve">MLP</w:t>
-            </w:r>
-          </w:p>
-        </w:tc>
-        <w:tc>
-          <w:tcPr>
-            <w:tcW w:type="dxa" w:w="1700"/>
+              <w:t xml:space="preserve">SVM</w:t>
+            </w:r>
+          </w:p>
+        </w:tc>
+        <w:tc>
+          <w:tcPr>
+            <w:tcW w:type="dxa" w:w="1400"/>
             <w:shd w:fill="F8FAFC" w:val="clear"/>
             <w:tcMar>
               <w:top w:type="dxa" w:w="90"/>
@@ -4654,7 +4915,7 @@
         </w:tc>
         <w:tc>
           <w:tcPr>
-            <w:tcW w:type="dxa" w:w="1900"/>
+            <w:tcW w:type="dxa" w:w="1000"/>
             <w:shd w:fill="F8FAFC" w:val="clear"/>
             <w:tcMar>
               <w:top w:type="dxa" w:w="90"/>
@@ -4678,13 +4939,13 @@
                 <w:sz w:val="19"/>
                 <w:szCs w:val="19"/>
               </w:rPr>
-              <w:t xml:space="preserve">Hybrid</w:t>
-            </w:r>
-          </w:p>
-        </w:tc>
-        <w:tc>
-          <w:tcPr>
-            <w:tcW w:type="dxa" w:w="1300"/>
+              <w:t xml:space="preserve">MFCC</w:t>
+            </w:r>
+          </w:p>
+        </w:tc>
+        <w:tc>
+          <w:tcPr>
+            <w:tcW w:type="dxa" w:w="800"/>
             <w:shd w:fill="F8FAFC" w:val="clear"/>
             <w:tcMar>
               <w:top w:type="dxa" w:w="90"/>
@@ -4708,13 +4969,13 @@
                 <w:sz w:val="19"/>
                 <w:szCs w:val="19"/>
               </w:rPr>
-              <w:t xml:space="preserve">0,841</w:t>
-            </w:r>
-          </w:p>
-        </w:tc>
-        <w:tc>
-          <w:tcPr>
-            <w:tcW w:type="dxa" w:w="1700"/>
+              <w:t xml:space="preserve">0,629</w:t>
+            </w:r>
+          </w:p>
+        </w:tc>
+        <w:tc>
+          <w:tcPr>
+            <w:tcW w:type="dxa" w:w="800"/>
             <w:shd w:fill="F8FAFC" w:val="clear"/>
             <w:tcMar>
               <w:top w:type="dxa" w:w="90"/>
@@ -4738,13 +4999,13 @@
                 <w:sz w:val="19"/>
                 <w:szCs w:val="19"/>
               </w:rPr>
-              <w:t xml:space="preserve">0,625</w:t>
-            </w:r>
-          </w:p>
-        </w:tc>
-        <w:tc>
-          <w:tcPr>
-            <w:tcW w:type="dxa" w:w="1300"/>
+              <w:t xml:space="preserve">0,571</w:t>
+            </w:r>
+          </w:p>
+        </w:tc>
+        <w:tc>
+          <w:tcPr>
+            <w:tcW w:type="dxa" w:w="1000"/>
             <w:shd w:fill="F8FAFC" w:val="clear"/>
             <w:tcMar>
               <w:top w:type="dxa" w:w="90"/>
@@ -4768,7 +5029,67 @@
                 <w:sz w:val="19"/>
                 <w:szCs w:val="19"/>
               </w:rPr>
-              <w:t xml:space="preserve">0,654</w:t>
+              <w:t xml:space="preserve">0,776</w:t>
+            </w:r>
+          </w:p>
+        </w:tc>
+        <w:tc>
+          <w:tcPr>
+            <w:tcW w:type="dxa" w:w="1000"/>
+            <w:shd w:fill="F8FAFC" w:val="clear"/>
+            <w:tcMar>
+              <w:top w:type="dxa" w:w="90"/>
+              <w:left w:type="dxa" w:w="100"/>
+              <w:bottom w:type="dxa" w:w="90"/>
+              <w:right w:type="dxa" w:w="100"/>
+            </w:tcMar>
+          </w:tcPr>
+          <w:p>
+            <w:pPr>
+              <w:spacing w:after="0" w:line="240"/>
+              <w:jc w:val="center"/>
+            </w:pPr>
+            <w:r>
+              <w:rPr>
+                <w:rFonts w:ascii="Aptos" w:cs="Aptos" w:eastAsia="Aptos" w:hAnsi="Aptos"/>
+                <w:b w:val="false"/>
+                <w:bCs w:val="false"/>
+                <w:i w:val="false"/>
+                <w:iCs w:val="false"/>
+                <w:sz w:val="19"/>
+                <w:szCs w:val="19"/>
+              </w:rPr>
+              <w:t xml:space="preserve">0,579</w:t>
+            </w:r>
+          </w:p>
+        </w:tc>
+        <w:tc>
+          <w:tcPr>
+            <w:tcW w:type="dxa" w:w="1000"/>
+            <w:shd w:fill="F8FAFC" w:val="clear"/>
+            <w:tcMar>
+              <w:top w:type="dxa" w:w="90"/>
+              <w:left w:type="dxa" w:w="100"/>
+              <w:bottom w:type="dxa" w:w="90"/>
+              <w:right w:type="dxa" w:w="100"/>
+            </w:tcMar>
+          </w:tcPr>
+          <w:p>
+            <w:pPr>
+              <w:spacing w:after="0" w:line="240"/>
+              <w:jc w:val="center"/>
+            </w:pPr>
+            <w:r>
+              <w:rPr>
+                <w:rFonts w:ascii="Aptos" w:cs="Aptos" w:eastAsia="Aptos" w:hAnsi="Aptos"/>
+                <w:b w:val="false"/>
+                <w:bCs w:val="false"/>
+                <w:i w:val="false"/>
+                <w:iCs w:val="false"/>
+                <w:sz w:val="19"/>
+                <w:szCs w:val="19"/>
+              </w:rPr>
+              <w:t xml:space="preserve">0,578</w:t>
             </w:r>
           </w:p>
         </w:tc>
@@ -4776,7 +5097,7 @@
       <w:tr>
         <w:tc>
           <w:tcPr>
-            <w:tcW w:type="dxa" w:w="1500"/>
+            <w:tcW w:type="dxa" w:w="1000"/>
             <w:tcMar>
               <w:top w:type="dxa" w:w="90"/>
               <w:left w:type="dxa" w:w="100"/>
@@ -4805,36 +5126,36 @@
         </w:tc>
         <w:tc>
           <w:tcPr>
-            <w:tcW w:type="dxa" w:w="1700"/>
-            <w:tcMar>
-              <w:top w:type="dxa" w:w="90"/>
-              <w:left w:type="dxa" w:w="100"/>
-              <w:bottom w:type="dxa" w:w="90"/>
-              <w:right w:type="dxa" w:w="100"/>
-            </w:tcMar>
-          </w:tcPr>
-          <w:p>
-            <w:pPr>
-              <w:spacing w:after="0" w:line="240"/>
-              <w:jc w:val="center"/>
-            </w:pPr>
-            <w:r>
-              <w:rPr>
-                <w:rFonts w:ascii="Aptos" w:cs="Aptos" w:eastAsia="Aptos" w:hAnsi="Aptos"/>
-                <w:b w:val="false"/>
-                <w:bCs w:val="false"/>
-                <w:i w:val="false"/>
-                <w:iCs w:val="false"/>
-                <w:sz w:val="19"/>
-                <w:szCs w:val="19"/>
-              </w:rPr>
-              <w:t xml:space="preserve">None</w:t>
-            </w:r>
-          </w:p>
-        </w:tc>
-        <w:tc>
-          <w:tcPr>
-            <w:tcW w:type="dxa" w:w="1900"/>
+            <w:tcW w:type="dxa" w:w="1400"/>
+            <w:tcMar>
+              <w:top w:type="dxa" w:w="90"/>
+              <w:left w:type="dxa" w:w="100"/>
+              <w:bottom w:type="dxa" w:w="90"/>
+              <w:right w:type="dxa" w:w="100"/>
+            </w:tcMar>
+          </w:tcPr>
+          <w:p>
+            <w:pPr>
+              <w:spacing w:after="0" w:line="240"/>
+              <w:jc w:val="center"/>
+            </w:pPr>
+            <w:r>
+              <w:rPr>
+                <w:rFonts w:ascii="Aptos" w:cs="Aptos" w:eastAsia="Aptos" w:hAnsi="Aptos"/>
+                <w:b w:val="false"/>
+                <w:bCs w:val="false"/>
+                <w:i w:val="false"/>
+                <w:iCs w:val="false"/>
+                <w:sz w:val="19"/>
+                <w:szCs w:val="19"/>
+              </w:rPr>
+              <w:t xml:space="preserve">Butterworth</w:t>
+            </w:r>
+          </w:p>
+        </w:tc>
+        <w:tc>
+          <w:tcPr>
+            <w:tcW w:type="dxa" w:w="1000"/>
             <w:tcMar>
               <w:top w:type="dxa" w:w="90"/>
               <w:left w:type="dxa" w:w="100"/>
@@ -4863,88 +5184,146 @@
         </w:tc>
         <w:tc>
           <w:tcPr>
-            <w:tcW w:type="dxa" w:w="1300"/>
-            <w:tcMar>
-              <w:top w:type="dxa" w:w="90"/>
-              <w:left w:type="dxa" w:w="100"/>
-              <w:bottom w:type="dxa" w:w="90"/>
-              <w:right w:type="dxa" w:w="100"/>
-            </w:tcMar>
-          </w:tcPr>
-          <w:p>
-            <w:pPr>
-              <w:spacing w:after="0" w:line="240"/>
-              <w:jc w:val="center"/>
-            </w:pPr>
-            <w:r>
-              <w:rPr>
-                <w:rFonts w:ascii="Aptos" w:cs="Aptos" w:eastAsia="Aptos" w:hAnsi="Aptos"/>
-                <w:b w:val="false"/>
-                <w:bCs w:val="false"/>
-                <w:i w:val="false"/>
-                <w:iCs w:val="false"/>
-                <w:sz w:val="19"/>
-                <w:szCs w:val="19"/>
-              </w:rPr>
-              <w:t xml:space="preserve">0,750</w:t>
-            </w:r>
-          </w:p>
-        </w:tc>
-        <w:tc>
-          <w:tcPr>
-            <w:tcW w:type="dxa" w:w="1700"/>
-            <w:tcMar>
-              <w:top w:type="dxa" w:w="90"/>
-              <w:left w:type="dxa" w:w="100"/>
-              <w:bottom w:type="dxa" w:w="90"/>
-              <w:right w:type="dxa" w:w="100"/>
-            </w:tcMar>
-          </w:tcPr>
-          <w:p>
-            <w:pPr>
-              <w:spacing w:after="0" w:line="240"/>
-              <w:jc w:val="center"/>
-            </w:pPr>
-            <w:r>
-              <w:rPr>
-                <w:rFonts w:ascii="Aptos" w:cs="Aptos" w:eastAsia="Aptos" w:hAnsi="Aptos"/>
-                <w:b w:val="false"/>
-                <w:bCs w:val="false"/>
-                <w:i w:val="false"/>
-                <w:iCs w:val="false"/>
-                <w:sz w:val="19"/>
-                <w:szCs w:val="19"/>
-              </w:rPr>
-              <w:t xml:space="preserve">0,664</w:t>
-            </w:r>
-          </w:p>
-        </w:tc>
-        <w:tc>
-          <w:tcPr>
-            <w:tcW w:type="dxa" w:w="1300"/>
-            <w:tcMar>
-              <w:top w:type="dxa" w:w="90"/>
-              <w:left w:type="dxa" w:w="100"/>
-              <w:bottom w:type="dxa" w:w="90"/>
-              <w:right w:type="dxa" w:w="100"/>
-            </w:tcMar>
-          </w:tcPr>
-          <w:p>
-            <w:pPr>
-              <w:spacing w:after="0" w:line="240"/>
-              <w:jc w:val="center"/>
-            </w:pPr>
-            <w:r>
-              <w:rPr>
-                <w:rFonts w:ascii="Aptos" w:cs="Aptos" w:eastAsia="Aptos" w:hAnsi="Aptos"/>
-                <w:b w:val="false"/>
-                <w:bCs w:val="false"/>
-                <w:i w:val="false"/>
-                <w:iCs w:val="false"/>
-                <w:sz w:val="19"/>
-                <w:szCs w:val="19"/>
-              </w:rPr>
-              <w:t xml:space="preserve">0,648</w:t>
+            <w:tcW w:type="dxa" w:w="800"/>
+            <w:tcMar>
+              <w:top w:type="dxa" w:w="90"/>
+              <w:left w:type="dxa" w:w="100"/>
+              <w:bottom w:type="dxa" w:w="90"/>
+              <w:right w:type="dxa" w:w="100"/>
+            </w:tcMar>
+          </w:tcPr>
+          <w:p>
+            <w:pPr>
+              <w:spacing w:after="0" w:line="240"/>
+              <w:jc w:val="center"/>
+            </w:pPr>
+            <w:r>
+              <w:rPr>
+                <w:rFonts w:ascii="Aptos" w:cs="Aptos" w:eastAsia="Aptos" w:hAnsi="Aptos"/>
+                <w:b w:val="false"/>
+                <w:bCs w:val="false"/>
+                <w:i w:val="false"/>
+                <w:iCs w:val="false"/>
+                <w:sz w:val="19"/>
+                <w:szCs w:val="19"/>
+              </w:rPr>
+              <w:t xml:space="preserve">0,622</w:t>
+            </w:r>
+          </w:p>
+        </w:tc>
+        <w:tc>
+          <w:tcPr>
+            <w:tcW w:type="dxa" w:w="800"/>
+            <w:tcMar>
+              <w:top w:type="dxa" w:w="90"/>
+              <w:left w:type="dxa" w:w="100"/>
+              <w:bottom w:type="dxa" w:w="90"/>
+              <w:right w:type="dxa" w:w="100"/>
+            </w:tcMar>
+          </w:tcPr>
+          <w:p>
+            <w:pPr>
+              <w:spacing w:after="0" w:line="240"/>
+              <w:jc w:val="center"/>
+            </w:pPr>
+            <w:r>
+              <w:rPr>
+                <w:rFonts w:ascii="Aptos" w:cs="Aptos" w:eastAsia="Aptos" w:hAnsi="Aptos"/>
+                <w:b w:val="false"/>
+                <w:bCs w:val="false"/>
+                <w:i w:val="false"/>
+                <w:iCs w:val="false"/>
+                <w:sz w:val="19"/>
+                <w:szCs w:val="19"/>
+              </w:rPr>
+              <w:t xml:space="preserve">0,597</w:t>
+            </w:r>
+          </w:p>
+        </w:tc>
+        <w:tc>
+          <w:tcPr>
+            <w:tcW w:type="dxa" w:w="1000"/>
+            <w:tcMar>
+              <w:top w:type="dxa" w:w="90"/>
+              <w:left w:type="dxa" w:w="100"/>
+              <w:bottom w:type="dxa" w:w="90"/>
+              <w:right w:type="dxa" w:w="100"/>
+            </w:tcMar>
+          </w:tcPr>
+          <w:p>
+            <w:pPr>
+              <w:spacing w:after="0" w:line="240"/>
+              <w:jc w:val="center"/>
+            </w:pPr>
+            <w:r>
+              <w:rPr>
+                <w:rFonts w:ascii="Aptos" w:cs="Aptos" w:eastAsia="Aptos" w:hAnsi="Aptos"/>
+                <w:b w:val="false"/>
+                <w:bCs w:val="false"/>
+                <w:i w:val="false"/>
+                <w:iCs w:val="false"/>
+                <w:sz w:val="19"/>
+                <w:szCs w:val="19"/>
+              </w:rPr>
+              <w:t xml:space="preserve">0,791</w:t>
+            </w:r>
+          </w:p>
+        </w:tc>
+        <w:tc>
+          <w:tcPr>
+            <w:tcW w:type="dxa" w:w="1000"/>
+            <w:tcMar>
+              <w:top w:type="dxa" w:w="90"/>
+              <w:left w:type="dxa" w:w="100"/>
+              <w:bottom w:type="dxa" w:w="90"/>
+              <w:right w:type="dxa" w:w="100"/>
+            </w:tcMar>
+          </w:tcPr>
+          <w:p>
+            <w:pPr>
+              <w:spacing w:after="0" w:line="240"/>
+              <w:jc w:val="center"/>
+            </w:pPr>
+            <w:r>
+              <w:rPr>
+                <w:rFonts w:ascii="Aptos" w:cs="Aptos" w:eastAsia="Aptos" w:hAnsi="Aptos"/>
+                <w:b w:val="false"/>
+                <w:bCs w:val="false"/>
+                <w:i w:val="false"/>
+                <w:iCs w:val="false"/>
+                <w:sz w:val="19"/>
+                <w:szCs w:val="19"/>
+              </w:rPr>
+              <w:t xml:space="preserve">0,585</w:t>
+            </w:r>
+          </w:p>
+        </w:tc>
+        <w:tc>
+          <w:tcPr>
+            <w:tcW w:type="dxa" w:w="1000"/>
+            <w:tcMar>
+              <w:top w:type="dxa" w:w="90"/>
+              <w:left w:type="dxa" w:w="100"/>
+              <w:bottom w:type="dxa" w:w="90"/>
+              <w:right w:type="dxa" w:w="100"/>
+            </w:tcMar>
+          </w:tcPr>
+          <w:p>
+            <w:pPr>
+              <w:spacing w:after="0" w:line="240"/>
+              <w:jc w:val="center"/>
+            </w:pPr>
+            <w:r>
+              <w:rPr>
+                <w:rFonts w:ascii="Aptos" w:cs="Aptos" w:eastAsia="Aptos" w:hAnsi="Aptos"/>
+                <w:b w:val="false"/>
+                <w:bCs w:val="false"/>
+                <w:i w:val="false"/>
+                <w:iCs w:val="false"/>
+                <w:sz w:val="19"/>
+                <w:szCs w:val="19"/>
+              </w:rPr>
+              <w:t xml:space="preserve">0,596</w:t>
             </w:r>
           </w:p>
         </w:tc>
@@ -4952,7 +5331,7 @@
       <w:tr>
         <w:tc>
           <w:tcPr>
-            <w:tcW w:type="dxa" w:w="1500"/>
+            <w:tcW w:type="dxa" w:w="1000"/>
             <w:shd w:fill="F8FAFC" w:val="clear"/>
             <w:tcMar>
               <w:top w:type="dxa" w:w="90"/>
@@ -4982,7 +5361,7 @@
         </w:tc>
         <w:tc>
           <w:tcPr>
-            <w:tcW w:type="dxa" w:w="1700"/>
+            <w:tcW w:type="dxa" w:w="1400"/>
             <w:shd w:fill="F8FAFC" w:val="clear"/>
             <w:tcMar>
               <w:top w:type="dxa" w:w="90"/>
@@ -5012,7 +5391,7 @@
         </w:tc>
         <w:tc>
           <w:tcPr>
-            <w:tcW w:type="dxa" w:w="1900"/>
+            <w:tcW w:type="dxa" w:w="1000"/>
             <w:shd w:fill="F8FAFC" w:val="clear"/>
             <w:tcMar>
               <w:top w:type="dxa" w:w="90"/>
@@ -5042,7 +5421,7 @@
         </w:tc>
         <w:tc>
           <w:tcPr>
-            <w:tcW w:type="dxa" w:w="1300"/>
+            <w:tcW w:type="dxa" w:w="800"/>
             <w:shd w:fill="F8FAFC" w:val="clear"/>
             <w:tcMar>
               <w:top w:type="dxa" w:w="90"/>
@@ -5066,13 +5445,13 @@
                 <w:sz w:val="19"/>
                 <w:szCs w:val="19"/>
               </w:rPr>
-              <w:t xml:space="preserve">0,765</w:t>
-            </w:r>
-          </w:p>
-        </w:tc>
-        <w:tc>
-          <w:tcPr>
-            <w:tcW w:type="dxa" w:w="1700"/>
+              <w:t xml:space="preserve">0,611</w:t>
+            </w:r>
+          </w:p>
+        </w:tc>
+        <w:tc>
+          <w:tcPr>
+            <w:tcW w:type="dxa" w:w="800"/>
             <w:shd w:fill="F8FAFC" w:val="clear"/>
             <w:tcMar>
               <w:top w:type="dxa" w:w="90"/>
@@ -5096,13 +5475,13 @@
                 <w:sz w:val="19"/>
                 <w:szCs w:val="19"/>
               </w:rPr>
-              <w:t xml:space="preserve">0,646</w:t>
-            </w:r>
-          </w:p>
-        </w:tc>
-        <w:tc>
-          <w:tcPr>
-            <w:tcW w:type="dxa" w:w="1300"/>
+              <w:t xml:space="preserve">0,544</w:t>
+            </w:r>
+          </w:p>
+        </w:tc>
+        <w:tc>
+          <w:tcPr>
+            <w:tcW w:type="dxa" w:w="1000"/>
             <w:shd w:fill="F8FAFC" w:val="clear"/>
             <w:tcMar>
               <w:top w:type="dxa" w:w="90"/>
@@ -5126,7 +5505,67 @@
                 <w:sz w:val="19"/>
                 <w:szCs w:val="19"/>
               </w:rPr>
-              <w:t xml:space="preserve">0,644</w:t>
+              <w:t xml:space="preserve">0,763</w:t>
+            </w:r>
+          </w:p>
+        </w:tc>
+        <w:tc>
+          <w:tcPr>
+            <w:tcW w:type="dxa" w:w="1000"/>
+            <w:shd w:fill="F8FAFC" w:val="clear"/>
+            <w:tcMar>
+              <w:top w:type="dxa" w:w="90"/>
+              <w:left w:type="dxa" w:w="100"/>
+              <w:bottom w:type="dxa" w:w="90"/>
+              <w:right w:type="dxa" w:w="100"/>
+            </w:tcMar>
+          </w:tcPr>
+          <w:p>
+            <w:pPr>
+              <w:spacing w:after="0" w:line="240"/>
+              <w:jc w:val="center"/>
+            </w:pPr>
+            <w:r>
+              <w:rPr>
+                <w:rFonts w:ascii="Aptos" w:cs="Aptos" w:eastAsia="Aptos" w:hAnsi="Aptos"/>
+                <w:b w:val="false"/>
+                <w:bCs w:val="false"/>
+                <w:i w:val="false"/>
+                <w:iCs w:val="false"/>
+                <w:sz w:val="19"/>
+                <w:szCs w:val="19"/>
+              </w:rPr>
+              <w:t xml:space="preserve">0,558</w:t>
+            </w:r>
+          </w:p>
+        </w:tc>
+        <w:tc>
+          <w:tcPr>
+            <w:tcW w:type="dxa" w:w="1000"/>
+            <w:shd w:fill="F8FAFC" w:val="clear"/>
+            <w:tcMar>
+              <w:top w:type="dxa" w:w="90"/>
+              <w:left w:type="dxa" w:w="100"/>
+              <w:bottom w:type="dxa" w:w="90"/>
+              <w:right w:type="dxa" w:w="100"/>
+            </w:tcMar>
+          </w:tcPr>
+          <w:p>
+            <w:pPr>
+              <w:spacing w:after="0" w:line="240"/>
+              <w:jc w:val="center"/>
+            </w:pPr>
+            <w:r>
+              <w:rPr>
+                <w:rFonts w:ascii="Aptos" w:cs="Aptos" w:eastAsia="Aptos" w:hAnsi="Aptos"/>
+                <w:b w:val="false"/>
+                <w:bCs w:val="false"/>
+                <w:i w:val="false"/>
+                <w:iCs w:val="false"/>
+                <w:sz w:val="19"/>
+                <w:szCs w:val="19"/>
+              </w:rPr>
+              <w:t xml:space="preserve">0,539</w:t>
             </w:r>
           </w:p>
         </w:tc>
@@ -5134,7 +5573,7 @@
       <w:tr>
         <w:tc>
           <w:tcPr>
-            <w:tcW w:type="dxa" w:w="1500"/>
+            <w:tcW w:type="dxa" w:w="1000"/>
             <w:tcMar>
               <w:top w:type="dxa" w:w="90"/>
               <w:left w:type="dxa" w:w="100"/>
@@ -5163,36 +5602,36 @@
         </w:tc>
         <w:tc>
           <w:tcPr>
-            <w:tcW w:type="dxa" w:w="1700"/>
-            <w:tcMar>
-              <w:top w:type="dxa" w:w="90"/>
-              <w:left w:type="dxa" w:w="100"/>
-              <w:bottom w:type="dxa" w:w="90"/>
-              <w:right w:type="dxa" w:w="100"/>
-            </w:tcMar>
-          </w:tcPr>
-          <w:p>
-            <w:pPr>
-              <w:spacing w:after="0" w:line="240"/>
-              <w:jc w:val="center"/>
-            </w:pPr>
-            <w:r>
-              <w:rPr>
-                <w:rFonts w:ascii="Aptos" w:cs="Aptos" w:eastAsia="Aptos" w:hAnsi="Aptos"/>
-                <w:b w:val="false"/>
-                <w:bCs w:val="false"/>
-                <w:i w:val="false"/>
-                <w:iCs w:val="false"/>
-                <w:sz w:val="19"/>
-                <w:szCs w:val="19"/>
-              </w:rPr>
-              <w:t xml:space="preserve">None</w:t>
-            </w:r>
-          </w:p>
-        </w:tc>
-        <w:tc>
-          <w:tcPr>
-            <w:tcW w:type="dxa" w:w="1900"/>
+            <w:tcW w:type="dxa" w:w="1400"/>
+            <w:tcMar>
+              <w:top w:type="dxa" w:w="90"/>
+              <w:left w:type="dxa" w:w="100"/>
+              <w:bottom w:type="dxa" w:w="90"/>
+              <w:right w:type="dxa" w:w="100"/>
+            </w:tcMar>
+          </w:tcPr>
+          <w:p>
+            <w:pPr>
+              <w:spacing w:after="0" w:line="240"/>
+              <w:jc w:val="center"/>
+            </w:pPr>
+            <w:r>
+              <w:rPr>
+                <w:rFonts w:ascii="Aptos" w:cs="Aptos" w:eastAsia="Aptos" w:hAnsi="Aptos"/>
+                <w:b w:val="false"/>
+                <w:bCs w:val="false"/>
+                <w:i w:val="false"/>
+                <w:iCs w:val="false"/>
+                <w:sz w:val="19"/>
+                <w:szCs w:val="19"/>
+              </w:rPr>
+              <w:t xml:space="preserve">Butterworth</w:t>
+            </w:r>
+          </w:p>
+        </w:tc>
+        <w:tc>
+          <w:tcPr>
+            <w:tcW w:type="dxa" w:w="1000"/>
             <w:tcMar>
               <w:top w:type="dxa" w:w="90"/>
               <w:left w:type="dxa" w:w="100"/>
@@ -5221,88 +5660,146 @@
         </w:tc>
         <w:tc>
           <w:tcPr>
-            <w:tcW w:type="dxa" w:w="1300"/>
-            <w:tcMar>
-              <w:top w:type="dxa" w:w="90"/>
-              <w:left w:type="dxa" w:w="100"/>
-              <w:bottom w:type="dxa" w:w="90"/>
-              <w:right w:type="dxa" w:w="100"/>
-            </w:tcMar>
-          </w:tcPr>
-          <w:p>
-            <w:pPr>
-              <w:spacing w:after="0" w:line="240"/>
-              <w:jc w:val="center"/>
-            </w:pPr>
-            <w:r>
-              <w:rPr>
-                <w:rFonts w:ascii="Aptos" w:cs="Aptos" w:eastAsia="Aptos" w:hAnsi="Aptos"/>
-                <w:b w:val="false"/>
-                <w:bCs w:val="false"/>
-                <w:i w:val="false"/>
-                <w:iCs w:val="false"/>
-                <w:sz w:val="19"/>
-                <w:szCs w:val="19"/>
-              </w:rPr>
-              <w:t xml:space="preserve">0,742</w:t>
-            </w:r>
-          </w:p>
-        </w:tc>
-        <w:tc>
-          <w:tcPr>
-            <w:tcW w:type="dxa" w:w="1700"/>
-            <w:tcMar>
-              <w:top w:type="dxa" w:w="90"/>
-              <w:left w:type="dxa" w:w="100"/>
-              <w:bottom w:type="dxa" w:w="90"/>
-              <w:right w:type="dxa" w:w="100"/>
-            </w:tcMar>
-          </w:tcPr>
-          <w:p>
-            <w:pPr>
-              <w:spacing w:after="0" w:line="240"/>
-              <w:jc w:val="center"/>
-            </w:pPr>
-            <w:r>
-              <w:rPr>
-                <w:rFonts w:ascii="Aptos" w:cs="Aptos" w:eastAsia="Aptos" w:hAnsi="Aptos"/>
-                <w:b w:val="false"/>
-                <w:bCs w:val="false"/>
-                <w:i w:val="false"/>
-                <w:iCs w:val="false"/>
-                <w:sz w:val="19"/>
-                <w:szCs w:val="19"/>
-              </w:rPr>
-              <w:t xml:space="preserve">0,659</w:t>
-            </w:r>
-          </w:p>
-        </w:tc>
-        <w:tc>
-          <w:tcPr>
-            <w:tcW w:type="dxa" w:w="1300"/>
-            <w:tcMar>
-              <w:top w:type="dxa" w:w="90"/>
-              <w:left w:type="dxa" w:w="100"/>
-              <w:bottom w:type="dxa" w:w="90"/>
-              <w:right w:type="dxa" w:w="100"/>
-            </w:tcMar>
-          </w:tcPr>
-          <w:p>
-            <w:pPr>
-              <w:spacing w:after="0" w:line="240"/>
-              <w:jc w:val="center"/>
-            </w:pPr>
-            <w:r>
-              <w:rPr>
-                <w:rFonts w:ascii="Aptos" w:cs="Aptos" w:eastAsia="Aptos" w:hAnsi="Aptos"/>
-                <w:b w:val="false"/>
-                <w:bCs w:val="false"/>
-                <w:i w:val="false"/>
-                <w:iCs w:val="false"/>
-                <w:sz w:val="19"/>
-                <w:szCs w:val="19"/>
-              </w:rPr>
-              <w:t xml:space="preserve">0,642</w:t>
+            <w:tcW w:type="dxa" w:w="800"/>
+            <w:tcMar>
+              <w:top w:type="dxa" w:w="90"/>
+              <w:left w:type="dxa" w:w="100"/>
+              <w:bottom w:type="dxa" w:w="90"/>
+              <w:right w:type="dxa" w:w="100"/>
+            </w:tcMar>
+          </w:tcPr>
+          <w:p>
+            <w:pPr>
+              <w:spacing w:after="0" w:line="240"/>
+              <w:jc w:val="center"/>
+            </w:pPr>
+            <w:r>
+              <w:rPr>
+                <w:rFonts w:ascii="Aptos" w:cs="Aptos" w:eastAsia="Aptos" w:hAnsi="Aptos"/>
+                <w:b w:val="false"/>
+                <w:bCs w:val="false"/>
+                <w:i w:val="false"/>
+                <w:iCs w:val="false"/>
+                <w:sz w:val="19"/>
+                <w:szCs w:val="19"/>
+              </w:rPr>
+              <w:t xml:space="preserve">0,596</w:t>
+            </w:r>
+          </w:p>
+        </w:tc>
+        <w:tc>
+          <w:tcPr>
+            <w:tcW w:type="dxa" w:w="800"/>
+            <w:tcMar>
+              <w:top w:type="dxa" w:w="90"/>
+              <w:left w:type="dxa" w:w="100"/>
+              <w:bottom w:type="dxa" w:w="90"/>
+              <w:right w:type="dxa" w:w="100"/>
+            </w:tcMar>
+          </w:tcPr>
+          <w:p>
+            <w:pPr>
+              <w:spacing w:after="0" w:line="240"/>
+              <w:jc w:val="center"/>
+            </w:pPr>
+            <w:r>
+              <w:rPr>
+                <w:rFonts w:ascii="Aptos" w:cs="Aptos" w:eastAsia="Aptos" w:hAnsi="Aptos"/>
+                <w:b w:val="false"/>
+                <w:bCs w:val="false"/>
+                <w:i w:val="false"/>
+                <w:iCs w:val="false"/>
+                <w:sz w:val="19"/>
+                <w:szCs w:val="19"/>
+              </w:rPr>
+              <w:t xml:space="preserve">0,533</w:t>
+            </w:r>
+          </w:p>
+        </w:tc>
+        <w:tc>
+          <w:tcPr>
+            <w:tcW w:type="dxa" w:w="1000"/>
+            <w:tcMar>
+              <w:top w:type="dxa" w:w="90"/>
+              <w:left w:type="dxa" w:w="100"/>
+              <w:bottom w:type="dxa" w:w="90"/>
+              <w:right w:type="dxa" w:w="100"/>
+            </w:tcMar>
+          </w:tcPr>
+          <w:p>
+            <w:pPr>
+              <w:spacing w:after="0" w:line="240"/>
+              <w:jc w:val="center"/>
+            </w:pPr>
+            <w:r>
+              <w:rPr>
+                <w:rFonts w:ascii="Aptos" w:cs="Aptos" w:eastAsia="Aptos" w:hAnsi="Aptos"/>
+                <w:b w:val="false"/>
+                <w:bCs w:val="false"/>
+                <w:i w:val="false"/>
+                <w:iCs w:val="false"/>
+                <w:sz w:val="19"/>
+                <w:szCs w:val="19"/>
+              </w:rPr>
+              <w:t xml:space="preserve">0,759</w:t>
+            </w:r>
+          </w:p>
+        </w:tc>
+        <w:tc>
+          <w:tcPr>
+            <w:tcW w:type="dxa" w:w="1000"/>
+            <w:tcMar>
+              <w:top w:type="dxa" w:w="90"/>
+              <w:left w:type="dxa" w:w="100"/>
+              <w:bottom w:type="dxa" w:w="90"/>
+              <w:right w:type="dxa" w:w="100"/>
+            </w:tcMar>
+          </w:tcPr>
+          <w:p>
+            <w:pPr>
+              <w:spacing w:after="0" w:line="240"/>
+              <w:jc w:val="center"/>
+            </w:pPr>
+            <w:r>
+              <w:rPr>
+                <w:rFonts w:ascii="Aptos" w:cs="Aptos" w:eastAsia="Aptos" w:hAnsi="Aptos"/>
+                <w:b w:val="false"/>
+                <w:bCs w:val="false"/>
+                <w:i w:val="false"/>
+                <w:iCs w:val="false"/>
+                <w:sz w:val="19"/>
+                <w:szCs w:val="19"/>
+              </w:rPr>
+              <w:t xml:space="preserve">0,541</w:t>
+            </w:r>
+          </w:p>
+        </w:tc>
+        <w:tc>
+          <w:tcPr>
+            <w:tcW w:type="dxa" w:w="1000"/>
+            <w:tcMar>
+              <w:top w:type="dxa" w:w="90"/>
+              <w:left w:type="dxa" w:w="100"/>
+              <w:bottom w:type="dxa" w:w="90"/>
+              <w:right w:type="dxa" w:w="100"/>
+            </w:tcMar>
+          </w:tcPr>
+          <w:p>
+            <w:pPr>
+              <w:spacing w:after="0" w:line="240"/>
+              <w:jc w:val="center"/>
+            </w:pPr>
+            <w:r>
+              <w:rPr>
+                <w:rFonts w:ascii="Aptos" w:cs="Aptos" w:eastAsia="Aptos" w:hAnsi="Aptos"/>
+                <w:b w:val="false"/>
+                <w:bCs w:val="false"/>
+                <w:i w:val="false"/>
+                <w:iCs w:val="false"/>
+                <w:sz w:val="19"/>
+                <w:szCs w:val="19"/>
+              </w:rPr>
+              <w:t xml:space="preserve">0,528</w:t>
             </w:r>
           </w:p>
         </w:tc>
@@ -5310,7 +5807,7 @@
       <w:tr>
         <w:tc>
           <w:tcPr>
-            <w:tcW w:type="dxa" w:w="1500"/>
+            <w:tcW w:type="dxa" w:w="1000"/>
             <w:shd w:fill="F8FAFC" w:val="clear"/>
             <w:tcMar>
               <w:top w:type="dxa" w:w="90"/>
@@ -5340,7 +5837,7 @@
         </w:tc>
         <w:tc>
           <w:tcPr>
-            <w:tcW w:type="dxa" w:w="1700"/>
+            <w:tcW w:type="dxa" w:w="1400"/>
             <w:shd w:fill="F8FAFC" w:val="clear"/>
             <w:tcMar>
               <w:top w:type="dxa" w:w="90"/>
@@ -5364,13 +5861,13 @@
                 <w:sz w:val="19"/>
                 <w:szCs w:val="19"/>
               </w:rPr>
-              <w:t xml:space="preserve">FIR</w:t>
-            </w:r>
-          </w:p>
-        </w:tc>
-        <w:tc>
-          <w:tcPr>
-            <w:tcW w:type="dxa" w:w="1900"/>
+              <w:t xml:space="preserve">None</w:t>
+            </w:r>
+          </w:p>
+        </w:tc>
+        <w:tc>
+          <w:tcPr>
+            <w:tcW w:type="dxa" w:w="1000"/>
             <w:shd w:fill="F8FAFC" w:val="clear"/>
             <w:tcMar>
               <w:top w:type="dxa" w:w="90"/>
@@ -5394,13 +5891,13 @@
                 <w:sz w:val="19"/>
                 <w:szCs w:val="19"/>
               </w:rPr>
-              <w:t xml:space="preserve">MFCC</w:t>
-            </w:r>
-          </w:p>
-        </w:tc>
-        <w:tc>
-          <w:tcPr>
-            <w:tcW w:type="dxa" w:w="1300"/>
+              <w:t xml:space="preserve">PSD</w:t>
+            </w:r>
+          </w:p>
+        </w:tc>
+        <w:tc>
+          <w:tcPr>
+            <w:tcW w:type="dxa" w:w="800"/>
             <w:shd w:fill="F8FAFC" w:val="clear"/>
             <w:tcMar>
               <w:top w:type="dxa" w:w="90"/>
@@ -5424,13 +5921,13 @@
                 <w:sz w:val="19"/>
                 <w:szCs w:val="19"/>
               </w:rPr>
-              <w:t xml:space="preserve">0,758</w:t>
-            </w:r>
-          </w:p>
-        </w:tc>
-        <w:tc>
-          <w:tcPr>
-            <w:tcW w:type="dxa" w:w="1700"/>
+              <w:t xml:space="preserve">0,569</w:t>
+            </w:r>
+          </w:p>
+        </w:tc>
+        <w:tc>
+          <w:tcPr>
+            <w:tcW w:type="dxa" w:w="800"/>
             <w:shd w:fill="F8FAFC" w:val="clear"/>
             <w:tcMar>
               <w:top w:type="dxa" w:w="90"/>
@@ -5454,13 +5951,13 @@
                 <w:sz w:val="19"/>
                 <w:szCs w:val="19"/>
               </w:rPr>
-              <w:t xml:space="preserve">0,628</w:t>
-            </w:r>
-          </w:p>
-        </w:tc>
-        <w:tc>
-          <w:tcPr>
-            <w:tcW w:type="dxa" w:w="1300"/>
+              <w:t xml:space="preserve">0,581</w:t>
+            </w:r>
+          </w:p>
+        </w:tc>
+        <w:tc>
+          <w:tcPr>
+            <w:tcW w:type="dxa" w:w="1000"/>
             <w:shd w:fill="F8FAFC" w:val="clear"/>
             <w:tcMar>
               <w:top w:type="dxa" w:w="90"/>
@@ -5484,7 +5981,67 @@
                 <w:sz w:val="19"/>
                 <w:szCs w:val="19"/>
               </w:rPr>
-              <w:t xml:space="preserve">0,628</w:t>
+              <w:t xml:space="preserve">0,744</w:t>
+            </w:r>
+          </w:p>
+        </w:tc>
+        <w:tc>
+          <w:tcPr>
+            <w:tcW w:type="dxa" w:w="1000"/>
+            <w:shd w:fill="F8FAFC" w:val="clear"/>
+            <w:tcMar>
+              <w:top w:type="dxa" w:w="90"/>
+              <w:left w:type="dxa" w:w="100"/>
+              <w:bottom w:type="dxa" w:w="90"/>
+              <w:right w:type="dxa" w:w="100"/>
+            </w:tcMar>
+          </w:tcPr>
+          <w:p>
+            <w:pPr>
+              <w:spacing w:after="0" w:line="240"/>
+              <w:jc w:val="center"/>
+            </w:pPr>
+            <w:r>
+              <w:rPr>
+                <w:rFonts w:ascii="Aptos" w:cs="Aptos" w:eastAsia="Aptos" w:hAnsi="Aptos"/>
+                <w:b w:val="false"/>
+                <w:bCs w:val="false"/>
+                <w:i w:val="false"/>
+                <w:iCs w:val="false"/>
+                <w:sz w:val="19"/>
+                <w:szCs w:val="19"/>
+              </w:rPr>
+              <w:t xml:space="preserve">0,573</w:t>
+            </w:r>
+          </w:p>
+        </w:tc>
+        <w:tc>
+          <w:tcPr>
+            <w:tcW w:type="dxa" w:w="1000"/>
+            <w:shd w:fill="F8FAFC" w:val="clear"/>
+            <w:tcMar>
+              <w:top w:type="dxa" w:w="90"/>
+              <w:left w:type="dxa" w:w="100"/>
+              <w:bottom w:type="dxa" w:w="90"/>
+              <w:right w:type="dxa" w:w="100"/>
+            </w:tcMar>
+          </w:tcPr>
+          <w:p>
+            <w:pPr>
+              <w:spacing w:after="0" w:line="240"/>
+              <w:jc w:val="center"/>
+            </w:pPr>
+            <w:r>
+              <w:rPr>
+                <w:rFonts w:ascii="Aptos" w:cs="Aptos" w:eastAsia="Aptos" w:hAnsi="Aptos"/>
+                <w:b w:val="false"/>
+                <w:bCs w:val="false"/>
+                <w:i w:val="false"/>
+                <w:iCs w:val="false"/>
+                <w:sz w:val="19"/>
+                <w:szCs w:val="19"/>
+              </w:rPr>
+              <w:t xml:space="preserve">0,511</w:t>
             </w:r>
           </w:p>
         </w:tc>
@@ -5492,7 +6049,7 @@
       <w:tr>
         <w:tc>
           <w:tcPr>
-            <w:tcW w:type="dxa" w:w="1500"/>
+            <w:tcW w:type="dxa" w:w="1000"/>
             <w:tcMar>
               <w:top w:type="dxa" w:w="90"/>
               <w:left w:type="dxa" w:w="100"/>
@@ -5515,13 +6072,249 @@
                 <w:sz w:val="19"/>
                 <w:szCs w:val="19"/>
               </w:rPr>
+              <w:t xml:space="preserve">MLP</w:t>
+            </w:r>
+          </w:p>
+        </w:tc>
+        <w:tc>
+          <w:tcPr>
+            <w:tcW w:type="dxa" w:w="1400"/>
+            <w:tcMar>
+              <w:top w:type="dxa" w:w="90"/>
+              <w:left w:type="dxa" w:w="100"/>
+              <w:bottom w:type="dxa" w:w="90"/>
+              <w:right w:type="dxa" w:w="100"/>
+            </w:tcMar>
+          </w:tcPr>
+          <w:p>
+            <w:pPr>
+              <w:spacing w:after="0" w:line="240"/>
+              <w:jc w:val="center"/>
+            </w:pPr>
+            <w:r>
+              <w:rPr>
+                <w:rFonts w:ascii="Aptos" w:cs="Aptos" w:eastAsia="Aptos" w:hAnsi="Aptos"/>
+                <w:b w:val="false"/>
+                <w:bCs w:val="false"/>
+                <w:i w:val="false"/>
+                <w:iCs w:val="false"/>
+                <w:sz w:val="19"/>
+                <w:szCs w:val="19"/>
+              </w:rPr>
+              <w:t xml:space="preserve">FIR</w:t>
+            </w:r>
+          </w:p>
+        </w:tc>
+        <w:tc>
+          <w:tcPr>
+            <w:tcW w:type="dxa" w:w="1000"/>
+            <w:tcMar>
+              <w:top w:type="dxa" w:w="90"/>
+              <w:left w:type="dxa" w:w="100"/>
+              <w:bottom w:type="dxa" w:w="90"/>
+              <w:right w:type="dxa" w:w="100"/>
+            </w:tcMar>
+          </w:tcPr>
+          <w:p>
+            <w:pPr>
+              <w:spacing w:after="0" w:line="240"/>
+              <w:jc w:val="center"/>
+            </w:pPr>
+            <w:r>
+              <w:rPr>
+                <w:rFonts w:ascii="Aptos" w:cs="Aptos" w:eastAsia="Aptos" w:hAnsi="Aptos"/>
+                <w:b w:val="false"/>
+                <w:bCs w:val="false"/>
+                <w:i w:val="false"/>
+                <w:iCs w:val="false"/>
+                <w:sz w:val="19"/>
+                <w:szCs w:val="19"/>
+              </w:rPr>
+              <w:t xml:space="preserve">Hybrid</w:t>
+            </w:r>
+          </w:p>
+        </w:tc>
+        <w:tc>
+          <w:tcPr>
+            <w:tcW w:type="dxa" w:w="800"/>
+            <w:tcMar>
+              <w:top w:type="dxa" w:w="90"/>
+              <w:left w:type="dxa" w:w="100"/>
+              <w:bottom w:type="dxa" w:w="90"/>
+              <w:right w:type="dxa" w:w="100"/>
+            </w:tcMar>
+          </w:tcPr>
+          <w:p>
+            <w:pPr>
+              <w:spacing w:after="0" w:line="240"/>
+              <w:jc w:val="center"/>
+            </w:pPr>
+            <w:r>
+              <w:rPr>
+                <w:rFonts w:ascii="Aptos" w:cs="Aptos" w:eastAsia="Aptos" w:hAnsi="Aptos"/>
+                <w:b w:val="false"/>
+                <w:bCs w:val="false"/>
+                <w:i w:val="false"/>
+                <w:iCs w:val="false"/>
+                <w:sz w:val="19"/>
+                <w:szCs w:val="19"/>
+              </w:rPr>
+              <w:t xml:space="preserve">0,564</w:t>
+            </w:r>
+          </w:p>
+        </w:tc>
+        <w:tc>
+          <w:tcPr>
+            <w:tcW w:type="dxa" w:w="800"/>
+            <w:tcMar>
+              <w:top w:type="dxa" w:w="90"/>
+              <w:left w:type="dxa" w:w="100"/>
+              <w:bottom w:type="dxa" w:w="90"/>
+              <w:right w:type="dxa" w:w="100"/>
+            </w:tcMar>
+          </w:tcPr>
+          <w:p>
+            <w:pPr>
+              <w:spacing w:after="0" w:line="240"/>
+              <w:jc w:val="center"/>
+            </w:pPr>
+            <w:r>
+              <w:rPr>
+                <w:rFonts w:ascii="Aptos" w:cs="Aptos" w:eastAsia="Aptos" w:hAnsi="Aptos"/>
+                <w:b w:val="false"/>
+                <w:bCs w:val="false"/>
+                <w:i w:val="false"/>
+                <w:iCs w:val="false"/>
+                <w:sz w:val="19"/>
+                <w:szCs w:val="19"/>
+              </w:rPr>
+              <w:t xml:space="preserve">0,461</w:t>
+            </w:r>
+          </w:p>
+        </w:tc>
+        <w:tc>
+          <w:tcPr>
+            <w:tcW w:type="dxa" w:w="1000"/>
+            <w:tcMar>
+              <w:top w:type="dxa" w:w="90"/>
+              <w:left w:type="dxa" w:w="100"/>
+              <w:bottom w:type="dxa" w:w="90"/>
+              <w:right w:type="dxa" w:w="100"/>
+            </w:tcMar>
+          </w:tcPr>
+          <w:p>
+            <w:pPr>
+              <w:spacing w:after="0" w:line="240"/>
+              <w:jc w:val="center"/>
+            </w:pPr>
+            <w:r>
+              <w:rPr>
+                <w:rFonts w:ascii="Aptos" w:cs="Aptos" w:eastAsia="Aptos" w:hAnsi="Aptos"/>
+                <w:b w:val="false"/>
+                <w:bCs w:val="false"/>
+                <w:i w:val="false"/>
+                <w:iCs w:val="false"/>
+                <w:sz w:val="19"/>
+                <w:szCs w:val="19"/>
+              </w:rPr>
+              <w:t xml:space="preserve">0,793</w:t>
+            </w:r>
+          </w:p>
+        </w:tc>
+        <w:tc>
+          <w:tcPr>
+            <w:tcW w:type="dxa" w:w="1000"/>
+            <w:tcMar>
+              <w:top w:type="dxa" w:w="90"/>
+              <w:left w:type="dxa" w:w="100"/>
+              <w:bottom w:type="dxa" w:w="90"/>
+              <w:right w:type="dxa" w:w="100"/>
+            </w:tcMar>
+          </w:tcPr>
+          <w:p>
+            <w:pPr>
+              <w:spacing w:after="0" w:line="240"/>
+              <w:jc w:val="center"/>
+            </w:pPr>
+            <w:r>
+              <w:rPr>
+                <w:rFonts w:ascii="Aptos" w:cs="Aptos" w:eastAsia="Aptos" w:hAnsi="Aptos"/>
+                <w:b w:val="false"/>
+                <w:bCs w:val="false"/>
+                <w:i w:val="false"/>
+                <w:iCs w:val="false"/>
+                <w:sz w:val="19"/>
+                <w:szCs w:val="19"/>
+              </w:rPr>
+              <w:t xml:space="preserve">0,590</w:t>
+            </w:r>
+          </w:p>
+        </w:tc>
+        <w:tc>
+          <w:tcPr>
+            <w:tcW w:type="dxa" w:w="1000"/>
+            <w:tcMar>
+              <w:top w:type="dxa" w:w="90"/>
+              <w:left w:type="dxa" w:w="100"/>
+              <w:bottom w:type="dxa" w:w="90"/>
+              <w:right w:type="dxa" w:w="100"/>
+            </w:tcMar>
+          </w:tcPr>
+          <w:p>
+            <w:pPr>
+              <w:spacing w:after="0" w:line="240"/>
+              <w:jc w:val="center"/>
+            </w:pPr>
+            <w:r>
+              <w:rPr>
+                <w:rFonts w:ascii="Aptos" w:cs="Aptos" w:eastAsia="Aptos" w:hAnsi="Aptos"/>
+                <w:b w:val="false"/>
+                <w:bCs w:val="false"/>
+                <w:i w:val="false"/>
+                <w:iCs w:val="false"/>
+                <w:sz w:val="19"/>
+                <w:szCs w:val="19"/>
+              </w:rPr>
+              <w:t xml:space="preserve">0,479</w:t>
+            </w:r>
+          </w:p>
+        </w:tc>
+      </w:tr>
+      <w:tr>
+        <w:tc>
+          <w:tcPr>
+            <w:tcW w:type="dxa" w:w="1000"/>
+            <w:shd w:fill="F8FAFC" w:val="clear"/>
+            <w:tcMar>
+              <w:top w:type="dxa" w:w="90"/>
+              <w:left w:type="dxa" w:w="100"/>
+              <w:bottom w:type="dxa" w:w="90"/>
+              <w:right w:type="dxa" w:w="100"/>
+            </w:tcMar>
+          </w:tcPr>
+          <w:p>
+            <w:pPr>
+              <w:spacing w:after="0" w:line="240"/>
+              <w:jc w:val="left"/>
+            </w:pPr>
+            <w:r>
+              <w:rPr>
+                <w:rFonts w:ascii="Aptos" w:cs="Aptos" w:eastAsia="Aptos" w:hAnsi="Aptos"/>
+                <w:b w:val="false"/>
+                <w:bCs w:val="false"/>
+                <w:i w:val="false"/>
+                <w:iCs w:val="false"/>
+                <w:sz w:val="19"/>
+                <w:szCs w:val="19"/>
+              </w:rPr>
               <w:t xml:space="preserve">SVM</w:t>
             </w:r>
           </w:p>
         </w:tc>
         <w:tc>
           <w:tcPr>
-            <w:tcW w:type="dxa" w:w="1700"/>
+            <w:tcW w:type="dxa" w:w="1400"/>
+            <w:shd w:fill="F8FAFC" w:val="clear"/>
             <w:tcMar>
               <w:top w:type="dxa" w:w="90"/>
               <w:left w:type="dxa" w:w="100"/>
@@ -5550,117 +6343,415 @@
         </w:tc>
         <w:tc>
           <w:tcPr>
-            <w:tcW w:type="dxa" w:w="1900"/>
-            <w:tcMar>
-              <w:top w:type="dxa" w:w="90"/>
-              <w:left w:type="dxa" w:w="100"/>
-              <w:bottom w:type="dxa" w:w="90"/>
-              <w:right w:type="dxa" w:w="100"/>
-            </w:tcMar>
-          </w:tcPr>
-          <w:p>
-            <w:pPr>
-              <w:spacing w:after="0" w:line="240"/>
-              <w:jc w:val="center"/>
-            </w:pPr>
-            <w:r>
-              <w:rPr>
-                <w:rFonts w:ascii="Aptos" w:cs="Aptos" w:eastAsia="Aptos" w:hAnsi="Aptos"/>
-                <w:b w:val="false"/>
-                <w:bCs w:val="false"/>
-                <w:i w:val="false"/>
-                <w:iCs w:val="false"/>
-                <w:sz w:val="19"/>
-                <w:szCs w:val="19"/>
-              </w:rPr>
-              <w:t xml:space="preserve">Hybrid</w:t>
-            </w:r>
-          </w:p>
-        </w:tc>
-        <w:tc>
-          <w:tcPr>
-            <w:tcW w:type="dxa" w:w="1300"/>
-            <w:tcMar>
-              <w:top w:type="dxa" w:w="90"/>
-              <w:left w:type="dxa" w:w="100"/>
-              <w:bottom w:type="dxa" w:w="90"/>
-              <w:right w:type="dxa" w:w="100"/>
-            </w:tcMar>
-          </w:tcPr>
-          <w:p>
-            <w:pPr>
-              <w:spacing w:after="0" w:line="240"/>
-              <w:jc w:val="center"/>
-            </w:pPr>
-            <w:r>
-              <w:rPr>
-                <w:rFonts w:ascii="Aptos" w:cs="Aptos" w:eastAsia="Aptos" w:hAnsi="Aptos"/>
-                <w:b w:val="false"/>
-                <w:bCs w:val="false"/>
-                <w:i w:val="false"/>
-                <w:iCs w:val="false"/>
-                <w:sz w:val="19"/>
-                <w:szCs w:val="19"/>
-              </w:rPr>
-              <w:t xml:space="preserve">0,742</w:t>
-            </w:r>
-          </w:p>
-        </w:tc>
-        <w:tc>
-          <w:tcPr>
-            <w:tcW w:type="dxa" w:w="1700"/>
-            <w:tcMar>
-              <w:top w:type="dxa" w:w="90"/>
-              <w:left w:type="dxa" w:w="100"/>
-              <w:bottom w:type="dxa" w:w="90"/>
-              <w:right w:type="dxa" w:w="100"/>
-            </w:tcMar>
-          </w:tcPr>
-          <w:p>
-            <w:pPr>
-              <w:spacing w:after="0" w:line="240"/>
-              <w:jc w:val="center"/>
-            </w:pPr>
-            <w:r>
-              <w:rPr>
-                <w:rFonts w:ascii="Aptos" w:cs="Aptos" w:eastAsia="Aptos" w:hAnsi="Aptos"/>
-                <w:b w:val="false"/>
-                <w:bCs w:val="false"/>
-                <w:i w:val="false"/>
-                <w:iCs w:val="false"/>
-                <w:sz w:val="19"/>
-                <w:szCs w:val="19"/>
-              </w:rPr>
-              <w:t xml:space="preserve">0,618</w:t>
-            </w:r>
-          </w:p>
-        </w:tc>
-        <w:tc>
-          <w:tcPr>
-            <w:tcW w:type="dxa" w:w="1300"/>
-            <w:tcMar>
-              <w:top w:type="dxa" w:w="90"/>
-              <w:left w:type="dxa" w:w="100"/>
-              <w:bottom w:type="dxa" w:w="90"/>
-              <w:right w:type="dxa" w:w="100"/>
-            </w:tcMar>
-          </w:tcPr>
-          <w:p>
-            <w:pPr>
-              <w:spacing w:after="0" w:line="240"/>
-              <w:jc w:val="center"/>
-            </w:pPr>
-            <w:r>
-              <w:rPr>
-                <w:rFonts w:ascii="Aptos" w:cs="Aptos" w:eastAsia="Aptos" w:hAnsi="Aptos"/>
-                <w:b w:val="false"/>
-                <w:bCs w:val="false"/>
-                <w:i w:val="false"/>
-                <w:iCs w:val="false"/>
-                <w:sz w:val="19"/>
-                <w:szCs w:val="19"/>
-              </w:rPr>
-              <w:t xml:space="preserve">0,615</w:t>
+            <w:tcW w:type="dxa" w:w="1000"/>
+            <w:shd w:fill="F8FAFC" w:val="clear"/>
+            <w:tcMar>
+              <w:top w:type="dxa" w:w="90"/>
+              <w:left w:type="dxa" w:w="100"/>
+              <w:bottom w:type="dxa" w:w="90"/>
+              <w:right w:type="dxa" w:w="100"/>
+            </w:tcMar>
+          </w:tcPr>
+          <w:p>
+            <w:pPr>
+              <w:spacing w:after="0" w:line="240"/>
+              <w:jc w:val="center"/>
+            </w:pPr>
+            <w:r>
+              <w:rPr>
+                <w:rFonts w:ascii="Aptos" w:cs="Aptos" w:eastAsia="Aptos" w:hAnsi="Aptos"/>
+                <w:b w:val="false"/>
+                <w:bCs w:val="false"/>
+                <w:i w:val="false"/>
+                <w:iCs w:val="false"/>
+                <w:sz w:val="19"/>
+                <w:szCs w:val="19"/>
+              </w:rPr>
+              <w:t xml:space="preserve">STFT</w:t>
+            </w:r>
+          </w:p>
+        </w:tc>
+        <w:tc>
+          <w:tcPr>
+            <w:tcW w:type="dxa" w:w="800"/>
+            <w:shd w:fill="F8FAFC" w:val="clear"/>
+            <w:tcMar>
+              <w:top w:type="dxa" w:w="90"/>
+              <w:left w:type="dxa" w:w="100"/>
+              <w:bottom w:type="dxa" w:w="90"/>
+              <w:right w:type="dxa" w:w="100"/>
+            </w:tcMar>
+          </w:tcPr>
+          <w:p>
+            <w:pPr>
+              <w:spacing w:after="0" w:line="240"/>
+              <w:jc w:val="center"/>
+            </w:pPr>
+            <w:r>
+              <w:rPr>
+                <w:rFonts w:ascii="Aptos" w:cs="Aptos" w:eastAsia="Aptos" w:hAnsi="Aptos"/>
+                <w:b w:val="false"/>
+                <w:bCs w:val="false"/>
+                <w:i w:val="false"/>
+                <w:iCs w:val="false"/>
+                <w:sz w:val="19"/>
+                <w:szCs w:val="19"/>
+              </w:rPr>
+              <w:t xml:space="preserve">0,542</w:t>
+            </w:r>
+          </w:p>
+        </w:tc>
+        <w:tc>
+          <w:tcPr>
+            <w:tcW w:type="dxa" w:w="800"/>
+            <w:shd w:fill="F8FAFC" w:val="clear"/>
+            <w:tcMar>
+              <w:top w:type="dxa" w:w="90"/>
+              <w:left w:type="dxa" w:w="100"/>
+              <w:bottom w:type="dxa" w:w="90"/>
+              <w:right w:type="dxa" w:w="100"/>
+            </w:tcMar>
+          </w:tcPr>
+          <w:p>
+            <w:pPr>
+              <w:spacing w:after="0" w:line="240"/>
+              <w:jc w:val="center"/>
+            </w:pPr>
+            <w:r>
+              <w:rPr>
+                <w:rFonts w:ascii="Aptos" w:cs="Aptos" w:eastAsia="Aptos" w:hAnsi="Aptos"/>
+                <w:b w:val="false"/>
+                <w:bCs w:val="false"/>
+                <w:i w:val="false"/>
+                <w:iCs w:val="false"/>
+                <w:sz w:val="19"/>
+                <w:szCs w:val="19"/>
+              </w:rPr>
+              <w:t xml:space="preserve">0,574</w:t>
+            </w:r>
+          </w:p>
+        </w:tc>
+        <w:tc>
+          <w:tcPr>
+            <w:tcW w:type="dxa" w:w="1000"/>
+            <w:shd w:fill="F8FAFC" w:val="clear"/>
+            <w:tcMar>
+              <w:top w:type="dxa" w:w="90"/>
+              <w:left w:type="dxa" w:w="100"/>
+              <w:bottom w:type="dxa" w:w="90"/>
+              <w:right w:type="dxa" w:w="100"/>
+            </w:tcMar>
+          </w:tcPr>
+          <w:p>
+            <w:pPr>
+              <w:spacing w:after="0" w:line="240"/>
+              <w:jc w:val="center"/>
+            </w:pPr>
+            <w:r>
+              <w:rPr>
+                <w:rFonts w:ascii="Aptos" w:cs="Aptos" w:eastAsia="Aptos" w:hAnsi="Aptos"/>
+                <w:b w:val="false"/>
+                <w:bCs w:val="false"/>
+                <w:i w:val="false"/>
+                <w:iCs w:val="false"/>
+                <w:sz w:val="19"/>
+                <w:szCs w:val="19"/>
+              </w:rPr>
+              <w:t xml:space="preserve">0,708</w:t>
+            </w:r>
+          </w:p>
+        </w:tc>
+        <w:tc>
+          <w:tcPr>
+            <w:tcW w:type="dxa" w:w="1000"/>
+            <w:shd w:fill="F8FAFC" w:val="clear"/>
+            <w:tcMar>
+              <w:top w:type="dxa" w:w="90"/>
+              <w:left w:type="dxa" w:w="100"/>
+              <w:bottom w:type="dxa" w:w="90"/>
+              <w:right w:type="dxa" w:w="100"/>
+            </w:tcMar>
+          </w:tcPr>
+          <w:p>
+            <w:pPr>
+              <w:spacing w:after="0" w:line="240"/>
+              <w:jc w:val="center"/>
+            </w:pPr>
+            <w:r>
+              <w:rPr>
+                <w:rFonts w:ascii="Aptos" w:cs="Aptos" w:eastAsia="Aptos" w:hAnsi="Aptos"/>
+                <w:b w:val="false"/>
+                <w:bCs w:val="false"/>
+                <w:i w:val="false"/>
+                <w:iCs w:val="false"/>
+                <w:sz w:val="19"/>
+                <w:szCs w:val="19"/>
+              </w:rPr>
+              <w:t xml:space="preserve">0,472</w:t>
+            </w:r>
+          </w:p>
+        </w:tc>
+        <w:tc>
+          <w:tcPr>
+            <w:tcW w:type="dxa" w:w="1000"/>
+            <w:shd w:fill="F8FAFC" w:val="clear"/>
+            <w:tcMar>
+              <w:top w:type="dxa" w:w="90"/>
+              <w:left w:type="dxa" w:w="100"/>
+              <w:bottom w:type="dxa" w:w="90"/>
+              <w:right w:type="dxa" w:w="100"/>
+            </w:tcMar>
+          </w:tcPr>
+          <w:p>
+            <w:pPr>
+              <w:spacing w:after="0" w:line="240"/>
+              <w:jc w:val="center"/>
+            </w:pPr>
+            <w:r>
+              <w:rPr>
+                <w:rFonts w:ascii="Aptos" w:cs="Aptos" w:eastAsia="Aptos" w:hAnsi="Aptos"/>
+                <w:b w:val="false"/>
+                <w:bCs w:val="false"/>
+                <w:i w:val="false"/>
+                <w:iCs w:val="false"/>
+                <w:sz w:val="19"/>
+                <w:szCs w:val="19"/>
+              </w:rPr>
+              <w:t xml:space="preserve">0,482</w:t>
+            </w:r>
+          </w:p>
+        </w:tc>
+      </w:tr>
+      <w:tr>
+        <w:tc>
+          <w:tcPr>
+            <w:tcW w:type="dxa" w:w="1000"/>
+            <w:tcMar>
+              <w:top w:type="dxa" w:w="90"/>
+              <w:left w:type="dxa" w:w="100"/>
+              <w:bottom w:type="dxa" w:w="90"/>
+              <w:right w:type="dxa" w:w="100"/>
+            </w:tcMar>
+          </w:tcPr>
+          <w:p>
+            <w:pPr>
+              <w:spacing w:after="0" w:line="240"/>
+              <w:jc w:val="left"/>
+            </w:pPr>
+            <w:r>
+              <w:rPr>
+                <w:rFonts w:ascii="Aptos" w:cs="Aptos" w:eastAsia="Aptos" w:hAnsi="Aptos"/>
+                <w:b w:val="false"/>
+                <w:bCs w:val="false"/>
+                <w:i w:val="false"/>
+                <w:iCs w:val="false"/>
+                <w:sz w:val="19"/>
+                <w:szCs w:val="19"/>
+              </w:rPr>
+              <w:t xml:space="preserve">SVM</w:t>
+            </w:r>
+          </w:p>
+        </w:tc>
+        <w:tc>
+          <w:tcPr>
+            <w:tcW w:type="dxa" w:w="1400"/>
+            <w:tcMar>
+              <w:top w:type="dxa" w:w="90"/>
+              <w:left w:type="dxa" w:w="100"/>
+              <w:bottom w:type="dxa" w:w="90"/>
+              <w:right w:type="dxa" w:w="100"/>
+            </w:tcMar>
+          </w:tcPr>
+          <w:p>
+            <w:pPr>
+              <w:spacing w:after="0" w:line="240"/>
+              <w:jc w:val="center"/>
+            </w:pPr>
+            <w:r>
+              <w:rPr>
+                <w:rFonts w:ascii="Aptos" w:cs="Aptos" w:eastAsia="Aptos" w:hAnsi="Aptos"/>
+                <w:b w:val="false"/>
+                <w:bCs w:val="false"/>
+                <w:i w:val="false"/>
+                <w:iCs w:val="false"/>
+                <w:sz w:val="19"/>
+                <w:szCs w:val="19"/>
+              </w:rPr>
+              <w:t xml:space="preserve">Butterworth</w:t>
+            </w:r>
+          </w:p>
+        </w:tc>
+        <w:tc>
+          <w:tcPr>
+            <w:tcW w:type="dxa" w:w="1000"/>
+            <w:tcMar>
+              <w:top w:type="dxa" w:w="90"/>
+              <w:left w:type="dxa" w:w="100"/>
+              <w:bottom w:type="dxa" w:w="90"/>
+              <w:right w:type="dxa" w:w="100"/>
+            </w:tcMar>
+          </w:tcPr>
+          <w:p>
+            <w:pPr>
+              <w:spacing w:after="0" w:line="240"/>
+              <w:jc w:val="center"/>
+            </w:pPr>
+            <w:r>
+              <w:rPr>
+                <w:rFonts w:ascii="Aptos" w:cs="Aptos" w:eastAsia="Aptos" w:hAnsi="Aptos"/>
+                <w:b w:val="false"/>
+                <w:bCs w:val="false"/>
+                <w:i w:val="false"/>
+                <w:iCs w:val="false"/>
+                <w:sz w:val="19"/>
+                <w:szCs w:val="19"/>
+              </w:rPr>
+              <w:t xml:space="preserve">PSD</w:t>
+            </w:r>
+          </w:p>
+        </w:tc>
+        <w:tc>
+          <w:tcPr>
+            <w:tcW w:type="dxa" w:w="800"/>
+            <w:tcMar>
+              <w:top w:type="dxa" w:w="90"/>
+              <w:left w:type="dxa" w:w="100"/>
+              <w:bottom w:type="dxa" w:w="90"/>
+              <w:right w:type="dxa" w:w="100"/>
+            </w:tcMar>
+          </w:tcPr>
+          <w:p>
+            <w:pPr>
+              <w:spacing w:after="0" w:line="240"/>
+              <w:jc w:val="center"/>
+            </w:pPr>
+            <w:r>
+              <w:rPr>
+                <w:rFonts w:ascii="Aptos" w:cs="Aptos" w:eastAsia="Aptos" w:hAnsi="Aptos"/>
+                <w:b w:val="false"/>
+                <w:bCs w:val="false"/>
+                <w:i w:val="false"/>
+                <w:iCs w:val="false"/>
+                <w:sz w:val="19"/>
+                <w:szCs w:val="19"/>
+              </w:rPr>
+              <w:t xml:space="preserve">0,533</w:t>
+            </w:r>
+          </w:p>
+        </w:tc>
+        <w:tc>
+          <w:tcPr>
+            <w:tcW w:type="dxa" w:w="800"/>
+            <w:tcMar>
+              <w:top w:type="dxa" w:w="90"/>
+              <w:left w:type="dxa" w:w="100"/>
+              <w:bottom w:type="dxa" w:w="90"/>
+              <w:right w:type="dxa" w:w="100"/>
+            </w:tcMar>
+          </w:tcPr>
+          <w:p>
+            <w:pPr>
+              <w:spacing w:after="0" w:line="240"/>
+              <w:jc w:val="center"/>
+            </w:pPr>
+            <w:r>
+              <w:rPr>
+                <w:rFonts w:ascii="Aptos" w:cs="Aptos" w:eastAsia="Aptos" w:hAnsi="Aptos"/>
+                <w:b w:val="false"/>
+                <w:bCs w:val="false"/>
+                <w:i w:val="false"/>
+                <w:iCs w:val="false"/>
+                <w:sz w:val="19"/>
+                <w:szCs w:val="19"/>
+              </w:rPr>
+              <w:t xml:space="preserve">0,511</w:t>
+            </w:r>
+          </w:p>
+        </w:tc>
+        <w:tc>
+          <w:tcPr>
+            <w:tcW w:type="dxa" w:w="1000"/>
+            <w:tcMar>
+              <w:top w:type="dxa" w:w="90"/>
+              <w:left w:type="dxa" w:w="100"/>
+              <w:bottom w:type="dxa" w:w="90"/>
+              <w:right w:type="dxa" w:w="100"/>
+            </w:tcMar>
+          </w:tcPr>
+          <w:p>
+            <w:pPr>
+              <w:spacing w:after="0" w:line="240"/>
+              <w:jc w:val="center"/>
+            </w:pPr>
+            <w:r>
+              <w:rPr>
+                <w:rFonts w:ascii="Aptos" w:cs="Aptos" w:eastAsia="Aptos" w:hAnsi="Aptos"/>
+                <w:b w:val="false"/>
+                <w:bCs w:val="false"/>
+                <w:i w:val="false"/>
+                <w:iCs w:val="false"/>
+                <w:sz w:val="19"/>
+                <w:szCs w:val="19"/>
+              </w:rPr>
+              <w:t xml:space="preserve">0,711</w:t>
+            </w:r>
+          </w:p>
+        </w:tc>
+        <w:tc>
+          <w:tcPr>
+            <w:tcW w:type="dxa" w:w="1000"/>
+            <w:tcMar>
+              <w:top w:type="dxa" w:w="90"/>
+              <w:left w:type="dxa" w:w="100"/>
+              <w:bottom w:type="dxa" w:w="90"/>
+              <w:right w:type="dxa" w:w="100"/>
+            </w:tcMar>
+          </w:tcPr>
+          <w:p>
+            <w:pPr>
+              <w:spacing w:after="0" w:line="240"/>
+              <w:jc w:val="center"/>
+            </w:pPr>
+            <w:r>
+              <w:rPr>
+                <w:rFonts w:ascii="Aptos" w:cs="Aptos" w:eastAsia="Aptos" w:hAnsi="Aptos"/>
+                <w:b w:val="false"/>
+                <w:bCs w:val="false"/>
+                <w:i w:val="false"/>
+                <w:iCs w:val="false"/>
+                <w:sz w:val="19"/>
+                <w:szCs w:val="19"/>
+              </w:rPr>
+              <w:t xml:space="preserve">0,515</w:t>
+            </w:r>
+          </w:p>
+        </w:tc>
+        <w:tc>
+          <w:tcPr>
+            <w:tcW w:type="dxa" w:w="1000"/>
+            <w:tcMar>
+              <w:top w:type="dxa" w:w="90"/>
+              <w:left w:type="dxa" w:w="100"/>
+              <w:bottom w:type="dxa" w:w="90"/>
+              <w:right w:type="dxa" w:w="100"/>
+            </w:tcMar>
+          </w:tcPr>
+          <w:p>
+            <w:pPr>
+              <w:spacing w:after="0" w:line="240"/>
+              <w:jc w:val="center"/>
+            </w:pPr>
+            <w:r>
+              <w:rPr>
+                <w:rFonts w:ascii="Aptos" w:cs="Aptos" w:eastAsia="Aptos" w:hAnsi="Aptos"/>
+                <w:b w:val="false"/>
+                <w:bCs w:val="false"/>
+                <w:i w:val="false"/>
+                <w:iCs w:val="false"/>
+                <w:sz w:val="19"/>
+                <w:szCs w:val="19"/>
+              </w:rPr>
+              <w:t xml:space="preserve">0,463</w:t>
             </w:r>
           </w:p>
         </w:tc>
@@ -5682,7 +6773,7 @@
           <w:sz w:val="19"/>
           <w:szCs w:val="19"/>
         </w:rPr>
-        <w:t xml:space="preserve">Bảng 5. Top full-data configurations theo Macro-F1; test = 132 bệnh nhân.</w:t>
+        <w:t xml:space="preserve">Bảng 5. Top primary 3-class configurations theo Weighted Accuracy; test = 236 bệnh nhân.</w:t>
       </w:r>
     </w:p>
     <w:p>
@@ -5699,7 +6790,7 @@
           <w:sz w:val="22"/>
           <w:szCs w:val="22"/>
         </w:rPr>
-        <w:t xml:space="preserve">Không filter cho kết quả tốt hơn trong split này; MFCC giúp MLP đạt Macro-F1 cao nhất, trong khi SVM + none + hybrid có balanced accuracy cao nhất. Tuy nhiên confusion matrix của MLP + none + MFCC vẫn cho thấy lớp Present khó nhận diện (9/27 đúng), vì vậy không nên chọn model chỉ theo Accuracy. Đây là kết luận trên một seed, cần lặp nhiều seed trước khi khẳng định ưu thế.</w:t>
+        <w:t xml:space="preserve">SVM + none + hybrid đứng đầu WAcc trong nhóm DSP-only; Butterworth + hybrid có AUROC và UAR cạnh tranh, cho thấy filter giúp tách cấu trúc phổ nhưng không đảm bảo WAcc cao nhất. MLP có AUROC/AUPRC tốt ở một số cấu hình nhưng WAcc thấp hơn do thiên về lớp Absent. Vì đây là một public split seed 42, kết quả được dùng để chọn hướng nghiên cứu chứ không tuyên bố kết quả hidden challenge test.</w:t>
       </w:r>
     </w:p>
     <w:p>
@@ -5709,7 +6800,7 @@
         <w:spacing w:after="120" w:before="260"/>
       </w:pPr>
       <w:r>
-        <w:t xml:space="preserve">4.3. CNN baseline và ablation</w:t>
+        <w:t xml:space="preserve">4.3. MobileNet baseline và filter ablation</w:t>
       </w:r>
     </w:p>
     <w:p>
@@ -5726,12 +6817,12 @@
           <w:sz w:val="22"/>
           <w:szCs w:val="22"/>
         </w:rPr>
-        <w:t xml:space="preserve">Để đối chiếu với hướng spectrogram CNN, một MobileNetV3-Small pretrained được thêm như baseline deep-learning nhẹ. CNN dùng input 1 kHz, 16-bit, không filter; mỗi recording chia tối đa hai cửa sổ 3 giây, chuyển thành log-STFT 128×128 và đưa qua backbone frozen; xác suất các cửa sổ được gộp về patient-level. Đây là full labeled cohort nhưng không phải full fine-tuning và không dùng mọi cửa sổ, nhằm giữ thời gian CPU thực tế.</w:t>
+        <w:t xml:space="preserve">MobileNetV3-Small pretrained được dùng như baseline transfer-learning nhẹ trên cùng primary split. Backbone frozen, input là log-STFT 128×128 từ cửa sổ 3 giây, xác suất được gộp mean ở patient-level; chỉ thay filter để giữ phép so sánh công bằng với DSP matrix.</w:t>
       </w:r>
     </w:p>
     <w:tbl>
       <w:tblPr>
-        <w:tblW w:type="dxa" w:w="9300"/>
+        <w:tblW w:type="dxa" w:w="9100"/>
         <w:tblBorders>
           <w:top w:val="single" w:color="CBD5E1" w:sz="4"/>
           <w:left w:val="single" w:color="auto" w:sz="4"/>
@@ -5742,15 +6833,18 @@
         </w:tblBorders>
       </w:tblPr>
       <w:tblGrid>
-        <w:gridCol w:w="4400"/>
-        <w:gridCol w:w="1500"/>
-        <w:gridCol w:w="1800"/>
-        <w:gridCol w:w="1600"/>
+        <w:gridCol w:w="1300"/>
+        <w:gridCol w:w="1300"/>
+        <w:gridCol w:w="1300"/>
+        <w:gridCol w:w="1300"/>
+        <w:gridCol w:w="1300"/>
+        <w:gridCol w:w="1300"/>
+        <w:gridCol w:w="1300"/>
       </w:tblGrid>
       <w:tr>
         <w:tc>
           <w:tcPr>
-            <w:tcW w:type="dxa" w:w="4400"/>
+            <w:tcW w:type="dxa" w:w="1300"/>
             <w:shd w:fill="17324D" w:val="clear"/>
             <w:tcMar>
               <w:top w:type="dxa" w:w="90"/>
@@ -5775,13 +6869,13 @@
                 <w:sz w:val="19"/>
                 <w:szCs w:val="19"/>
               </w:rPr>
-              <w:t xml:space="preserve">CNN setting</w:t>
-            </w:r>
-          </w:p>
-        </w:tc>
-        <w:tc>
-          <w:tcPr>
-            <w:tcW w:type="dxa" w:w="1500"/>
+              <w:t xml:space="preserve">Filter</w:t>
+            </w:r>
+          </w:p>
+        </w:tc>
+        <w:tc>
+          <w:tcPr>
+            <w:tcW w:type="dxa" w:w="1300"/>
             <w:shd w:fill="17324D" w:val="clear"/>
             <w:tcMar>
               <w:top w:type="dxa" w:w="90"/>
@@ -5812,7 +6906,7 @@
         </w:tc>
         <w:tc>
           <w:tcPr>
-            <w:tcW w:type="dxa" w:w="1800"/>
+            <w:tcW w:type="dxa" w:w="1300"/>
             <w:shd w:fill="17324D" w:val="clear"/>
             <w:tcMar>
               <w:top w:type="dxa" w:w="90"/>
@@ -5837,13 +6931,13 @@
                 <w:sz w:val="19"/>
                 <w:szCs w:val="19"/>
               </w:rPr>
-              <w:t xml:space="preserve">Balanced acc.</w:t>
-            </w:r>
-          </w:p>
-        </w:tc>
-        <w:tc>
-          <w:tcPr>
-            <w:tcW w:type="dxa" w:w="1600"/>
+              <w:t xml:space="preserve">WAcc</w:t>
+            </w:r>
+          </w:p>
+        </w:tc>
+        <w:tc>
+          <w:tcPr>
+            <w:tcW w:type="dxa" w:w="1300"/>
             <w:shd w:fill="17324D" w:val="clear"/>
             <w:tcMar>
               <w:top w:type="dxa" w:w="90"/>
@@ -5868,6 +6962,99 @@
                 <w:sz w:val="19"/>
                 <w:szCs w:val="19"/>
               </w:rPr>
+              <w:t xml:space="preserve">UAR</w:t>
+            </w:r>
+          </w:p>
+        </w:tc>
+        <w:tc>
+          <w:tcPr>
+            <w:tcW w:type="dxa" w:w="1300"/>
+            <w:shd w:fill="17324D" w:val="clear"/>
+            <w:tcMar>
+              <w:top w:type="dxa" w:w="90"/>
+              <w:left w:type="dxa" w:w="100"/>
+              <w:bottom w:type="dxa" w:w="90"/>
+              <w:right w:type="dxa" w:w="100"/>
+            </w:tcMar>
+          </w:tcPr>
+          <w:p>
+            <w:pPr>
+              <w:spacing w:after="0" w:line="240"/>
+              <w:jc w:val="center"/>
+            </w:pPr>
+            <w:r>
+              <w:rPr>
+                <w:rFonts w:ascii="Aptos" w:cs="Aptos" w:eastAsia="Aptos" w:hAnsi="Aptos"/>
+                <w:b/>
+                <w:bCs/>
+                <w:i w:val="false"/>
+                <w:iCs w:val="false"/>
+                <w:color w:val="FFFFFF"/>
+                <w:sz w:val="19"/>
+                <w:szCs w:val="19"/>
+              </w:rPr>
+              <w:t xml:space="preserve">AUROC</w:t>
+            </w:r>
+          </w:p>
+        </w:tc>
+        <w:tc>
+          <w:tcPr>
+            <w:tcW w:type="dxa" w:w="1300"/>
+            <w:shd w:fill="17324D" w:val="clear"/>
+            <w:tcMar>
+              <w:top w:type="dxa" w:w="90"/>
+              <w:left w:type="dxa" w:w="100"/>
+              <w:bottom w:type="dxa" w:w="90"/>
+              <w:right w:type="dxa" w:w="100"/>
+            </w:tcMar>
+          </w:tcPr>
+          <w:p>
+            <w:pPr>
+              <w:spacing w:after="0" w:line="240"/>
+              <w:jc w:val="center"/>
+            </w:pPr>
+            <w:r>
+              <w:rPr>
+                <w:rFonts w:ascii="Aptos" w:cs="Aptos" w:eastAsia="Aptos" w:hAnsi="Aptos"/>
+                <w:b/>
+                <w:bCs/>
+                <w:i w:val="false"/>
+                <w:iCs w:val="false"/>
+                <w:color w:val="FFFFFF"/>
+                <w:sz w:val="19"/>
+                <w:szCs w:val="19"/>
+              </w:rPr>
+              <w:t xml:space="preserve">AUPRC</w:t>
+            </w:r>
+          </w:p>
+        </w:tc>
+        <w:tc>
+          <w:tcPr>
+            <w:tcW w:type="dxa" w:w="1300"/>
+            <w:shd w:fill="17324D" w:val="clear"/>
+            <w:tcMar>
+              <w:top w:type="dxa" w:w="90"/>
+              <w:left w:type="dxa" w:w="100"/>
+              <w:bottom w:type="dxa" w:w="90"/>
+              <w:right w:type="dxa" w:w="100"/>
+            </w:tcMar>
+          </w:tcPr>
+          <w:p>
+            <w:pPr>
+              <w:spacing w:after="0" w:line="240"/>
+              <w:jc w:val="center"/>
+            </w:pPr>
+            <w:r>
+              <w:rPr>
+                <w:rFonts w:ascii="Aptos" w:cs="Aptos" w:eastAsia="Aptos" w:hAnsi="Aptos"/>
+                <w:b/>
+                <w:bCs/>
+                <w:i w:val="false"/>
+                <w:iCs w:val="false"/>
+                <w:color w:val="FFFFFF"/>
+                <w:sz w:val="19"/>
+                <w:szCs w:val="19"/>
+              </w:rPr>
               <w:t xml:space="preserve">Macro-F1</w:t>
             </w:r>
           </w:p>
@@ -5876,7 +7063,7 @@
       <w:tr>
         <w:tc>
           <w:tcPr>
-            <w:tcW w:type="dxa" w:w="4400"/>
+            <w:tcW w:type="dxa" w:w="1300"/>
             <w:tcMar>
               <w:top w:type="dxa" w:w="90"/>
               <w:left w:type="dxa" w:w="100"/>
@@ -5899,94 +7086,181 @@
                 <w:sz w:val="19"/>
                 <w:szCs w:val="19"/>
               </w:rPr>
-              <w:t xml:space="preserve">Mean + tuned threshold</w:t>
-            </w:r>
-          </w:p>
-        </w:tc>
-        <w:tc>
-          <w:tcPr>
-            <w:tcW w:type="dxa" w:w="1500"/>
-            <w:tcMar>
-              <w:top w:type="dxa" w:w="90"/>
-              <w:left w:type="dxa" w:w="100"/>
-              <w:bottom w:type="dxa" w:w="90"/>
-              <w:right w:type="dxa" w:w="100"/>
-            </w:tcMar>
-          </w:tcPr>
-          <w:p>
-            <w:pPr>
-              <w:spacing w:after="0" w:line="240"/>
-              <w:jc w:val="center"/>
-            </w:pPr>
-            <w:r>
-              <w:rPr>
-                <w:rFonts w:ascii="Aptos" w:cs="Aptos" w:eastAsia="Aptos" w:hAnsi="Aptos"/>
-                <w:b w:val="false"/>
-                <w:bCs w:val="false"/>
-                <w:i w:val="false"/>
-                <w:iCs w:val="false"/>
-                <w:sz w:val="19"/>
-                <w:szCs w:val="19"/>
-              </w:rPr>
-              <w:t xml:space="preserve">0,841</w:t>
-            </w:r>
-          </w:p>
-        </w:tc>
-        <w:tc>
-          <w:tcPr>
-            <w:tcW w:type="dxa" w:w="1800"/>
-            <w:tcMar>
-              <w:top w:type="dxa" w:w="90"/>
-              <w:left w:type="dxa" w:w="100"/>
-              <w:bottom w:type="dxa" w:w="90"/>
-              <w:right w:type="dxa" w:w="100"/>
-            </w:tcMar>
-          </w:tcPr>
-          <w:p>
-            <w:pPr>
-              <w:spacing w:after="0" w:line="240"/>
-              <w:jc w:val="center"/>
-            </w:pPr>
-            <w:r>
-              <w:rPr>
-                <w:rFonts w:ascii="Aptos" w:cs="Aptos" w:eastAsia="Aptos" w:hAnsi="Aptos"/>
-                <w:b w:val="false"/>
-                <w:bCs w:val="false"/>
-                <w:i w:val="false"/>
-                <w:iCs w:val="false"/>
-                <w:sz w:val="19"/>
-                <w:szCs w:val="19"/>
-              </w:rPr>
-              <w:t xml:space="preserve">0,666</w:t>
-            </w:r>
-          </w:p>
-        </w:tc>
-        <w:tc>
-          <w:tcPr>
-            <w:tcW w:type="dxa" w:w="1600"/>
-            <w:tcMar>
-              <w:top w:type="dxa" w:w="90"/>
-              <w:left w:type="dxa" w:w="100"/>
-              <w:bottom w:type="dxa" w:w="90"/>
-              <w:right w:type="dxa" w:w="100"/>
-            </w:tcMar>
-          </w:tcPr>
-          <w:p>
-            <w:pPr>
-              <w:spacing w:after="0" w:line="240"/>
-              <w:jc w:val="center"/>
-            </w:pPr>
-            <w:r>
-              <w:rPr>
-                <w:rFonts w:ascii="Aptos" w:cs="Aptos" w:eastAsia="Aptos" w:hAnsi="Aptos"/>
-                <w:b w:val="false"/>
-                <w:bCs w:val="false"/>
-                <w:i w:val="false"/>
-                <w:iCs w:val="false"/>
-                <w:sz w:val="19"/>
-                <w:szCs w:val="19"/>
-              </w:rPr>
-              <w:t xml:space="preserve">0,697</w:t>
+              <w:t xml:space="preserve">None</w:t>
+            </w:r>
+          </w:p>
+        </w:tc>
+        <w:tc>
+          <w:tcPr>
+            <w:tcW w:type="dxa" w:w="1300"/>
+            <w:tcMar>
+              <w:top w:type="dxa" w:w="90"/>
+              <w:left w:type="dxa" w:w="100"/>
+              <w:bottom w:type="dxa" w:w="90"/>
+              <w:right w:type="dxa" w:w="100"/>
+            </w:tcMar>
+          </w:tcPr>
+          <w:p>
+            <w:pPr>
+              <w:spacing w:after="0" w:line="240"/>
+              <w:jc w:val="center"/>
+            </w:pPr>
+            <w:r>
+              <w:rPr>
+                <w:rFonts w:ascii="Aptos" w:cs="Aptos" w:eastAsia="Aptos" w:hAnsi="Aptos"/>
+                <w:b w:val="false"/>
+                <w:bCs w:val="false"/>
+                <w:i w:val="false"/>
+                <w:iCs w:val="false"/>
+                <w:sz w:val="19"/>
+                <w:szCs w:val="19"/>
+              </w:rPr>
+              <w:t xml:space="preserve">0,716</w:t>
+            </w:r>
+          </w:p>
+        </w:tc>
+        <w:tc>
+          <w:tcPr>
+            <w:tcW w:type="dxa" w:w="1300"/>
+            <w:tcMar>
+              <w:top w:type="dxa" w:w="90"/>
+              <w:left w:type="dxa" w:w="100"/>
+              <w:bottom w:type="dxa" w:w="90"/>
+              <w:right w:type="dxa" w:w="100"/>
+            </w:tcMar>
+          </w:tcPr>
+          <w:p>
+            <w:pPr>
+              <w:spacing w:after="0" w:line="240"/>
+              <w:jc w:val="center"/>
+            </w:pPr>
+            <w:r>
+              <w:rPr>
+                <w:rFonts w:ascii="Aptos" w:cs="Aptos" w:eastAsia="Aptos" w:hAnsi="Aptos"/>
+                <w:b w:val="false"/>
+                <w:bCs w:val="false"/>
+                <w:i w:val="false"/>
+                <w:iCs w:val="false"/>
+                <w:sz w:val="19"/>
+                <w:szCs w:val="19"/>
+              </w:rPr>
+              <w:t xml:space="preserve">0,638</w:t>
+            </w:r>
+          </w:p>
+        </w:tc>
+        <w:tc>
+          <w:tcPr>
+            <w:tcW w:type="dxa" w:w="1300"/>
+            <w:tcMar>
+              <w:top w:type="dxa" w:w="90"/>
+              <w:left w:type="dxa" w:w="100"/>
+              <w:bottom w:type="dxa" w:w="90"/>
+              <w:right w:type="dxa" w:w="100"/>
+            </w:tcMar>
+          </w:tcPr>
+          <w:p>
+            <w:pPr>
+              <w:spacing w:after="0" w:line="240"/>
+              <w:jc w:val="center"/>
+            </w:pPr>
+            <w:r>
+              <w:rPr>
+                <w:rFonts w:ascii="Aptos" w:cs="Aptos" w:eastAsia="Aptos" w:hAnsi="Aptos"/>
+                <w:b w:val="false"/>
+                <w:bCs w:val="false"/>
+                <w:i w:val="false"/>
+                <w:iCs w:val="false"/>
+                <w:sz w:val="19"/>
+                <w:szCs w:val="19"/>
+              </w:rPr>
+              <w:t xml:space="preserve">0,620</w:t>
+            </w:r>
+          </w:p>
+        </w:tc>
+        <w:tc>
+          <w:tcPr>
+            <w:tcW w:type="dxa" w:w="1300"/>
+            <w:tcMar>
+              <w:top w:type="dxa" w:w="90"/>
+              <w:left w:type="dxa" w:w="100"/>
+              <w:bottom w:type="dxa" w:w="90"/>
+              <w:right w:type="dxa" w:w="100"/>
+            </w:tcMar>
+          </w:tcPr>
+          <w:p>
+            <w:pPr>
+              <w:spacing w:after="0" w:line="240"/>
+              <w:jc w:val="center"/>
+            </w:pPr>
+            <w:r>
+              <w:rPr>
+                <w:rFonts w:ascii="Aptos" w:cs="Aptos" w:eastAsia="Aptos" w:hAnsi="Aptos"/>
+                <w:b w:val="false"/>
+                <w:bCs w:val="false"/>
+                <w:i w:val="false"/>
+                <w:iCs w:val="false"/>
+                <w:sz w:val="19"/>
+                <w:szCs w:val="19"/>
+              </w:rPr>
+              <w:t xml:space="preserve">0,772</w:t>
+            </w:r>
+          </w:p>
+        </w:tc>
+        <w:tc>
+          <w:tcPr>
+            <w:tcW w:type="dxa" w:w="1300"/>
+            <w:tcMar>
+              <w:top w:type="dxa" w:w="90"/>
+              <w:left w:type="dxa" w:w="100"/>
+              <w:bottom w:type="dxa" w:w="90"/>
+              <w:right w:type="dxa" w:w="100"/>
+            </w:tcMar>
+          </w:tcPr>
+          <w:p>
+            <w:pPr>
+              <w:spacing w:after="0" w:line="240"/>
+              <w:jc w:val="center"/>
+            </w:pPr>
+            <w:r>
+              <w:rPr>
+                <w:rFonts w:ascii="Aptos" w:cs="Aptos" w:eastAsia="Aptos" w:hAnsi="Aptos"/>
+                <w:b w:val="false"/>
+                <w:bCs w:val="false"/>
+                <w:i w:val="false"/>
+                <w:iCs w:val="false"/>
+                <w:sz w:val="19"/>
+                <w:szCs w:val="19"/>
+              </w:rPr>
+              <w:t xml:space="preserve">0,596</w:t>
+            </w:r>
+          </w:p>
+        </w:tc>
+        <w:tc>
+          <w:tcPr>
+            <w:tcW w:type="dxa" w:w="1300"/>
+            <w:tcMar>
+              <w:top w:type="dxa" w:w="90"/>
+              <w:left w:type="dxa" w:w="100"/>
+              <w:bottom w:type="dxa" w:w="90"/>
+              <w:right w:type="dxa" w:w="100"/>
+            </w:tcMar>
+          </w:tcPr>
+          <w:p>
+            <w:pPr>
+              <w:spacing w:after="0" w:line="240"/>
+              <w:jc w:val="center"/>
+            </w:pPr>
+            <w:r>
+              <w:rPr>
+                <w:rFonts w:ascii="Aptos" w:cs="Aptos" w:eastAsia="Aptos" w:hAnsi="Aptos"/>
+                <w:b w:val="false"/>
+                <w:bCs w:val="false"/>
+                <w:i w:val="false"/>
+                <w:iCs w:val="false"/>
+                <w:sz w:val="19"/>
+                <w:szCs w:val="19"/>
+              </w:rPr>
+              <w:t xml:space="preserve">0,580</w:t>
             </w:r>
           </w:p>
         </w:tc>
@@ -5994,7 +7268,7 @@
       <w:tr>
         <w:tc>
           <w:tcPr>
-            <w:tcW w:type="dxa" w:w="4400"/>
+            <w:tcW w:type="dxa" w:w="1300"/>
             <w:shd w:fill="F8FAFC" w:val="clear"/>
             <w:tcMar>
               <w:top w:type="dxa" w:w="90"/>
@@ -6018,13 +7292,13 @@
                 <w:sz w:val="19"/>
                 <w:szCs w:val="19"/>
               </w:rPr>
-              <w:t xml:space="preserve">Median + tuned threshold</w:t>
-            </w:r>
-          </w:p>
-        </w:tc>
-        <w:tc>
-          <w:tcPr>
-            <w:tcW w:type="dxa" w:w="1500"/>
+              <w:t xml:space="preserve">Butterworth</w:t>
+            </w:r>
+          </w:p>
+        </w:tc>
+        <w:tc>
+          <w:tcPr>
+            <w:tcW w:type="dxa" w:w="1300"/>
             <w:shd w:fill="F8FAFC" w:val="clear"/>
             <w:tcMar>
               <w:top w:type="dxa" w:w="90"/>
@@ -6048,13 +7322,13 @@
                 <w:sz w:val="19"/>
                 <w:szCs w:val="19"/>
               </w:rPr>
-              <w:t xml:space="preserve">0,833</w:t>
-            </w:r>
-          </w:p>
-        </w:tc>
-        <w:tc>
-          <w:tcPr>
-            <w:tcW w:type="dxa" w:w="1800"/>
+              <w:t xml:space="preserve">0,737</w:t>
+            </w:r>
+          </w:p>
+        </w:tc>
+        <w:tc>
+          <w:tcPr>
+            <w:tcW w:type="dxa" w:w="1300"/>
             <w:shd w:fill="F8FAFC" w:val="clear"/>
             <w:tcMar>
               <w:top w:type="dxa" w:w="90"/>
@@ -6078,13 +7352,13 @@
                 <w:sz w:val="19"/>
                 <w:szCs w:val="19"/>
               </w:rPr>
-              <w:t xml:space="preserve">0,689</w:t>
-            </w:r>
-          </w:p>
-        </w:tc>
-        <w:tc>
-          <w:tcPr>
-            <w:tcW w:type="dxa" w:w="1600"/>
+              <w:t xml:space="preserve">0,667</w:t>
+            </w:r>
+          </w:p>
+        </w:tc>
+        <w:tc>
+          <w:tcPr>
+            <w:tcW w:type="dxa" w:w="1300"/>
             <w:shd w:fill="F8FAFC" w:val="clear"/>
             <w:tcMar>
               <w:top w:type="dxa" w:w="90"/>
@@ -6108,7 +7382,97 @@
                 <w:sz w:val="19"/>
                 <w:szCs w:val="19"/>
               </w:rPr>
-              <w:t xml:space="preserve">0,710</w:t>
+              <w:t xml:space="preserve">0,641</w:t>
+            </w:r>
+          </w:p>
+        </w:tc>
+        <w:tc>
+          <w:tcPr>
+            <w:tcW w:type="dxa" w:w="1300"/>
+            <w:shd w:fill="F8FAFC" w:val="clear"/>
+            <w:tcMar>
+              <w:top w:type="dxa" w:w="90"/>
+              <w:left w:type="dxa" w:w="100"/>
+              <w:bottom w:type="dxa" w:w="90"/>
+              <w:right w:type="dxa" w:w="100"/>
+            </w:tcMar>
+          </w:tcPr>
+          <w:p>
+            <w:pPr>
+              <w:spacing w:after="0" w:line="240"/>
+              <w:jc w:val="center"/>
+            </w:pPr>
+            <w:r>
+              <w:rPr>
+                <w:rFonts w:ascii="Aptos" w:cs="Aptos" w:eastAsia="Aptos" w:hAnsi="Aptos"/>
+                <w:b w:val="false"/>
+                <w:bCs w:val="false"/>
+                <w:i w:val="false"/>
+                <w:iCs w:val="false"/>
+                <w:sz w:val="19"/>
+                <w:szCs w:val="19"/>
+              </w:rPr>
+              <w:t xml:space="preserve">0,796</w:t>
+            </w:r>
+          </w:p>
+        </w:tc>
+        <w:tc>
+          <w:tcPr>
+            <w:tcW w:type="dxa" w:w="1300"/>
+            <w:shd w:fill="F8FAFC" w:val="clear"/>
+            <w:tcMar>
+              <w:top w:type="dxa" w:w="90"/>
+              <w:left w:type="dxa" w:w="100"/>
+              <w:bottom w:type="dxa" w:w="90"/>
+              <w:right w:type="dxa" w:w="100"/>
+            </w:tcMar>
+          </w:tcPr>
+          <w:p>
+            <w:pPr>
+              <w:spacing w:after="0" w:line="240"/>
+              <w:jc w:val="center"/>
+            </w:pPr>
+            <w:r>
+              <w:rPr>
+                <w:rFonts w:ascii="Aptos" w:cs="Aptos" w:eastAsia="Aptos" w:hAnsi="Aptos"/>
+                <w:b w:val="false"/>
+                <w:bCs w:val="false"/>
+                <w:i w:val="false"/>
+                <w:iCs w:val="false"/>
+                <w:sz w:val="19"/>
+                <w:szCs w:val="19"/>
+              </w:rPr>
+              <w:t xml:space="preserve">0,629</w:t>
+            </w:r>
+          </w:p>
+        </w:tc>
+        <w:tc>
+          <w:tcPr>
+            <w:tcW w:type="dxa" w:w="1300"/>
+            <w:shd w:fill="F8FAFC" w:val="clear"/>
+            <w:tcMar>
+              <w:top w:type="dxa" w:w="90"/>
+              <w:left w:type="dxa" w:w="100"/>
+              <w:bottom w:type="dxa" w:w="90"/>
+              <w:right w:type="dxa" w:w="100"/>
+            </w:tcMar>
+          </w:tcPr>
+          <w:p>
+            <w:pPr>
+              <w:spacing w:after="0" w:line="240"/>
+              <w:jc w:val="center"/>
+            </w:pPr>
+            <w:r>
+              <w:rPr>
+                <w:rFonts w:ascii="Aptos" w:cs="Aptos" w:eastAsia="Aptos" w:hAnsi="Aptos"/>
+                <w:b w:val="false"/>
+                <w:bCs w:val="false"/>
+                <w:i w:val="false"/>
+                <w:iCs w:val="false"/>
+                <w:sz w:val="19"/>
+                <w:szCs w:val="19"/>
+              </w:rPr>
+              <w:t xml:space="preserve">0,604</w:t>
             </w:r>
           </w:p>
         </w:tc>
@@ -6116,7 +7480,7 @@
       <w:tr>
         <w:tc>
           <w:tcPr>
-            <w:tcW w:type="dxa" w:w="4400"/>
+            <w:tcW w:type="dxa" w:w="1300"/>
             <w:tcMar>
               <w:top w:type="dxa" w:w="90"/>
               <w:left w:type="dxa" w:w="100"/>
@@ -6139,334 +7503,181 @@
                 <w:sz w:val="19"/>
                 <w:szCs w:val="19"/>
               </w:rPr>
-              <w:t xml:space="preserve">Top-25% windows</w:t>
-            </w:r>
-          </w:p>
-        </w:tc>
-        <w:tc>
-          <w:tcPr>
-            <w:tcW w:type="dxa" w:w="1500"/>
-            <w:tcMar>
-              <w:top w:type="dxa" w:w="90"/>
-              <w:left w:type="dxa" w:w="100"/>
-              <w:bottom w:type="dxa" w:w="90"/>
-              <w:right w:type="dxa" w:w="100"/>
-            </w:tcMar>
-          </w:tcPr>
-          <w:p>
-            <w:pPr>
-              <w:spacing w:after="0" w:line="240"/>
-              <w:jc w:val="center"/>
-            </w:pPr>
-            <w:r>
-              <w:rPr>
-                <w:rFonts w:ascii="Aptos" w:cs="Aptos" w:eastAsia="Aptos" w:hAnsi="Aptos"/>
-                <w:b w:val="false"/>
-                <w:bCs w:val="false"/>
-                <w:i w:val="false"/>
-                <w:iCs w:val="false"/>
-                <w:sz w:val="19"/>
-                <w:szCs w:val="19"/>
-              </w:rPr>
-              <w:t xml:space="preserve">0,765</w:t>
-            </w:r>
-          </w:p>
-        </w:tc>
-        <w:tc>
-          <w:tcPr>
-            <w:tcW w:type="dxa" w:w="1800"/>
-            <w:tcMar>
-              <w:top w:type="dxa" w:w="90"/>
-              <w:left w:type="dxa" w:w="100"/>
-              <w:bottom w:type="dxa" w:w="90"/>
-              <w:right w:type="dxa" w:w="100"/>
-            </w:tcMar>
-          </w:tcPr>
-          <w:p>
-            <w:pPr>
-              <w:spacing w:after="0" w:line="240"/>
-              <w:jc w:val="center"/>
-            </w:pPr>
-            <w:r>
-              <w:rPr>
-                <w:rFonts w:ascii="Aptos" w:cs="Aptos" w:eastAsia="Aptos" w:hAnsi="Aptos"/>
-                <w:b w:val="false"/>
-                <w:bCs w:val="false"/>
-                <w:i w:val="false"/>
-                <w:iCs w:val="false"/>
-                <w:sz w:val="19"/>
-                <w:szCs w:val="19"/>
-              </w:rPr>
-              <w:t xml:space="preserve">0,660</w:t>
-            </w:r>
-          </w:p>
-        </w:tc>
-        <w:tc>
-          <w:tcPr>
-            <w:tcW w:type="dxa" w:w="1600"/>
-            <w:tcMar>
-              <w:top w:type="dxa" w:w="90"/>
-              <w:left w:type="dxa" w:w="100"/>
-              <w:bottom w:type="dxa" w:w="90"/>
-              <w:right w:type="dxa" w:w="100"/>
-            </w:tcMar>
-          </w:tcPr>
-          <w:p>
-            <w:pPr>
-              <w:spacing w:after="0" w:line="240"/>
-              <w:jc w:val="center"/>
-            </w:pPr>
-            <w:r>
-              <w:rPr>
-                <w:rFonts w:ascii="Aptos" w:cs="Aptos" w:eastAsia="Aptos" w:hAnsi="Aptos"/>
-                <w:b w:val="false"/>
-                <w:bCs w:val="false"/>
-                <w:i w:val="false"/>
-                <w:iCs w:val="false"/>
-                <w:sz w:val="19"/>
-                <w:szCs w:val="19"/>
-              </w:rPr>
-              <w:t xml:space="preserve">0,653</w:t>
-            </w:r>
-          </w:p>
-        </w:tc>
-      </w:tr>
-      <w:tr>
-        <w:tc>
-          <w:tcPr>
-            <w:tcW w:type="dxa" w:w="4400"/>
-            <w:shd w:fill="F8FAFC" w:val="clear"/>
-            <w:tcMar>
-              <w:top w:type="dxa" w:w="90"/>
-              <w:left w:type="dxa" w:w="100"/>
-              <w:bottom w:type="dxa" w:w="90"/>
-              <w:right w:type="dxa" w:w="100"/>
-            </w:tcMar>
-          </w:tcPr>
-          <w:p>
-            <w:pPr>
-              <w:spacing w:after="0" w:line="240"/>
-              <w:jc w:val="left"/>
-            </w:pPr>
-            <w:r>
-              <w:rPr>
-                <w:rFonts w:ascii="Aptos" w:cs="Aptos" w:eastAsia="Aptos" w:hAnsi="Aptos"/>
-                <w:b w:val="false"/>
-                <w:bCs w:val="false"/>
-                <w:i w:val="false"/>
-                <w:iCs w:val="false"/>
-                <w:sz w:val="19"/>
-                <w:szCs w:val="19"/>
-              </w:rPr>
-              <w:t xml:space="preserve">Max window</w:t>
-            </w:r>
-          </w:p>
-        </w:tc>
-        <w:tc>
-          <w:tcPr>
-            <w:tcW w:type="dxa" w:w="1500"/>
-            <w:shd w:fill="F8FAFC" w:val="clear"/>
-            <w:tcMar>
-              <w:top w:type="dxa" w:w="90"/>
-              <w:left w:type="dxa" w:w="100"/>
-              <w:bottom w:type="dxa" w:w="90"/>
-              <w:right w:type="dxa" w:w="100"/>
-            </w:tcMar>
-          </w:tcPr>
-          <w:p>
-            <w:pPr>
-              <w:spacing w:after="0" w:line="240"/>
-              <w:jc w:val="center"/>
-            </w:pPr>
-            <w:r>
-              <w:rPr>
-                <w:rFonts w:ascii="Aptos" w:cs="Aptos" w:eastAsia="Aptos" w:hAnsi="Aptos"/>
-                <w:b w:val="false"/>
-                <w:bCs w:val="false"/>
-                <w:i w:val="false"/>
-                <w:iCs w:val="false"/>
-                <w:sz w:val="19"/>
-                <w:szCs w:val="19"/>
-              </w:rPr>
-              <w:t xml:space="preserve">0,667</w:t>
-            </w:r>
-          </w:p>
-        </w:tc>
-        <w:tc>
-          <w:tcPr>
-            <w:tcW w:type="dxa" w:w="1800"/>
-            <w:shd w:fill="F8FAFC" w:val="clear"/>
-            <w:tcMar>
-              <w:top w:type="dxa" w:w="90"/>
-              <w:left w:type="dxa" w:w="100"/>
-              <w:bottom w:type="dxa" w:w="90"/>
-              <w:right w:type="dxa" w:w="100"/>
-            </w:tcMar>
-          </w:tcPr>
-          <w:p>
-            <w:pPr>
-              <w:spacing w:after="0" w:line="240"/>
-              <w:jc w:val="center"/>
-            </w:pPr>
-            <w:r>
-              <w:rPr>
-                <w:rFonts w:ascii="Aptos" w:cs="Aptos" w:eastAsia="Aptos" w:hAnsi="Aptos"/>
-                <w:b w:val="false"/>
-                <w:bCs w:val="false"/>
-                <w:i w:val="false"/>
-                <w:iCs w:val="false"/>
-                <w:sz w:val="19"/>
-                <w:szCs w:val="19"/>
-              </w:rPr>
-              <w:t xml:space="preserve">0,543</w:t>
-            </w:r>
-          </w:p>
-        </w:tc>
-        <w:tc>
-          <w:tcPr>
-            <w:tcW w:type="dxa" w:w="1600"/>
-            <w:shd w:fill="F8FAFC" w:val="clear"/>
-            <w:tcMar>
-              <w:top w:type="dxa" w:w="90"/>
-              <w:left w:type="dxa" w:w="100"/>
-              <w:bottom w:type="dxa" w:w="90"/>
-              <w:right w:type="dxa" w:w="100"/>
-            </w:tcMar>
-          </w:tcPr>
-          <w:p>
-            <w:pPr>
-              <w:spacing w:after="0" w:line="240"/>
-              <w:jc w:val="center"/>
-            </w:pPr>
-            <w:r>
-              <w:rPr>
-                <w:rFonts w:ascii="Aptos" w:cs="Aptos" w:eastAsia="Aptos" w:hAnsi="Aptos"/>
-                <w:b w:val="false"/>
-                <w:bCs w:val="false"/>
-                <w:i w:val="false"/>
-                <w:iCs w:val="false"/>
-                <w:sz w:val="19"/>
-                <w:szCs w:val="19"/>
-              </w:rPr>
-              <w:t xml:space="preserve">0,536</w:t>
-            </w:r>
-          </w:p>
-        </w:tc>
-      </w:tr>
-      <w:tr>
-        <w:tc>
-          <w:tcPr>
-            <w:tcW w:type="dxa" w:w="4400"/>
-            <w:tcMar>
-              <w:top w:type="dxa" w:w="90"/>
-              <w:left w:type="dxa" w:w="100"/>
-              <w:bottom w:type="dxa" w:w="90"/>
-              <w:right w:type="dxa" w:w="100"/>
-            </w:tcMar>
-          </w:tcPr>
-          <w:p>
-            <w:pPr>
-              <w:spacing w:after="0" w:line="240"/>
-              <w:jc w:val="left"/>
-            </w:pPr>
-            <w:r>
-              <w:rPr>
-                <w:rFonts w:ascii="Aptos" w:cs="Aptos" w:eastAsia="Aptos" w:hAnsi="Aptos"/>
-                <w:b w:val="false"/>
-                <w:bCs w:val="false"/>
-                <w:i w:val="false"/>
-                <w:iCs w:val="false"/>
-                <w:sz w:val="19"/>
-                <w:szCs w:val="19"/>
-              </w:rPr>
-              <w:t xml:space="preserve">Median + last block fine-tuned</w:t>
-            </w:r>
-          </w:p>
-        </w:tc>
-        <w:tc>
-          <w:tcPr>
-            <w:tcW w:type="dxa" w:w="1500"/>
-            <w:tcMar>
-              <w:top w:type="dxa" w:w="90"/>
-              <w:left w:type="dxa" w:w="100"/>
-              <w:bottom w:type="dxa" w:w="90"/>
-              <w:right w:type="dxa" w:w="100"/>
-            </w:tcMar>
-          </w:tcPr>
-          <w:p>
-            <w:pPr>
-              <w:spacing w:after="0" w:line="240"/>
-              <w:jc w:val="center"/>
-            </w:pPr>
-            <w:r>
-              <w:rPr>
-                <w:rFonts w:ascii="Aptos" w:cs="Aptos" w:eastAsia="Aptos" w:hAnsi="Aptos"/>
-                <w:b w:val="false"/>
-                <w:bCs w:val="false"/>
-                <w:i w:val="false"/>
-                <w:iCs w:val="false"/>
-                <w:sz w:val="19"/>
-                <w:szCs w:val="19"/>
-              </w:rPr>
-              <w:t xml:space="preserve">0,841</w:t>
-            </w:r>
-          </w:p>
-        </w:tc>
-        <w:tc>
-          <w:tcPr>
-            <w:tcW w:type="dxa" w:w="1800"/>
-            <w:tcMar>
-              <w:top w:type="dxa" w:w="90"/>
-              <w:left w:type="dxa" w:w="100"/>
-              <w:bottom w:type="dxa" w:w="90"/>
-              <w:right w:type="dxa" w:w="100"/>
-            </w:tcMar>
-          </w:tcPr>
-          <w:p>
-            <w:pPr>
-              <w:spacing w:after="0" w:line="240"/>
-              <w:jc w:val="center"/>
-            </w:pPr>
-            <w:r>
-              <w:rPr>
-                <w:rFonts w:ascii="Aptos" w:cs="Aptos" w:eastAsia="Aptos" w:hAnsi="Aptos"/>
-                <w:b w:val="false"/>
-                <w:bCs w:val="false"/>
-                <w:i w:val="false"/>
-                <w:iCs w:val="false"/>
-                <w:sz w:val="19"/>
-                <w:szCs w:val="19"/>
-              </w:rPr>
-              <w:t xml:space="preserve">0,680</w:t>
-            </w:r>
-          </w:p>
-        </w:tc>
-        <w:tc>
-          <w:tcPr>
-            <w:tcW w:type="dxa" w:w="1600"/>
-            <w:tcMar>
-              <w:top w:type="dxa" w:w="90"/>
-              <w:left w:type="dxa" w:w="100"/>
-              <w:bottom w:type="dxa" w:w="90"/>
-              <w:right w:type="dxa" w:w="100"/>
-            </w:tcMar>
-          </w:tcPr>
-          <w:p>
-            <w:pPr>
-              <w:spacing w:after="0" w:line="240"/>
-              <w:jc w:val="center"/>
-            </w:pPr>
-            <w:r>
-              <w:rPr>
-                <w:rFonts w:ascii="Aptos" w:cs="Aptos" w:eastAsia="Aptos" w:hAnsi="Aptos"/>
-                <w:b w:val="false"/>
-                <w:bCs w:val="false"/>
-                <w:i w:val="false"/>
-                <w:iCs w:val="false"/>
-                <w:sz w:val="19"/>
-                <w:szCs w:val="19"/>
-              </w:rPr>
-              <w:t xml:space="preserve">0,708</w:t>
+              <w:t xml:space="preserve">FIR</w:t>
+            </w:r>
+          </w:p>
+        </w:tc>
+        <w:tc>
+          <w:tcPr>
+            <w:tcW w:type="dxa" w:w="1300"/>
+            <w:tcMar>
+              <w:top w:type="dxa" w:w="90"/>
+              <w:left w:type="dxa" w:w="100"/>
+              <w:bottom w:type="dxa" w:w="90"/>
+              <w:right w:type="dxa" w:w="100"/>
+            </w:tcMar>
+          </w:tcPr>
+          <w:p>
+            <w:pPr>
+              <w:spacing w:after="0" w:line="240"/>
+              <w:jc w:val="center"/>
+            </w:pPr>
+            <w:r>
+              <w:rPr>
+                <w:rFonts w:ascii="Aptos" w:cs="Aptos" w:eastAsia="Aptos" w:hAnsi="Aptos"/>
+                <w:b w:val="false"/>
+                <w:bCs w:val="false"/>
+                <w:i w:val="false"/>
+                <w:iCs w:val="false"/>
+                <w:sz w:val="19"/>
+                <w:szCs w:val="19"/>
+              </w:rPr>
+              <w:t xml:space="preserve">0,682</w:t>
+            </w:r>
+          </w:p>
+        </w:tc>
+        <w:tc>
+          <w:tcPr>
+            <w:tcW w:type="dxa" w:w="1300"/>
+            <w:tcMar>
+              <w:top w:type="dxa" w:w="90"/>
+              <w:left w:type="dxa" w:w="100"/>
+              <w:bottom w:type="dxa" w:w="90"/>
+              <w:right w:type="dxa" w:w="100"/>
+            </w:tcMar>
+          </w:tcPr>
+          <w:p>
+            <w:pPr>
+              <w:spacing w:after="0" w:line="240"/>
+              <w:jc w:val="center"/>
+            </w:pPr>
+            <w:r>
+              <w:rPr>
+                <w:rFonts w:ascii="Aptos" w:cs="Aptos" w:eastAsia="Aptos" w:hAnsi="Aptos"/>
+                <w:b w:val="false"/>
+                <w:bCs w:val="false"/>
+                <w:i w:val="false"/>
+                <w:iCs w:val="false"/>
+                <w:sz w:val="19"/>
+                <w:szCs w:val="19"/>
+              </w:rPr>
+              <w:t xml:space="preserve">0,553</w:t>
+            </w:r>
+          </w:p>
+        </w:tc>
+        <w:tc>
+          <w:tcPr>
+            <w:tcW w:type="dxa" w:w="1300"/>
+            <w:tcMar>
+              <w:top w:type="dxa" w:w="90"/>
+              <w:left w:type="dxa" w:w="100"/>
+              <w:bottom w:type="dxa" w:w="90"/>
+              <w:right w:type="dxa" w:w="100"/>
+            </w:tcMar>
+          </w:tcPr>
+          <w:p>
+            <w:pPr>
+              <w:spacing w:after="0" w:line="240"/>
+              <w:jc w:val="center"/>
+            </w:pPr>
+            <w:r>
+              <w:rPr>
+                <w:rFonts w:ascii="Aptos" w:cs="Aptos" w:eastAsia="Aptos" w:hAnsi="Aptos"/>
+                <w:b w:val="false"/>
+                <w:bCs w:val="false"/>
+                <w:i w:val="false"/>
+                <w:iCs w:val="false"/>
+                <w:sz w:val="19"/>
+                <w:szCs w:val="19"/>
+              </w:rPr>
+              <w:t xml:space="preserve">0,579</w:t>
+            </w:r>
+          </w:p>
+        </w:tc>
+        <w:tc>
+          <w:tcPr>
+            <w:tcW w:type="dxa" w:w="1300"/>
+            <w:tcMar>
+              <w:top w:type="dxa" w:w="90"/>
+              <w:left w:type="dxa" w:w="100"/>
+              <w:bottom w:type="dxa" w:w="90"/>
+              <w:right w:type="dxa" w:w="100"/>
+            </w:tcMar>
+          </w:tcPr>
+          <w:p>
+            <w:pPr>
+              <w:spacing w:after="0" w:line="240"/>
+              <w:jc w:val="center"/>
+            </w:pPr>
+            <w:r>
+              <w:rPr>
+                <w:rFonts w:ascii="Aptos" w:cs="Aptos" w:eastAsia="Aptos" w:hAnsi="Aptos"/>
+                <w:b w:val="false"/>
+                <w:bCs w:val="false"/>
+                <w:i w:val="false"/>
+                <w:iCs w:val="false"/>
+                <w:sz w:val="19"/>
+                <w:szCs w:val="19"/>
+              </w:rPr>
+              <w:t xml:space="preserve">0,769</w:t>
+            </w:r>
+          </w:p>
+        </w:tc>
+        <w:tc>
+          <w:tcPr>
+            <w:tcW w:type="dxa" w:w="1300"/>
+            <w:tcMar>
+              <w:top w:type="dxa" w:w="90"/>
+              <w:left w:type="dxa" w:w="100"/>
+              <w:bottom w:type="dxa" w:w="90"/>
+              <w:right w:type="dxa" w:w="100"/>
+            </w:tcMar>
+          </w:tcPr>
+          <w:p>
+            <w:pPr>
+              <w:spacing w:after="0" w:line="240"/>
+              <w:jc w:val="center"/>
+            </w:pPr>
+            <w:r>
+              <w:rPr>
+                <w:rFonts w:ascii="Aptos" w:cs="Aptos" w:eastAsia="Aptos" w:hAnsi="Aptos"/>
+                <w:b w:val="false"/>
+                <w:bCs w:val="false"/>
+                <w:i w:val="false"/>
+                <w:iCs w:val="false"/>
+                <w:sz w:val="19"/>
+                <w:szCs w:val="19"/>
+              </w:rPr>
+              <w:t xml:space="preserve">0,581</w:t>
+            </w:r>
+          </w:p>
+        </w:tc>
+        <w:tc>
+          <w:tcPr>
+            <w:tcW w:type="dxa" w:w="1300"/>
+            <w:tcMar>
+              <w:top w:type="dxa" w:w="90"/>
+              <w:left w:type="dxa" w:w="100"/>
+              <w:bottom w:type="dxa" w:w="90"/>
+              <w:right w:type="dxa" w:w="100"/>
+            </w:tcMar>
+          </w:tcPr>
+          <w:p>
+            <w:pPr>
+              <w:spacing w:after="0" w:line="240"/>
+              <w:jc w:val="center"/>
+            </w:pPr>
+            <w:r>
+              <w:rPr>
+                <w:rFonts w:ascii="Aptos" w:cs="Aptos" w:eastAsia="Aptos" w:hAnsi="Aptos"/>
+                <w:b w:val="false"/>
+                <w:bCs w:val="false"/>
+                <w:i w:val="false"/>
+                <w:iCs w:val="false"/>
+                <w:sz w:val="19"/>
+                <w:szCs w:val="19"/>
+              </w:rPr>
+              <w:t xml:space="preserve">0,524</w:t>
             </w:r>
           </w:p>
         </w:tc>
@@ -6488,7 +7699,7 @@
           <w:sz w:val="19"/>
           <w:szCs w:val="19"/>
         </w:rPr>
-        <w:t xml:space="preserve">Bảng 6. CNN aggregation, threshold và fine-tuning ablation; test = 132 bệnh nhân.</w:t>
+        <w:t xml:space="preserve">Bảng 6. MobileNetV3-Small frozen, 3-class, test = 236 bệnh nhân.</w:t>
       </w:r>
     </w:p>
     <w:p>
@@ -6505,7 +7716,34 @@
           <w:sz w:val="22"/>
           <w:szCs w:val="22"/>
         </w:rPr>
-        <w:t xml:space="preserve">Median aggregation là lựa chọn CNN tốt nhất trong seed 42. Max và top-25% dễ bị chi phối bởi một window có xác suất cao bất thường. Fine-tune block cuối không cải thiện Macro-F1 so với frozen backbone. Khi cố định patient split seed 42 và đổi model seed 42/7/123, Macro-F1 trung bình là 0,688 ± 0,025; vì test chỉ có 27 Present patients nên cần báo cáo độ dao động thay vì chỉ một con số.</w:t>
+        <w:t xml:space="preserve">MobileNet + Butterworth là kết quả tốt nhất toàn bộ primary benchmark theo WAcc (0,667), đồng thời đạt AUROC 0,796 và AUPRC 0,629. FIR làm giảm WAcc xuống 0,553 trong split này. Đây là baseline pretrained frozen, chưa phải full fine-tuning toàn backbone.</w:t>
+      </w:r>
+    </w:p>
+    <w:p>
+      <w:pPr>
+        <w:pStyle w:val="Heading2"/>
+        <w:keepNext/>
+        <w:spacing w:after="120" w:before="260"/>
+      </w:pPr>
+      <w:r>
+        <w:t xml:space="preserve">4.4. Binary DSP ablation (secondary)</w:t>
+      </w:r>
+    </w:p>
+    <w:p>
+      <w:pPr>
+        <w:spacing w:after="140" w:line="276"/>
+      </w:pPr>
+      <w:r>
+        <w:rPr>
+          <w:rFonts w:ascii="Aptos" w:cs="Aptos" w:eastAsia="Aptos" w:hAnsi="Aptos"/>
+          <w:b w:val="false"/>
+          <w:bCs w:val="false"/>
+          <w:i w:val="false"/>
+          <w:iCs w:val="false"/>
+          <w:sz w:val="22"/>
+          <w:szCs w:val="22"/>
+        </w:rPr>
+        <w:t xml:space="preserve">Để nối với các thí nghiệm ban đầu của đồ án, track nhị phân vẫn được giữ: 874 bệnh nhân Absent/Present, split 611/131/132. Kết quả tốt nhất theo Macro-F1 là MLP + none + MFCC (Accuracy 0,848; Balanced Accuracy 0,657; Macro-F1 0,693), còn SVM + none + hybrid đạt Balanced Accuracy 0,664. Các con số này không thể xếp hạng trực tiếp với primary 3-class WAcc vì khác label space, split và metric.</w:t>
       </w:r>
     </w:p>
     <w:p>
@@ -7293,7 +8531,7 @@
           <w:sz w:val="22"/>
           <w:szCs w:val="22"/>
         </w:rPr>
-        <w:t xml:space="preserve">Benchmark full-cohort có test set 132 bệnh nhân; CNN ablation đã kiểm tra thêm nhiều model seed trên cùng split, nhưng matrix SVM/MLP chính vẫn dùng seed 42.</w:t>
+        <w:t xml:space="preserve">Primary challenge-aligned benchmark có test set 236 bệnh nhân; secondary binary ablation có test set 132 bệnh nhân. Tất cả matrix chính dùng seed 42.</w:t>
       </w:r>
     </w:p>
     <w:p>
@@ -7381,7 +8619,7 @@
           <w:sz w:val="22"/>
           <w:szCs w:val="22"/>
         </w:rPr>
-        <w:t xml:space="preserve">CNN là baseline transfer-learning nhẹ với backbone frozen; chưa có kết quả full fine-tuning toàn backbone hoặc calibration xác suất.</w:t>
+        <w:t xml:space="preserve">MobileNet là baseline transfer-learning nhẹ với backbone frozen; chưa có kết quả full fine-tuning toàn backbone hoặc calibration xác suất.</w:t>
       </w:r>
     </w:p>
     <w:p>
@@ -7408,7 +8646,7 @@
           <w:sz w:val="22"/>
           <w:szCs w:val="22"/>
         </w:rPr>
-        <w:t xml:space="preserve">Đồ án đã xây dựng và kiểm chứng một pipeline PCG end-to-end có thể tái lập từ dữ liệu WAV tới prediction và FE visualization. Trên full public training release, full matrix cho thấy MLP + không filter + MFCC đạt Macro-F1 0,693, còn SVM + không filter + hybrid đạt balanced accuracy 0,664 trong split hiện tại. Preprocess benchmark cho thấy 1 kHz + 16-bit là lựa chọn nhanh nhất; 4 kHz + không quantization thêm đạt Macro-F1 0,637 với chi phí thời gian khoảng 1,48×. Các kết quả cần được kiểm chứng thêm bằng nhiều seed vì lớp Present vẫn khó nhận diện.</w:t>
+        <w:t xml:space="preserve">Đồ án đã xây dựng và kiểm chứng một pipeline PCG end-to-end có thể tái lập từ dữ liệu WAV tới prediction và FE visualization. Theo primary challenge-aligned track trên 942 patient, MobileNetV3-Small pretrained + Butterworth đạt WAcc 0,667, UAR 0,641, AUROC 0,796, AUPRC 0,629 và Macro-F1 0,604; DSP-only tốt nhất là SVM + none + hybrid với WAcc 0,644. Track nhị phân MLP + none + MFCC đạt Macro-F1 0,693 nhưng chỉ được xem là ablation phụ. Các con số primary là public-split approximation, không phải hidden official test; lớp Present/Unknown vẫn cần nhiều seed và calibration để đánh giá ổn định hơn.</w:t>
       </w:r>
     </w:p>
     <w:p>
@@ -7459,7 +8697,7 @@
       <w:pPr>
         <w:spacing w:after="120"/>
       </w:pPr>
-      <w:hyperlink w:history="1" r:id="rIdeutwktxq-jjxrc_z7tpmg">
+      <w:hyperlink w:history="1" r:id="rId0frf2wbangosmgcg2yoc-">
         <w:r>
           <w:rPr>
             <w:rFonts w:ascii="Aptos" w:cs="Aptos" w:eastAsia="Aptos" w:hAnsi="Aptos"/>

</xml_diff>

<commit_message>
Add pretrained MobileNet baseline to master deliverables
</commit_message>
<xml_diff>
--- a/docs/project_deliverables/final_report_dsp501.docx
+++ b/docs/project_deliverables/final_report_dsp501.docx
@@ -523,7 +523,7 @@
           <w:sz w:val="22"/>
           <w:szCs w:val="22"/>
         </w:rPr>
-        <w:t xml:space="preserve">Bản chính sử dụng toàn bộ public training release: 942 bệnh nhân và 3.163 WAV, trong đó 874 bệnh nhân có nhãn Absent/Present được dùng cho supervised learning. Patient-wise split gồm 611 train, 131 validation và 132 test. Full matrix 24 cấu hình cho thấy MLP + không filter + MFCC đạt macro-F1 cao nhất 0,693, còn SVM + không filter + hybrid có balanced accuracy cao nhất 0,664 trong cùng split. Benchmark preprocess cố định SVM + Butterworth + hybrid cho thấy 1 kHz + 16-bit là baseline nhanh nhất (85,8 s; macro-F1 0,615), còn 4 kHz + không quantization thêm đạt macro-F1 0,637 nhưng tốn 126,9 s. Matrix và robustness trên subset 100 patient được giữ như pilot để minh họa xu hướng khác biệt với kết quả full cohort.</w:t>
+        <w:t xml:space="preserve">Bản chính sử dụng toàn bộ public training release: 942 bệnh nhân và 3.163 WAV, trong đó 874 bệnh nhân có nhãn Absent/Present được dùng cho supervised learning. Patient-wise split gồm 611 train, 131 validation và 132 test. Full matrix 24 cấu hình cho thấy MLP + không filter + MFCC đạt macro-F1 cao nhất 0,693, còn SVM + không filter + hybrid có balanced accuracy cao nhất 0,664 trong cùng split. Một MobileNetV3-Small pretrained frozen được thêm như baseline phụ trên cùng split; FIR đạt accuracy 0,864, balanced accuracy 0,777 và macro-F1 0,784. Benchmark preprocess cố định SVM + Butterworth + hybrid cho thấy 1 kHz + 16-bit là baseline nhanh nhất (85,8 s; macro-F1 0,615), còn 4 kHz + không quantization thêm đạt macro-F1 0,637 nhưng tốn 126,9 s. Matrix và robustness trên subset 100 patient được giữ như pilot để minh họa xu hướng khác biệt với kết quả full cohort.</w:t>
       </w:r>
     </w:p>
     <w:p>
@@ -669,6 +669,23 @@
           <w:sz w:val="22"/>
           <w:szCs w:val="22"/>
         </w:rPr>
+        <w:t xml:space="preserve">4.3. Pretrained MobileNet baseline — 7</w:t>
+      </w:r>
+    </w:p>
+    <w:p>
+      <w:pPr>
+        <w:spacing w:after="140" w:line="276"/>
+      </w:pPr>
+      <w:r>
+        <w:rPr>
+          <w:rFonts w:ascii="Aptos" w:cs="Aptos" w:eastAsia="Aptos" w:hAnsi="Aptos"/>
+          <w:b w:val="false"/>
+          <w:bCs w:val="false"/>
+          <w:i w:val="false"/>
+          <w:iCs w:val="false"/>
+          <w:sz w:val="22"/>
+          <w:szCs w:val="22"/>
+        </w:rPr>
         <w:t xml:space="preserve">5. Robustness theo sampling, quantization và noise — 5</w:t>
       </w:r>
     </w:p>
@@ -1019,7 +1036,7 @@
       <w:pPr>
         <w:spacing w:after="120"/>
       </w:pPr>
-      <w:hyperlink w:history="1" r:id="rIdkfsaxy7weq1vtkl3rdl-8">
+      <w:hyperlink w:history="1" r:id="rIds6hwd9dxfnstkfs8gchu1">
         <w:r>
           <w:rPr>
             <w:rFonts w:ascii="Aptos" w:cs="Aptos" w:eastAsia="Aptos" w:hAnsi="Aptos"/>
@@ -2142,7 +2159,7 @@
           <w:sz w:val="22"/>
           <w:szCs w:val="22"/>
         </w:rPr>
-        <w:t xml:space="preserve">Hai baseline được so sánh: SVM RBF với StandardScaler, probability=True và class_weight=balanced; MLPClassifier với hai hidden layers (128, 64), early stopping và seed cố định. SVM được chọn làm model demo vì ổn định hơn MLP trên subset nhỏ và có xác suất lớp để hiển thị trong FE.</w:t>
+        <w:t xml:space="preserve">Hai baseline cổ điển được so sánh: SVM RBF với StandardScaler, probability=True và class_weight=balanced; MLPClassifier với hai hidden layers (128, 64), early stopping và seed cố định. Ngoài ra, MobileNetV3-Small pretrained với backbone frozen được chạy như baseline spectrogram nhẹ; SVM vẫn được chọn làm model demo vì ổn định hơn MLP và CNN trên CPU, đồng thời có xác suất lớp để hiển thị trong FE.</w:t>
       </w:r>
     </w:p>
     <w:p>
@@ -5687,6 +5704,572 @@
     </w:p>
     <w:p>
       <w:pPr>
+        <w:pStyle w:val="Heading2"/>
+        <w:keepNext/>
+        <w:spacing w:after="120" w:before="260"/>
+      </w:pPr>
+      <w:r>
+        <w:t xml:space="preserve">4.3. Pretrained MobileNet baseline</w:t>
+      </w:r>
+    </w:p>
+    <w:p>
+      <w:pPr>
+        <w:spacing w:after="140" w:line="276"/>
+      </w:pPr>
+      <w:r>
+        <w:rPr>
+          <w:rFonts w:ascii="Aptos" w:cs="Aptos" w:eastAsia="Aptos" w:hAnsi="Aptos"/>
+          <w:b w:val="false"/>
+          <w:bCs w:val="false"/>
+          <w:i w:val="false"/>
+          <w:iCs w:val="false"/>
+          <w:sz w:val="22"/>
+          <w:szCs w:val="22"/>
+        </w:rPr>
+        <w:t xml:space="preserve">MobileNetV3-Small dùng ImageNet pretrained weights, backbone frozen, input là log-STFT 128×128 từ tối đa hai cửa sổ 3 giây mỗi recording và mean aggregation về patient-level. Thí nghiệm vẫn là bài toán binary Absent/Present, giữ target fs = 1 kHz, quantization = 16-bit, seed 42 và split 611/131/132; chỉ thay filter để so sánh công bằng với DSP matrix.</w:t>
+      </w:r>
+    </w:p>
+    <w:tbl>
+      <w:tblPr>
+        <w:tblW w:type="dxa" w:w="9000"/>
+        <w:tblBorders>
+          <w:top w:val="single" w:color="CBD5E1" w:sz="4"/>
+          <w:left w:val="single" w:color="auto" w:sz="4"/>
+          <w:bottom w:val="single" w:color="CBD5E1" w:sz="4"/>
+          <w:right w:val="single" w:color="auto" w:sz="4"/>
+          <w:insideH w:val="single" w:color="CBD5E1" w:sz="2"/>
+          <w:insideV w:val="single" w:color="CBD5E1" w:sz="2"/>
+        </w:tblBorders>
+      </w:tblPr>
+      <w:tblGrid>
+        <w:gridCol w:w="3000"/>
+        <w:gridCol w:w="2000"/>
+        <w:gridCol w:w="2200"/>
+        <w:gridCol w:w="1800"/>
+      </w:tblGrid>
+      <w:tr>
+        <w:tc>
+          <w:tcPr>
+            <w:tcW w:type="dxa" w:w="3000"/>
+            <w:shd w:fill="17324D" w:val="clear"/>
+            <w:tcMar>
+              <w:top w:type="dxa" w:w="90"/>
+              <w:left w:type="dxa" w:w="100"/>
+              <w:bottom w:type="dxa" w:w="90"/>
+              <w:right w:type="dxa" w:w="100"/>
+            </w:tcMar>
+          </w:tcPr>
+          <w:p>
+            <w:pPr>
+              <w:spacing w:after="0" w:line="240"/>
+              <w:jc w:val="center"/>
+            </w:pPr>
+            <w:r>
+              <w:rPr>
+                <w:rFonts w:ascii="Aptos" w:cs="Aptos" w:eastAsia="Aptos" w:hAnsi="Aptos"/>
+                <w:b/>
+                <w:bCs/>
+                <w:i w:val="false"/>
+                <w:iCs w:val="false"/>
+                <w:color w:val="FFFFFF"/>
+                <w:sz w:val="19"/>
+                <w:szCs w:val="19"/>
+              </w:rPr>
+              <w:t xml:space="preserve">Filter</w:t>
+            </w:r>
+          </w:p>
+        </w:tc>
+        <w:tc>
+          <w:tcPr>
+            <w:tcW w:type="dxa" w:w="2000"/>
+            <w:shd w:fill="17324D" w:val="clear"/>
+            <w:tcMar>
+              <w:top w:type="dxa" w:w="90"/>
+              <w:left w:type="dxa" w:w="100"/>
+              <w:bottom w:type="dxa" w:w="90"/>
+              <w:right w:type="dxa" w:w="100"/>
+            </w:tcMar>
+          </w:tcPr>
+          <w:p>
+            <w:pPr>
+              <w:spacing w:after="0" w:line="240"/>
+              <w:jc w:val="center"/>
+            </w:pPr>
+            <w:r>
+              <w:rPr>
+                <w:rFonts w:ascii="Aptos" w:cs="Aptos" w:eastAsia="Aptos" w:hAnsi="Aptos"/>
+                <w:b/>
+                <w:bCs/>
+                <w:i w:val="false"/>
+                <w:iCs w:val="false"/>
+                <w:color w:val="FFFFFF"/>
+                <w:sz w:val="19"/>
+                <w:szCs w:val="19"/>
+              </w:rPr>
+              <w:t xml:space="preserve">Accuracy</w:t>
+            </w:r>
+          </w:p>
+        </w:tc>
+        <w:tc>
+          <w:tcPr>
+            <w:tcW w:type="dxa" w:w="2200"/>
+            <w:shd w:fill="17324D" w:val="clear"/>
+            <w:tcMar>
+              <w:top w:type="dxa" w:w="90"/>
+              <w:left w:type="dxa" w:w="100"/>
+              <w:bottom w:type="dxa" w:w="90"/>
+              <w:right w:type="dxa" w:w="100"/>
+            </w:tcMar>
+          </w:tcPr>
+          <w:p>
+            <w:pPr>
+              <w:spacing w:after="0" w:line="240"/>
+              <w:jc w:val="center"/>
+            </w:pPr>
+            <w:r>
+              <w:rPr>
+                <w:rFonts w:ascii="Aptos" w:cs="Aptos" w:eastAsia="Aptos" w:hAnsi="Aptos"/>
+                <w:b/>
+                <w:bCs/>
+                <w:i w:val="false"/>
+                <w:iCs w:val="false"/>
+                <w:color w:val="FFFFFF"/>
+                <w:sz w:val="19"/>
+                <w:szCs w:val="19"/>
+              </w:rPr>
+              <w:t xml:space="preserve">Balanced acc.</w:t>
+            </w:r>
+          </w:p>
+        </w:tc>
+        <w:tc>
+          <w:tcPr>
+            <w:tcW w:type="dxa" w:w="1800"/>
+            <w:shd w:fill="17324D" w:val="clear"/>
+            <w:tcMar>
+              <w:top w:type="dxa" w:w="90"/>
+              <w:left w:type="dxa" w:w="100"/>
+              <w:bottom w:type="dxa" w:w="90"/>
+              <w:right w:type="dxa" w:w="100"/>
+            </w:tcMar>
+          </w:tcPr>
+          <w:p>
+            <w:pPr>
+              <w:spacing w:after="0" w:line="240"/>
+              <w:jc w:val="center"/>
+            </w:pPr>
+            <w:r>
+              <w:rPr>
+                <w:rFonts w:ascii="Aptos" w:cs="Aptos" w:eastAsia="Aptos" w:hAnsi="Aptos"/>
+                <w:b/>
+                <w:bCs/>
+                <w:i w:val="false"/>
+                <w:iCs w:val="false"/>
+                <w:color w:val="FFFFFF"/>
+                <w:sz w:val="19"/>
+                <w:szCs w:val="19"/>
+              </w:rPr>
+              <w:t xml:space="preserve">Macro-F1</w:t>
+            </w:r>
+          </w:p>
+        </w:tc>
+      </w:tr>
+      <w:tr>
+        <w:tc>
+          <w:tcPr>
+            <w:tcW w:type="dxa" w:w="3000"/>
+            <w:tcMar>
+              <w:top w:type="dxa" w:w="90"/>
+              <w:left w:type="dxa" w:w="100"/>
+              <w:bottom w:type="dxa" w:w="90"/>
+              <w:right w:type="dxa" w:w="100"/>
+            </w:tcMar>
+          </w:tcPr>
+          <w:p>
+            <w:pPr>
+              <w:spacing w:after="0" w:line="240"/>
+              <w:jc w:val="left"/>
+            </w:pPr>
+            <w:r>
+              <w:rPr>
+                <w:rFonts w:ascii="Aptos" w:cs="Aptos" w:eastAsia="Aptos" w:hAnsi="Aptos"/>
+                <w:b w:val="false"/>
+                <w:bCs w:val="false"/>
+                <w:i w:val="false"/>
+                <w:iCs w:val="false"/>
+                <w:sz w:val="19"/>
+                <w:szCs w:val="19"/>
+              </w:rPr>
+              <w:t xml:space="preserve">None</w:t>
+            </w:r>
+          </w:p>
+        </w:tc>
+        <w:tc>
+          <w:tcPr>
+            <w:tcW w:type="dxa" w:w="2000"/>
+            <w:tcMar>
+              <w:top w:type="dxa" w:w="90"/>
+              <w:left w:type="dxa" w:w="100"/>
+              <w:bottom w:type="dxa" w:w="90"/>
+              <w:right w:type="dxa" w:w="100"/>
+            </w:tcMar>
+          </w:tcPr>
+          <w:p>
+            <w:pPr>
+              <w:spacing w:after="0" w:line="240"/>
+              <w:jc w:val="center"/>
+            </w:pPr>
+            <w:r>
+              <w:rPr>
+                <w:rFonts w:ascii="Aptos" w:cs="Aptos" w:eastAsia="Aptos" w:hAnsi="Aptos"/>
+                <w:b w:val="false"/>
+                <w:bCs w:val="false"/>
+                <w:i w:val="false"/>
+                <w:iCs w:val="false"/>
+                <w:sz w:val="19"/>
+                <w:szCs w:val="19"/>
+              </w:rPr>
+              <w:t xml:space="preserve">0,841</w:t>
+            </w:r>
+          </w:p>
+        </w:tc>
+        <w:tc>
+          <w:tcPr>
+            <w:tcW w:type="dxa" w:w="2200"/>
+            <w:tcMar>
+              <w:top w:type="dxa" w:w="90"/>
+              <w:left w:type="dxa" w:w="100"/>
+              <w:bottom w:type="dxa" w:w="90"/>
+              <w:right w:type="dxa" w:w="100"/>
+            </w:tcMar>
+          </w:tcPr>
+          <w:p>
+            <w:pPr>
+              <w:spacing w:after="0" w:line="240"/>
+              <w:jc w:val="center"/>
+            </w:pPr>
+            <w:r>
+              <w:rPr>
+                <w:rFonts w:ascii="Aptos" w:cs="Aptos" w:eastAsia="Aptos" w:hAnsi="Aptos"/>
+                <w:b w:val="false"/>
+                <w:bCs w:val="false"/>
+                <w:i w:val="false"/>
+                <w:iCs w:val="false"/>
+                <w:sz w:val="19"/>
+                <w:szCs w:val="19"/>
+              </w:rPr>
+              <w:t xml:space="preserve">0,749</w:t>
+            </w:r>
+          </w:p>
+        </w:tc>
+        <w:tc>
+          <w:tcPr>
+            <w:tcW w:type="dxa" w:w="1800"/>
+            <w:tcMar>
+              <w:top w:type="dxa" w:w="90"/>
+              <w:left w:type="dxa" w:w="100"/>
+              <w:bottom w:type="dxa" w:w="90"/>
+              <w:right w:type="dxa" w:w="100"/>
+            </w:tcMar>
+          </w:tcPr>
+          <w:p>
+            <w:pPr>
+              <w:spacing w:after="0" w:line="240"/>
+              <w:jc w:val="center"/>
+            </w:pPr>
+            <w:r>
+              <w:rPr>
+                <w:rFonts w:ascii="Aptos" w:cs="Aptos" w:eastAsia="Aptos" w:hAnsi="Aptos"/>
+                <w:b w:val="false"/>
+                <w:bCs w:val="false"/>
+                <w:i w:val="false"/>
+                <w:iCs w:val="false"/>
+                <w:sz w:val="19"/>
+                <w:szCs w:val="19"/>
+              </w:rPr>
+              <w:t xml:space="preserve">0,752</w:t>
+            </w:r>
+          </w:p>
+        </w:tc>
+      </w:tr>
+      <w:tr>
+        <w:tc>
+          <w:tcPr>
+            <w:tcW w:type="dxa" w:w="3000"/>
+            <w:shd w:fill="F8FAFC" w:val="clear"/>
+            <w:tcMar>
+              <w:top w:type="dxa" w:w="90"/>
+              <w:left w:type="dxa" w:w="100"/>
+              <w:bottom w:type="dxa" w:w="90"/>
+              <w:right w:type="dxa" w:w="100"/>
+            </w:tcMar>
+          </w:tcPr>
+          <w:p>
+            <w:pPr>
+              <w:spacing w:after="0" w:line="240"/>
+              <w:jc w:val="left"/>
+            </w:pPr>
+            <w:r>
+              <w:rPr>
+                <w:rFonts w:ascii="Aptos" w:cs="Aptos" w:eastAsia="Aptos" w:hAnsi="Aptos"/>
+                <w:b w:val="false"/>
+                <w:bCs w:val="false"/>
+                <w:i w:val="false"/>
+                <w:iCs w:val="false"/>
+                <w:sz w:val="19"/>
+                <w:szCs w:val="19"/>
+              </w:rPr>
+              <w:t xml:space="preserve">Butterworth</w:t>
+            </w:r>
+          </w:p>
+        </w:tc>
+        <w:tc>
+          <w:tcPr>
+            <w:tcW w:type="dxa" w:w="2000"/>
+            <w:shd w:fill="F8FAFC" w:val="clear"/>
+            <w:tcMar>
+              <w:top w:type="dxa" w:w="90"/>
+              <w:left w:type="dxa" w:w="100"/>
+              <w:bottom w:type="dxa" w:w="90"/>
+              <w:right w:type="dxa" w:w="100"/>
+            </w:tcMar>
+          </w:tcPr>
+          <w:p>
+            <w:pPr>
+              <w:spacing w:after="0" w:line="240"/>
+              <w:jc w:val="center"/>
+            </w:pPr>
+            <w:r>
+              <w:rPr>
+                <w:rFonts w:ascii="Aptos" w:cs="Aptos" w:eastAsia="Aptos" w:hAnsi="Aptos"/>
+                <w:b w:val="false"/>
+                <w:bCs w:val="false"/>
+                <w:i w:val="false"/>
+                <w:iCs w:val="false"/>
+                <w:sz w:val="19"/>
+                <w:szCs w:val="19"/>
+              </w:rPr>
+              <w:t xml:space="preserve">0,826</w:t>
+            </w:r>
+          </w:p>
+        </w:tc>
+        <w:tc>
+          <w:tcPr>
+            <w:tcW w:type="dxa" w:w="2200"/>
+            <w:shd w:fill="F8FAFC" w:val="clear"/>
+            <w:tcMar>
+              <w:top w:type="dxa" w:w="90"/>
+              <w:left w:type="dxa" w:w="100"/>
+              <w:bottom w:type="dxa" w:w="90"/>
+              <w:right w:type="dxa" w:w="100"/>
+            </w:tcMar>
+          </w:tcPr>
+          <w:p>
+            <w:pPr>
+              <w:spacing w:after="0" w:line="240"/>
+              <w:jc w:val="center"/>
+            </w:pPr>
+            <w:r>
+              <w:rPr>
+                <w:rFonts w:ascii="Aptos" w:cs="Aptos" w:eastAsia="Aptos" w:hAnsi="Aptos"/>
+                <w:b w:val="false"/>
+                <w:bCs w:val="false"/>
+                <w:i w:val="false"/>
+                <w:iCs w:val="false"/>
+                <w:sz w:val="19"/>
+                <w:szCs w:val="19"/>
+              </w:rPr>
+              <w:t xml:space="preserve">0,698</w:t>
+            </w:r>
+          </w:p>
+        </w:tc>
+        <w:tc>
+          <w:tcPr>
+            <w:tcW w:type="dxa" w:w="1800"/>
+            <w:shd w:fill="F8FAFC" w:val="clear"/>
+            <w:tcMar>
+              <w:top w:type="dxa" w:w="90"/>
+              <w:left w:type="dxa" w:w="100"/>
+              <w:bottom w:type="dxa" w:w="90"/>
+              <w:right w:type="dxa" w:w="100"/>
+            </w:tcMar>
+          </w:tcPr>
+          <w:p>
+            <w:pPr>
+              <w:spacing w:after="0" w:line="240"/>
+              <w:jc w:val="center"/>
+            </w:pPr>
+            <w:r>
+              <w:rPr>
+                <w:rFonts w:ascii="Aptos" w:cs="Aptos" w:eastAsia="Aptos" w:hAnsi="Aptos"/>
+                <w:b w:val="false"/>
+                <w:bCs w:val="false"/>
+                <w:i w:val="false"/>
+                <w:iCs w:val="false"/>
+                <w:sz w:val="19"/>
+                <w:szCs w:val="19"/>
+              </w:rPr>
+              <w:t xml:space="preserve">0,712</w:t>
+            </w:r>
+          </w:p>
+        </w:tc>
+      </w:tr>
+      <w:tr>
+        <w:tc>
+          <w:tcPr>
+            <w:tcW w:type="dxa" w:w="3000"/>
+            <w:tcMar>
+              <w:top w:type="dxa" w:w="90"/>
+              <w:left w:type="dxa" w:w="100"/>
+              <w:bottom w:type="dxa" w:w="90"/>
+              <w:right w:type="dxa" w:w="100"/>
+            </w:tcMar>
+          </w:tcPr>
+          <w:p>
+            <w:pPr>
+              <w:spacing w:after="0" w:line="240"/>
+              <w:jc w:val="left"/>
+            </w:pPr>
+            <w:r>
+              <w:rPr>
+                <w:rFonts w:ascii="Aptos" w:cs="Aptos" w:eastAsia="Aptos" w:hAnsi="Aptos"/>
+                <w:b w:val="false"/>
+                <w:bCs w:val="false"/>
+                <w:i w:val="false"/>
+                <w:iCs w:val="false"/>
+                <w:sz w:val="19"/>
+                <w:szCs w:val="19"/>
+              </w:rPr>
+              <w:t xml:space="preserve">FIR</w:t>
+            </w:r>
+          </w:p>
+        </w:tc>
+        <w:tc>
+          <w:tcPr>
+            <w:tcW w:type="dxa" w:w="2000"/>
+            <w:tcMar>
+              <w:top w:type="dxa" w:w="90"/>
+              <w:left w:type="dxa" w:w="100"/>
+              <w:bottom w:type="dxa" w:w="90"/>
+              <w:right w:type="dxa" w:w="100"/>
+            </w:tcMar>
+          </w:tcPr>
+          <w:p>
+            <w:pPr>
+              <w:spacing w:after="0" w:line="240"/>
+              <w:jc w:val="center"/>
+            </w:pPr>
+            <w:r>
+              <w:rPr>
+                <w:rFonts w:ascii="Aptos" w:cs="Aptos" w:eastAsia="Aptos" w:hAnsi="Aptos"/>
+                <w:b w:val="false"/>
+                <w:bCs w:val="false"/>
+                <w:i w:val="false"/>
+                <w:iCs w:val="false"/>
+                <w:sz w:val="19"/>
+                <w:szCs w:val="19"/>
+              </w:rPr>
+              <w:t xml:space="preserve">0,864</w:t>
+            </w:r>
+          </w:p>
+        </w:tc>
+        <w:tc>
+          <w:tcPr>
+            <w:tcW w:type="dxa" w:w="2200"/>
+            <w:tcMar>
+              <w:top w:type="dxa" w:w="90"/>
+              <w:left w:type="dxa" w:w="100"/>
+              <w:bottom w:type="dxa" w:w="90"/>
+              <w:right w:type="dxa" w:w="100"/>
+            </w:tcMar>
+          </w:tcPr>
+          <w:p>
+            <w:pPr>
+              <w:spacing w:after="0" w:line="240"/>
+              <w:jc w:val="center"/>
+            </w:pPr>
+            <w:r>
+              <w:rPr>
+                <w:rFonts w:ascii="Aptos" w:cs="Aptos" w:eastAsia="Aptos" w:hAnsi="Aptos"/>
+                <w:b w:val="false"/>
+                <w:bCs w:val="false"/>
+                <w:i w:val="false"/>
+                <w:iCs w:val="false"/>
+                <w:sz w:val="19"/>
+                <w:szCs w:val="19"/>
+              </w:rPr>
+              <w:t xml:space="preserve">0,777</w:t>
+            </w:r>
+          </w:p>
+        </w:tc>
+        <w:tc>
+          <w:tcPr>
+            <w:tcW w:type="dxa" w:w="1800"/>
+            <w:tcMar>
+              <w:top w:type="dxa" w:w="90"/>
+              <w:left w:type="dxa" w:w="100"/>
+              <w:bottom w:type="dxa" w:w="90"/>
+              <w:right w:type="dxa" w:w="100"/>
+            </w:tcMar>
+          </w:tcPr>
+          <w:p>
+            <w:pPr>
+              <w:spacing w:after="0" w:line="240"/>
+              <w:jc w:val="center"/>
+            </w:pPr>
+            <w:r>
+              <w:rPr>
+                <w:rFonts w:ascii="Aptos" w:cs="Aptos" w:eastAsia="Aptos" w:hAnsi="Aptos"/>
+                <w:b w:val="false"/>
+                <w:bCs w:val="false"/>
+                <w:i w:val="false"/>
+                <w:iCs w:val="false"/>
+                <w:sz w:val="19"/>
+                <w:szCs w:val="19"/>
+              </w:rPr>
+              <w:t xml:space="preserve">0,784</w:t>
+            </w:r>
+          </w:p>
+        </w:tc>
+      </w:tr>
+    </w:tbl>
+    <w:p>
+      <w:pPr>
+        <w:spacing w:after="180" w:before="40"/>
+        <w:jc w:val="center"/>
+      </w:pPr>
+      <w:r>
+        <w:rPr>
+          <w:rFonts w:ascii="Aptos" w:cs="Aptos" w:eastAsia="Aptos" w:hAnsi="Aptos"/>
+          <w:b w:val="false"/>
+          <w:bCs w:val="false"/>
+          <w:i/>
+          <w:iCs/>
+          <w:color w:val="475569"/>
+          <w:sz w:val="19"/>
+          <w:szCs w:val="19"/>
+        </w:rPr>
+        <w:t xml:space="preserve">Bảng 6. MobileNetV3-Small pretrained frozen, binary test = 132 bệnh nhân.</w:t>
+      </w:r>
+    </w:p>
+    <w:p>
+      <w:pPr>
+        <w:spacing w:after="140" w:line="276"/>
+      </w:pPr>
+      <w:r>
+        <w:rPr>
+          <w:rFonts w:ascii="Aptos" w:cs="Aptos" w:eastAsia="Aptos" w:hAnsi="Aptos"/>
+          <w:b w:val="false"/>
+          <w:bCs w:val="false"/>
+          <w:i w:val="false"/>
+          <w:iCs w:val="false"/>
+          <w:sz w:val="22"/>
+          <w:szCs w:val="22"/>
+        </w:rPr>
+        <w:t xml:space="preserve">FIR là cấu hình MobileNet tốt nhất trong binary benchmark theo cả Accuracy, Balanced Accuracy và Macro-F1. Đây là kết quả bổ sung để đối chiếu representation spectrogram với feature DSP thủ công; không dùng CNN thay thế cho câu hỏi chính về filter/feature của DSP.</w:t>
+      </w:r>
+    </w:p>
+    <w:p>
+      <w:pPr>
         <w:pStyle w:val="Heading1"/>
         <w:keepNext/>
         <w:spacing w:after="120" w:before="260"/>
@@ -6558,7 +7141,7 @@
           <w:sz w:val="22"/>
           <w:szCs w:val="22"/>
         </w:rPr>
-        <w:t xml:space="preserve">MLP và SVM là baseline CPU; nghiên cứu chưa đánh giá CNN hoặc calibration trên cohort lớn.</w:t>
+        <w:t xml:space="preserve">MobileNet là baseline transfer-learning frozen; chưa fine-tune toàn backbone, calibration xác suất hoặc đánh giá nhiều seed trên CNN.</w:t>
       </w:r>
     </w:p>
     <w:p>
@@ -6585,7 +7168,7 @@
           <w:sz w:val="22"/>
           <w:szCs w:val="22"/>
         </w:rPr>
-        <w:t xml:space="preserve">Đồ án đã xây dựng và kiểm chứng một pipeline PCG end-to-end có thể tái lập từ dữ liệu WAV tới prediction và FE visualization. Trên full public training release, full matrix cho thấy MLP + không filter + MFCC đạt Macro-F1 0,693, còn SVM + không filter + hybrid đạt balanced accuracy 0,664 trong split hiện tại. Preprocess benchmark cho thấy 1 kHz + 16-bit là lựa chọn nhanh nhất; 4 kHz + không quantization thêm đạt Macro-F1 0,637 với chi phí thời gian khoảng 1,48×. Các kết quả cần được kiểm chứng thêm bằng nhiều seed vì lớp Present vẫn khó nhận diện.</w:t>
+        <w:t xml:space="preserve">Đồ án đã xây dựng và kiểm chứng một pipeline PCG end-to-end có thể tái lập từ dữ liệu WAV tới prediction và FE visualization. Trên full public training release, full matrix cho thấy MLP + không filter + MFCC đạt Macro-F1 0,693, còn SVM + không filter + hybrid đạt balanced accuracy 0,664 trong split hiện tại. MobileNetV3-Small pretrained frozen đạt Macro-F1 0,784 với FIR trên cùng binary split, nhưng được giữ như baseline phụ. Preprocess benchmark cho thấy 1 kHz + 16-bit là lựa chọn nhanh nhất; 4 kHz + không quantization thêm đạt Macro-F1 0,637 với chi phí thời gian khoảng 1,48×. Các kết quả cần được kiểm chứng thêm bằng nhiều seed vì lớp Present vẫn khó nhận diện.</w:t>
       </w:r>
     </w:p>
     <w:p>
@@ -6602,7 +7185,7 @@
           <w:sz w:val="22"/>
           <w:szCs w:val="22"/>
         </w:rPr>
-        <w:t xml:space="preserve">Các bước phát triển tiếp theo gồm: lặp lại đánh giá với nhiều patient-wise seeds, sử dụng segmentation để tạo cycle-level feature, bổ sung confidence interval/calibration, và chỉ khi cần mới so sánh với spectrogram CNN hoặc mở rộng sang toàn bộ subjects ngoài public training release.</w:t>
+        <w:t xml:space="preserve">Các bước phát triển tiếp theo gồm: lặp lại đánh giá với nhiều patient-wise seeds, sử dụng segmentation để tạo cycle-level feature, bổ sung confidence interval/calibration, và nếu cần thì fine-tune hoặc mở rộng MobileNet trên GPU và các subjects ngoài public training release.</w:t>
       </w:r>
     </w:p>
     <w:p>
@@ -6636,7 +7219,7 @@
       <w:pPr>
         <w:spacing w:after="120"/>
       </w:pPr>
-      <w:hyperlink w:history="1" r:id="rIdgbugjbe-ieijtgwpjbkk0">
+      <w:hyperlink w:history="1" r:id="rIdgkyubf0cgkk75kxa0bk8m">
         <w:r>
           <w:rPr>
             <w:rFonts w:ascii="Aptos" w:cs="Aptos" w:eastAsia="Aptos" w:hAnsi="Aptos"/>

</xml_diff>

<commit_message>
Make Streamlit DSP demo presentation-ready
</commit_message>
<xml_diff>
--- a/docs/project_deliverables/final_report_dsp501.docx
+++ b/docs/project_deliverables/final_report_dsp501.docx
@@ -1036,7 +1036,7 @@
       <w:pPr>
         <w:spacing w:after="120"/>
       </w:pPr>
-      <w:hyperlink w:history="1" r:id="rIds6hwd9dxfnstkfs8gchu1">
+      <w:hyperlink w:history="1" r:id="rIdqgrretcbfcjddvzfp9lhs">
         <w:r>
           <w:rPr>
             <w:rFonts w:ascii="Aptos" w:cs="Aptos" w:eastAsia="Aptos" w:hAnsi="Aptos"/>
@@ -6969,7 +6969,7 @@
           <w:sz w:val="22"/>
           <w:szCs w:val="22"/>
         </w:rPr>
-        <w:t xml:space="preserve">FE nằm trong app.py và gọi cùng service inference với CLI. Người dùng upload WAV, chọn sampling rate, quantization, filter và noise preview; sau đó xem audio player, waveform, FFT, PSD, STFT, class probabilities và cấu hình DSP được dùng. Model mặc định là svm_butterworth_hybrid/model.joblib.</w:t>
+        <w:t xml:space="preserve">FE nằm trong app.py và gọi cùng service inference với CLI. Người dùng upload WAV hoặc chọn bundled demo recording, chọn sampling rate, quantization, filter và noise preview; sau đó xem audio player, waveform, FFT, PSD, filter frequency response, STFT, class probabilities, confidence và cấu hình DSP được dùng. Demo có A/B comparison giữa training baseline và selected DSP, đồng thời cho phép tải analysis JSON. Model mặc định là svm_butterworth_hybrid/model.joblib.</w:t>
       </w:r>
     </w:p>
     <w:p>
@@ -7021,7 +7021,7 @@
           <w:sz w:val="22"/>
           <w:szCs w:val="22"/>
         </w:rPr>
-        <w:t xml:space="preserve">Khi trình bày, demo nên đi theo flow: upload một WAV → nghe/xem Raw → chọn target fs và xem waveform After resample → bật quantization và xem After quantization → bật band-pass và xem After filter → chỉ ra năng lượng trên FFT/PSD → xem STFT → đổi 16-bit sang 8-bit hoặc bật pink noise → phân tích thay đổi probability. Đây là minh họa robustness, không phải phép chẩn đoán.</w:t>
+        <w:t xml:space="preserve">Khi trình bày, demo nên đi theo flow: bấm Use demo recording hoặc upload WAV → chạy training baseline → đổi target fs/bit depth/filter → chạy A/B comparison → nghe các stage → đọc waveform, FFT/PSD và filter response với dải 25–400 Hz → xem STFT và confidence → tải analysis JSON. Đây là minh họa robustness, không phải phép chẩn đoán.</w:t>
       </w:r>
     </w:p>
     <w:p>
@@ -7219,7 +7219,7 @@
       <w:pPr>
         <w:spacing w:after="120"/>
       </w:pPr>
-      <w:hyperlink w:history="1" r:id="rIdgkyubf0cgkk75kxa0bk8m">
+      <w:hyperlink w:history="1" r:id="rIdxird-t4vpde7gdtbtbazd">
         <w:r>
           <w:rPr>
             <w:rFonts w:ascii="Aptos" w:cs="Aptos" w:eastAsia="Aptos" w:hAnsi="Aptos"/>

</xml_diff>